<commit_message>
Add footer and update signup form
</commit_message>
<xml_diff>
--- a/Assignment declaration.docx
+++ b/Assignment declaration.docx
@@ -864,7 +864,93 @@
               </w:pBdr>
             </w:pPr>
             <w:r>
-              <w:t>magnus.jackson@connect.qut.edu.au</w:t>
+              <w:t>magnus.jackson</w:t>
+            </w:r>
+            <w:r>
+              <w:t>@connect.qut.edu.au</w:t>
+            </w:r>
+          </w:p>
+        </w:tc>
+      </w:tr>
+      <w:tr>
+        <w:tc>
+          <w:tcPr>
+            <w:tcW w:w="2825" w:type="dxa"/>
+            <w:tcMar>
+              <w:top w:w="100" w:type="dxa"/>
+              <w:left w:w="100" w:type="dxa"/>
+              <w:bottom w:w="100" w:type="dxa"/>
+              <w:right w:w="100" w:type="dxa"/>
+            </w:tcMar>
+          </w:tcPr>
+          <w:p>
+            <w:pPr>
+              <w:widowControl w:val="0"/>
+              <w:pBdr>
+                <w:top w:val="nil"/>
+                <w:left w:val="nil"/>
+                <w:bottom w:val="nil"/>
+                <w:right w:val="nil"/>
+                <w:between w:val="nil"/>
+              </w:pBdr>
+            </w:pPr>
+            <w:r>
+              <w:t>Ryan Morris</w:t>
+            </w:r>
+          </w:p>
+        </w:tc>
+        <w:tc>
+          <w:tcPr>
+            <w:tcW w:w="1615" w:type="dxa"/>
+            <w:tcMar>
+              <w:top w:w="100" w:type="dxa"/>
+              <w:left w:w="100" w:type="dxa"/>
+              <w:bottom w:w="100" w:type="dxa"/>
+              <w:right w:w="100" w:type="dxa"/>
+            </w:tcMar>
+          </w:tcPr>
+          <w:p>
+            <w:pPr>
+              <w:widowControl w:val="0"/>
+              <w:pBdr>
+                <w:top w:val="nil"/>
+                <w:left w:val="nil"/>
+                <w:bottom w:val="nil"/>
+                <w:right w:val="nil"/>
+                <w:between w:val="nil"/>
+              </w:pBdr>
+            </w:pPr>
+            <w:r>
+              <w:t>n11610328</w:t>
+            </w:r>
+          </w:p>
+        </w:tc>
+        <w:tc>
+          <w:tcPr>
+            <w:tcW w:w="4575" w:type="dxa"/>
+            <w:tcMar>
+              <w:top w:w="100" w:type="dxa"/>
+              <w:left w:w="100" w:type="dxa"/>
+              <w:bottom w:w="100" w:type="dxa"/>
+              <w:right w:w="100" w:type="dxa"/>
+            </w:tcMar>
+          </w:tcPr>
+          <w:p>
+            <w:pPr>
+              <w:widowControl w:val="0"/>
+              <w:pBdr>
+                <w:top w:val="nil"/>
+                <w:left w:val="nil"/>
+                <w:bottom w:val="nil"/>
+                <w:right w:val="nil"/>
+                <w:between w:val="nil"/>
+              </w:pBdr>
+            </w:pPr>
+            <w:r>
+              <w:t>ryan.morris</w:t>
+            </w:r>
+            <w:r>
+              <w:t>@connect.qut.edu.au</w:t>
             </w:r>
           </w:p>
         </w:tc>
@@ -1082,77 +1168,6 @@
           </w:p>
         </w:tc>
       </w:tr>
-      <w:tr>
-        <w:tc>
-          <w:tcPr>
-            <w:tcW w:w="2825" w:type="dxa"/>
-            <w:tcMar>
-              <w:top w:w="100" w:type="dxa"/>
-              <w:left w:w="100" w:type="dxa"/>
-              <w:bottom w:w="100" w:type="dxa"/>
-              <w:right w:w="100" w:type="dxa"/>
-            </w:tcMar>
-          </w:tcPr>
-          <w:p>
-            <w:pPr>
-              <w:widowControl w:val="0"/>
-              <w:pBdr>
-                <w:top w:val="nil"/>
-                <w:left w:val="nil"/>
-                <w:bottom w:val="nil"/>
-                <w:right w:val="nil"/>
-                <w:between w:val="nil"/>
-              </w:pBdr>
-            </w:pPr>
-          </w:p>
-        </w:tc>
-        <w:tc>
-          <w:tcPr>
-            <w:tcW w:w="1615" w:type="dxa"/>
-            <w:tcMar>
-              <w:top w:w="100" w:type="dxa"/>
-              <w:left w:w="100" w:type="dxa"/>
-              <w:bottom w:w="100" w:type="dxa"/>
-              <w:right w:w="100" w:type="dxa"/>
-            </w:tcMar>
-          </w:tcPr>
-          <w:p>
-            <w:pPr>
-              <w:widowControl w:val="0"/>
-              <w:pBdr>
-                <w:top w:val="nil"/>
-                <w:left w:val="nil"/>
-                <w:bottom w:val="nil"/>
-                <w:right w:val="nil"/>
-                <w:between w:val="nil"/>
-              </w:pBdr>
-            </w:pPr>
-          </w:p>
-        </w:tc>
-        <w:tc>
-          <w:tcPr>
-            <w:tcW w:w="4575" w:type="dxa"/>
-            <w:tcMar>
-              <w:top w:w="100" w:type="dxa"/>
-              <w:left w:w="100" w:type="dxa"/>
-              <w:bottom w:w="100" w:type="dxa"/>
-              <w:right w:w="100" w:type="dxa"/>
-            </w:tcMar>
-          </w:tcPr>
-          <w:p>
-            <w:pPr>
-              <w:widowControl w:val="0"/>
-              <w:pBdr>
-                <w:top w:val="nil"/>
-                <w:left w:val="nil"/>
-                <w:bottom w:val="nil"/>
-                <w:right w:val="nil"/>
-                <w:between w:val="nil"/>
-              </w:pBdr>
-            </w:pPr>
-          </w:p>
-        </w:tc>
-      </w:tr>
     </w:tbl>
     <w:p>
       <w:pPr>
@@ -1203,6 +1218,53 @@
     </w:p>
     <w:p>
       <w:pPr>
+        <w:rPr>
+          <w:rStyle w:val="Strong"/>
+          <w:rFonts w:ascii="Segoe UI" w:eastAsiaTheme="majorEastAsia" w:hAnsi="Segoe UI" w:cs="Segoe UI"/>
+          <w:b w:val="0"/>
+          <w:bCs w:val="0"/>
+          <w:color w:val="404040"/>
+          <w:sz w:val="32"/>
+          <w:szCs w:val="32"/>
+        </w:rPr>
+      </w:pPr>
+      <w:r>
+        <w:rPr>
+          <w:rFonts w:ascii="Segoe UI" w:hAnsi="Segoe UI" w:cs="Segoe UI"/>
+          <w:color w:val="404040"/>
+        </w:rPr>
+        <w:lastRenderedPageBreak/>
+        <w:br/>
+      </w:r>
+    </w:p>
+    <w:p>
+      <w:pPr>
+        <w:rPr>
+          <w:rStyle w:val="Strong"/>
+          <w:rFonts w:ascii="Segoe UI" w:eastAsiaTheme="majorEastAsia" w:hAnsi="Segoe UI" w:cs="Segoe UI"/>
+          <w:b w:val="0"/>
+          <w:bCs w:val="0"/>
+          <w:color w:val="404040"/>
+          <w:sz w:val="32"/>
+          <w:szCs w:val="32"/>
+        </w:rPr>
+      </w:pPr>
+    </w:p>
+    <w:p>
+      <w:pPr>
+        <w:rPr>
+          <w:rStyle w:val="Strong"/>
+          <w:rFonts w:ascii="Segoe UI" w:eastAsiaTheme="majorEastAsia" w:hAnsi="Segoe UI" w:cs="Segoe UI"/>
+          <w:b w:val="0"/>
+          <w:bCs w:val="0"/>
+          <w:color w:val="404040"/>
+          <w:sz w:val="32"/>
+          <w:szCs w:val="32"/>
+        </w:rPr>
+      </w:pPr>
+    </w:p>
+    <w:p>
+      <w:pPr>
         <w:pBdr>
           <w:top w:val="nil"/>
           <w:left w:val="nil"/>
@@ -1210,1405 +1272,6 @@
           <w:right w:val="nil"/>
           <w:between w:val="nil"/>
         </w:pBdr>
-      </w:pPr>
-      <w:r>
-        <w:rPr>
-          <w:rFonts w:ascii="Segoe UI" w:hAnsi="Segoe UI" w:cs="Segoe UI"/>
-          <w:b/>
-          <w:bCs/>
-          <w:color w:val="404040"/>
-        </w:rPr>
-        <w:lastRenderedPageBreak/>
-        <w:t>Option B</w:t>
-      </w:r>
-      <w:r>
-        <w:rPr>
-          <w:rFonts w:ascii="Segoe UI" w:hAnsi="Segoe UI" w:cs="Segoe UI"/>
-          <w:b/>
-          <w:bCs/>
-          <w:color w:val="404040"/>
-        </w:rPr>
-        <w:t>:</w:t>
-      </w:r>
-      <w:r>
-        <w:rPr>
-          <w:rFonts w:ascii="Segoe UI" w:hAnsi="Segoe UI" w:cs="Segoe UI"/>
-          <w:color w:val="404040"/>
-        </w:rPr>
-        <w:t xml:space="preserve"> </w:t>
-      </w:r>
-      <w:r>
-        <w:rPr>
-          <w:rFonts w:ascii="Segoe UI" w:hAnsi="Segoe UI" w:cs="Segoe UI"/>
-          <w:color w:val="0070C0"/>
-        </w:rPr>
-        <w:t xml:space="preserve">– </w:t>
-      </w:r>
-      <w:r>
-        <w:rPr>
-          <w:rFonts w:ascii="Segoe UI" w:hAnsi="Segoe UI" w:cs="Segoe UI"/>
-          <w:color w:val="0070C0"/>
-        </w:rPr>
-        <w:t>Only use if necessary. D</w:t>
-      </w:r>
-      <w:r>
-        <w:rPr>
-          <w:rFonts w:ascii="Segoe UI" w:hAnsi="Segoe UI" w:cs="Segoe UI"/>
-          <w:color w:val="0070C0"/>
-        </w:rPr>
-        <w:t>elete if not used</w:t>
-      </w:r>
-      <w:r>
-        <w:rPr>
-          <w:rFonts w:ascii="Segoe UI" w:hAnsi="Segoe UI" w:cs="Segoe UI"/>
-          <w:color w:val="404040"/>
-        </w:rPr>
-        <w:t>:</w:t>
-      </w:r>
-      <w:r>
-        <w:rPr>
-          <w:rFonts w:ascii="Segoe UI" w:hAnsi="Segoe UI" w:cs="Segoe UI"/>
-          <w:color w:val="404040"/>
-        </w:rPr>
-        <w:br/>
-      </w:r>
-      <w:r>
-        <w:t>To be used when contribution to the assignment was significantly unequal between team members. Teams are required to collectively negotiate and agree to a representative % contribution. All team members must be invited to this collective discussion and where possible all should agree with the negotiated outcome (however a majority will be sufficient). This discussion does not have to be face to face, but this is encouraged. After unanimous (or majority) agreement has been reached, the team member (nominated by a majority) will enter the agreed (or majority agreed) percentages into the above table. The unit coordinator will consider if marks need to be adjusted to reflect individual contributions to malfunctioning teams. This process is in addition to the peer assessment process that you will use to rate your teammates.</w:t>
-      </w:r>
-    </w:p>
-    <w:p>
-      <w:pPr>
-        <w:pBdr>
-          <w:top w:val="nil"/>
-          <w:left w:val="nil"/>
-          <w:bottom w:val="nil"/>
-          <w:right w:val="nil"/>
-          <w:between w:val="nil"/>
-        </w:pBdr>
-      </w:pPr>
-    </w:p>
-    <w:p>
-      <w:pPr>
-        <w:pBdr>
-          <w:top w:val="nil"/>
-          <w:left w:val="nil"/>
-          <w:bottom w:val="nil"/>
-          <w:right w:val="nil"/>
-          <w:between w:val="nil"/>
-        </w:pBdr>
-      </w:pPr>
-    </w:p>
-    <w:tbl>
-      <w:tblPr>
-        <w:tblW w:w="9000" w:type="dxa"/>
-        <w:tblBorders>
-          <w:top w:val="single" w:sz="8" w:space="0" w:color="660000"/>
-          <w:left w:val="single" w:sz="8" w:space="0" w:color="660000"/>
-          <w:bottom w:val="single" w:sz="8" w:space="0" w:color="660000"/>
-          <w:right w:val="single" w:sz="8" w:space="0" w:color="660000"/>
-          <w:insideH w:val="single" w:sz="8" w:space="0" w:color="660000"/>
-          <w:insideV w:val="single" w:sz="8" w:space="0" w:color="660000"/>
-        </w:tblBorders>
-        <w:tblLayout w:type="fixed"/>
-        <w:tblLook w:val="0600" w:firstRow="0" w:lastRow="0" w:firstColumn="0" w:lastColumn="0" w:noHBand="1" w:noVBand="1"/>
-      </w:tblPr>
-      <w:tblGrid>
-        <w:gridCol w:w="3105"/>
-        <w:gridCol w:w="1155"/>
-        <w:gridCol w:w="3600"/>
-        <w:gridCol w:w="1140"/>
-      </w:tblGrid>
-      <w:tr>
-        <w:trPr>
-          <w:trHeight w:val="420"/>
-        </w:trPr>
-        <w:tc>
-          <w:tcPr>
-            <w:tcW w:w="9000" w:type="dxa"/>
-            <w:gridSpan w:val="4"/>
-            <w:shd w:val="clear" w:color="auto" w:fill="660000"/>
-            <w:tcMar>
-              <w:top w:w="100" w:type="dxa"/>
-              <w:left w:w="100" w:type="dxa"/>
-              <w:bottom w:w="100" w:type="dxa"/>
-              <w:right w:w="100" w:type="dxa"/>
-            </w:tcMar>
-          </w:tcPr>
-          <w:p>
-            <w:pPr>
-              <w:pBdr>
-                <w:top w:val="nil"/>
-                <w:left w:val="nil"/>
-                <w:bottom w:val="nil"/>
-                <w:right w:val="nil"/>
-                <w:between w:val="nil"/>
-              </w:pBdr>
-              <w:jc w:val="center"/>
-              <w:rPr>
-                <w:b/>
-                <w:color w:val="FFFFFF"/>
-              </w:rPr>
-            </w:pPr>
-            <w:r>
-              <w:rPr>
-                <w:b/>
-                <w:color w:val="FFFFFF"/>
-                <w:u w:val="single"/>
-              </w:rPr>
-              <w:t>Non-functional</w:t>
-            </w:r>
-            <w:r>
-              <w:rPr>
-                <w:b/>
-                <w:color w:val="FFFFFF"/>
-              </w:rPr>
-              <w:t xml:space="preserve"> team</w:t>
-            </w:r>
-          </w:p>
-        </w:tc>
-      </w:tr>
-      <w:tr>
-        <w:trPr>
-          <w:trHeight w:val="420"/>
-        </w:trPr>
-        <w:tc>
-          <w:tcPr>
-            <w:tcW w:w="3105" w:type="dxa"/>
-            <w:shd w:val="clear" w:color="auto" w:fill="660000"/>
-            <w:tcMar>
-              <w:top w:w="100" w:type="dxa"/>
-              <w:left w:w="100" w:type="dxa"/>
-              <w:bottom w:w="100" w:type="dxa"/>
-              <w:right w:w="100" w:type="dxa"/>
-            </w:tcMar>
-          </w:tcPr>
-          <w:p>
-            <w:pPr>
-              <w:widowControl w:val="0"/>
-              <w:pBdr>
-                <w:top w:val="nil"/>
-                <w:left w:val="nil"/>
-                <w:bottom w:val="nil"/>
-                <w:right w:val="nil"/>
-                <w:between w:val="nil"/>
-              </w:pBdr>
-              <w:jc w:val="center"/>
-              <w:rPr>
-                <w:color w:val="FFFFFF"/>
-              </w:rPr>
-            </w:pPr>
-            <w:r>
-              <w:rPr>
-                <w:color w:val="FFFFFF"/>
-              </w:rPr>
-              <w:t>Canvas team identifier:</w:t>
-            </w:r>
-          </w:p>
-        </w:tc>
-        <w:tc>
-          <w:tcPr>
-            <w:tcW w:w="5895" w:type="dxa"/>
-            <w:gridSpan w:val="3"/>
-            <w:tcMar>
-              <w:top w:w="100" w:type="dxa"/>
-              <w:left w:w="100" w:type="dxa"/>
-              <w:bottom w:w="100" w:type="dxa"/>
-              <w:right w:w="100" w:type="dxa"/>
-            </w:tcMar>
-          </w:tcPr>
-          <w:p>
-            <w:pPr>
-              <w:widowControl w:val="0"/>
-              <w:pBdr>
-                <w:top w:val="nil"/>
-                <w:left w:val="nil"/>
-                <w:bottom w:val="nil"/>
-                <w:right w:val="nil"/>
-                <w:between w:val="nil"/>
-              </w:pBdr>
-            </w:pPr>
-          </w:p>
-        </w:tc>
-      </w:tr>
-      <w:tr>
-        <w:trPr>
-          <w:trHeight w:val="420"/>
-        </w:trPr>
-        <w:tc>
-          <w:tcPr>
-            <w:tcW w:w="3105" w:type="dxa"/>
-            <w:shd w:val="clear" w:color="auto" w:fill="660000"/>
-            <w:tcMar>
-              <w:top w:w="100" w:type="dxa"/>
-              <w:left w:w="100" w:type="dxa"/>
-              <w:bottom w:w="100" w:type="dxa"/>
-              <w:right w:w="100" w:type="dxa"/>
-            </w:tcMar>
-          </w:tcPr>
-          <w:p>
-            <w:pPr>
-              <w:widowControl w:val="0"/>
-              <w:pBdr>
-                <w:top w:val="nil"/>
-                <w:left w:val="nil"/>
-                <w:bottom w:val="nil"/>
-                <w:right w:val="nil"/>
-                <w:between w:val="nil"/>
-              </w:pBdr>
-              <w:jc w:val="center"/>
-              <w:rPr>
-                <w:color w:val="FFFFFF"/>
-              </w:rPr>
-            </w:pPr>
-            <w:r>
-              <w:rPr>
-                <w:color w:val="FFFFFF"/>
-              </w:rPr>
-              <w:t>Tutor:</w:t>
-            </w:r>
-          </w:p>
-        </w:tc>
-        <w:tc>
-          <w:tcPr>
-            <w:tcW w:w="5895" w:type="dxa"/>
-            <w:gridSpan w:val="3"/>
-            <w:tcMar>
-              <w:top w:w="100" w:type="dxa"/>
-              <w:left w:w="100" w:type="dxa"/>
-              <w:bottom w:w="100" w:type="dxa"/>
-              <w:right w:w="100" w:type="dxa"/>
-            </w:tcMar>
-          </w:tcPr>
-          <w:p>
-            <w:pPr>
-              <w:widowControl w:val="0"/>
-              <w:pBdr>
-                <w:top w:val="nil"/>
-                <w:left w:val="nil"/>
-                <w:bottom w:val="nil"/>
-                <w:right w:val="nil"/>
-                <w:between w:val="nil"/>
-              </w:pBdr>
-            </w:pPr>
-          </w:p>
-        </w:tc>
-      </w:tr>
-      <w:tr>
-        <w:trPr>
-          <w:trHeight w:val="420"/>
-        </w:trPr>
-        <w:tc>
-          <w:tcPr>
-            <w:tcW w:w="3105" w:type="dxa"/>
-            <w:shd w:val="clear" w:color="auto" w:fill="660000"/>
-            <w:tcMar>
-              <w:top w:w="100" w:type="dxa"/>
-              <w:left w:w="100" w:type="dxa"/>
-              <w:bottom w:w="100" w:type="dxa"/>
-              <w:right w:w="100" w:type="dxa"/>
-            </w:tcMar>
-          </w:tcPr>
-          <w:p>
-            <w:pPr>
-              <w:widowControl w:val="0"/>
-              <w:pBdr>
-                <w:top w:val="nil"/>
-                <w:left w:val="nil"/>
-                <w:bottom w:val="nil"/>
-                <w:right w:val="nil"/>
-                <w:between w:val="nil"/>
-              </w:pBdr>
-              <w:jc w:val="center"/>
-              <w:rPr>
-                <w:color w:val="FFFFFF"/>
-              </w:rPr>
-            </w:pPr>
-            <w:r>
-              <w:rPr>
-                <w:color w:val="FFFFFF"/>
-              </w:rPr>
-              <w:t>Day and time of tutorial:</w:t>
-            </w:r>
-          </w:p>
-        </w:tc>
-        <w:tc>
-          <w:tcPr>
-            <w:tcW w:w="5895" w:type="dxa"/>
-            <w:gridSpan w:val="3"/>
-            <w:tcMar>
-              <w:top w:w="100" w:type="dxa"/>
-              <w:left w:w="100" w:type="dxa"/>
-              <w:bottom w:w="100" w:type="dxa"/>
-              <w:right w:w="100" w:type="dxa"/>
-            </w:tcMar>
-          </w:tcPr>
-          <w:p>
-            <w:pPr>
-              <w:widowControl w:val="0"/>
-              <w:pBdr>
-                <w:top w:val="nil"/>
-                <w:left w:val="nil"/>
-                <w:bottom w:val="nil"/>
-                <w:right w:val="nil"/>
-                <w:between w:val="nil"/>
-              </w:pBdr>
-            </w:pPr>
-          </w:p>
-        </w:tc>
-      </w:tr>
-      <w:tr>
-        <w:trPr>
-          <w:trHeight w:val="420"/>
-        </w:trPr>
-        <w:tc>
-          <w:tcPr>
-            <w:tcW w:w="3105" w:type="dxa"/>
-            <w:shd w:val="clear" w:color="auto" w:fill="660000"/>
-            <w:tcMar>
-              <w:top w:w="100" w:type="dxa"/>
-              <w:left w:w="100" w:type="dxa"/>
-              <w:bottom w:w="100" w:type="dxa"/>
-              <w:right w:w="100" w:type="dxa"/>
-            </w:tcMar>
-          </w:tcPr>
-          <w:p>
-            <w:pPr>
-              <w:widowControl w:val="0"/>
-              <w:pBdr>
-                <w:top w:val="nil"/>
-                <w:left w:val="nil"/>
-                <w:bottom w:val="nil"/>
-                <w:right w:val="nil"/>
-                <w:between w:val="nil"/>
-              </w:pBdr>
-              <w:jc w:val="center"/>
-              <w:rPr>
-                <w:color w:val="FFFFFF"/>
-              </w:rPr>
-            </w:pPr>
-            <w:r>
-              <w:rPr>
-                <w:color w:val="FFFFFF"/>
-              </w:rPr>
-              <w:t>GitHub</w:t>
-            </w:r>
-            <w:r>
-              <w:rPr>
-                <w:color w:val="FFFFFF"/>
-              </w:rPr>
-              <w:t xml:space="preserve"> name and link:</w:t>
-            </w:r>
-          </w:p>
-        </w:tc>
-        <w:tc>
-          <w:tcPr>
-            <w:tcW w:w="5895" w:type="dxa"/>
-            <w:gridSpan w:val="3"/>
-            <w:tcMar>
-              <w:top w:w="100" w:type="dxa"/>
-              <w:left w:w="100" w:type="dxa"/>
-              <w:bottom w:w="100" w:type="dxa"/>
-              <w:right w:w="100" w:type="dxa"/>
-            </w:tcMar>
-          </w:tcPr>
-          <w:p>
-            <w:pPr>
-              <w:widowControl w:val="0"/>
-              <w:pBdr>
-                <w:top w:val="nil"/>
-                <w:left w:val="nil"/>
-                <w:bottom w:val="nil"/>
-                <w:right w:val="nil"/>
-                <w:between w:val="nil"/>
-              </w:pBdr>
-            </w:pPr>
-          </w:p>
-        </w:tc>
-      </w:tr>
-      <w:tr>
-        <w:tc>
-          <w:tcPr>
-            <w:tcW w:w="3105" w:type="dxa"/>
-            <w:shd w:val="clear" w:color="auto" w:fill="660000"/>
-            <w:tcMar>
-              <w:top w:w="100" w:type="dxa"/>
-              <w:left w:w="100" w:type="dxa"/>
-              <w:bottom w:w="100" w:type="dxa"/>
-              <w:right w:w="100" w:type="dxa"/>
-            </w:tcMar>
-          </w:tcPr>
-          <w:p>
-            <w:pPr>
-              <w:pBdr>
-                <w:top w:val="nil"/>
-                <w:left w:val="nil"/>
-                <w:bottom w:val="nil"/>
-                <w:right w:val="nil"/>
-                <w:between w:val="nil"/>
-              </w:pBdr>
-              <w:jc w:val="center"/>
-              <w:rPr>
-                <w:color w:val="FFFFFF"/>
-              </w:rPr>
-            </w:pPr>
-            <w:r>
-              <w:rPr>
-                <w:color w:val="FFFFFF"/>
-              </w:rPr>
-              <w:t>Full name</w:t>
-            </w:r>
-          </w:p>
-        </w:tc>
-        <w:tc>
-          <w:tcPr>
-            <w:tcW w:w="1155" w:type="dxa"/>
-            <w:shd w:val="clear" w:color="auto" w:fill="660000"/>
-            <w:tcMar>
-              <w:top w:w="100" w:type="dxa"/>
-              <w:left w:w="100" w:type="dxa"/>
-              <w:bottom w:w="100" w:type="dxa"/>
-              <w:right w:w="100" w:type="dxa"/>
-            </w:tcMar>
-          </w:tcPr>
-          <w:p>
-            <w:pPr>
-              <w:pBdr>
-                <w:top w:val="nil"/>
-                <w:left w:val="nil"/>
-                <w:bottom w:val="nil"/>
-                <w:right w:val="nil"/>
-                <w:between w:val="nil"/>
-              </w:pBdr>
-              <w:jc w:val="center"/>
-              <w:rPr>
-                <w:color w:val="FFFFFF"/>
-              </w:rPr>
-            </w:pPr>
-            <w:r>
-              <w:rPr>
-                <w:color w:val="FFFFFF"/>
-              </w:rPr>
-              <w:t>Student#</w:t>
-            </w:r>
-          </w:p>
-        </w:tc>
-        <w:tc>
-          <w:tcPr>
-            <w:tcW w:w="3600" w:type="dxa"/>
-            <w:shd w:val="clear" w:color="auto" w:fill="660000"/>
-            <w:tcMar>
-              <w:top w:w="100" w:type="dxa"/>
-              <w:left w:w="100" w:type="dxa"/>
-              <w:bottom w:w="100" w:type="dxa"/>
-              <w:right w:w="100" w:type="dxa"/>
-            </w:tcMar>
-          </w:tcPr>
-          <w:p>
-            <w:pPr>
-              <w:pBdr>
-                <w:top w:val="nil"/>
-                <w:left w:val="nil"/>
-                <w:bottom w:val="nil"/>
-                <w:right w:val="nil"/>
-                <w:between w:val="nil"/>
-              </w:pBdr>
-              <w:jc w:val="center"/>
-              <w:rPr>
-                <w:color w:val="FFFFFF"/>
-              </w:rPr>
-            </w:pPr>
-            <w:r>
-              <w:rPr>
-                <w:color w:val="FFFFFF"/>
-              </w:rPr>
-              <w:t>QUT Email</w:t>
-            </w:r>
-          </w:p>
-        </w:tc>
-        <w:tc>
-          <w:tcPr>
-            <w:tcW w:w="1140" w:type="dxa"/>
-            <w:shd w:val="clear" w:color="auto" w:fill="660000"/>
-            <w:tcMar>
-              <w:top w:w="100" w:type="dxa"/>
-              <w:left w:w="100" w:type="dxa"/>
-              <w:bottom w:w="100" w:type="dxa"/>
-              <w:right w:w="100" w:type="dxa"/>
-            </w:tcMar>
-          </w:tcPr>
-          <w:p>
-            <w:pPr>
-              <w:pBdr>
-                <w:top w:val="nil"/>
-                <w:left w:val="nil"/>
-                <w:bottom w:val="nil"/>
-                <w:right w:val="nil"/>
-                <w:between w:val="nil"/>
-              </w:pBdr>
-              <w:jc w:val="center"/>
-              <w:rPr>
-                <w:color w:val="FFFFFF"/>
-              </w:rPr>
-            </w:pPr>
-            <w:r>
-              <w:rPr>
-                <w:color w:val="FFFFFF"/>
-              </w:rPr>
-              <w:t>%</w:t>
-            </w:r>
-          </w:p>
-        </w:tc>
-      </w:tr>
-      <w:tr>
-        <w:tc>
-          <w:tcPr>
-            <w:tcW w:w="3105" w:type="dxa"/>
-            <w:tcMar>
-              <w:top w:w="100" w:type="dxa"/>
-              <w:left w:w="100" w:type="dxa"/>
-              <w:bottom w:w="100" w:type="dxa"/>
-              <w:right w:w="100" w:type="dxa"/>
-            </w:tcMar>
-          </w:tcPr>
-          <w:p>
-            <w:pPr>
-              <w:pBdr>
-                <w:top w:val="nil"/>
-                <w:left w:val="nil"/>
-                <w:bottom w:val="nil"/>
-                <w:right w:val="nil"/>
-                <w:between w:val="nil"/>
-              </w:pBdr>
-              <w:rPr>
-                <w:sz w:val="20"/>
-                <w:szCs w:val="20"/>
-              </w:rPr>
-            </w:pPr>
-            <w:r>
-              <w:rPr>
-                <w:sz w:val="20"/>
-                <w:szCs w:val="20"/>
-              </w:rPr>
-              <w:t>Person1_full_name</w:t>
-            </w:r>
-          </w:p>
-        </w:tc>
-        <w:tc>
-          <w:tcPr>
-            <w:tcW w:w="1155" w:type="dxa"/>
-            <w:tcMar>
-              <w:top w:w="100" w:type="dxa"/>
-              <w:left w:w="100" w:type="dxa"/>
-              <w:bottom w:w="100" w:type="dxa"/>
-              <w:right w:w="100" w:type="dxa"/>
-            </w:tcMar>
-          </w:tcPr>
-          <w:p>
-            <w:pPr>
-              <w:pBdr>
-                <w:top w:val="nil"/>
-                <w:left w:val="nil"/>
-                <w:bottom w:val="nil"/>
-                <w:right w:val="nil"/>
-                <w:between w:val="nil"/>
-              </w:pBdr>
-              <w:rPr>
-                <w:sz w:val="20"/>
-                <w:szCs w:val="20"/>
-              </w:rPr>
-            </w:pPr>
-            <w:r>
-              <w:rPr>
-                <w:sz w:val="20"/>
-                <w:szCs w:val="20"/>
-              </w:rPr>
-              <w:t>n123456</w:t>
-            </w:r>
-          </w:p>
-        </w:tc>
-        <w:tc>
-          <w:tcPr>
-            <w:tcW w:w="3600" w:type="dxa"/>
-            <w:tcMar>
-              <w:top w:w="100" w:type="dxa"/>
-              <w:left w:w="100" w:type="dxa"/>
-              <w:bottom w:w="100" w:type="dxa"/>
-              <w:right w:w="100" w:type="dxa"/>
-            </w:tcMar>
-          </w:tcPr>
-          <w:p>
-            <w:pPr>
-              <w:pBdr>
-                <w:top w:val="nil"/>
-                <w:left w:val="nil"/>
-                <w:bottom w:val="nil"/>
-                <w:right w:val="nil"/>
-                <w:between w:val="nil"/>
-              </w:pBdr>
-              <w:rPr>
-                <w:sz w:val="20"/>
-                <w:szCs w:val="20"/>
-              </w:rPr>
-            </w:pPr>
-            <w:r>
-              <w:rPr>
-                <w:sz w:val="20"/>
-                <w:szCs w:val="20"/>
-              </w:rPr>
-              <w:t>Person_name@qut.edu.au</w:t>
-            </w:r>
-          </w:p>
-        </w:tc>
-        <w:tc>
-          <w:tcPr>
-            <w:tcW w:w="1140" w:type="dxa"/>
-            <w:tcMar>
-              <w:top w:w="100" w:type="dxa"/>
-              <w:left w:w="100" w:type="dxa"/>
-              <w:bottom w:w="100" w:type="dxa"/>
-              <w:right w:w="100" w:type="dxa"/>
-            </w:tcMar>
-          </w:tcPr>
-          <w:p>
-            <w:pPr>
-              <w:pBdr>
-                <w:top w:val="nil"/>
-                <w:left w:val="nil"/>
-                <w:bottom w:val="nil"/>
-                <w:right w:val="nil"/>
-                <w:between w:val="nil"/>
-              </w:pBdr>
-              <w:jc w:val="center"/>
-              <w:rPr>
-                <w:sz w:val="20"/>
-                <w:szCs w:val="20"/>
-              </w:rPr>
-            </w:pPr>
-            <w:r>
-              <w:rPr>
-                <w:sz w:val="20"/>
-                <w:szCs w:val="20"/>
-              </w:rPr>
-              <w:t>30</w:t>
-            </w:r>
-          </w:p>
-        </w:tc>
-      </w:tr>
-      <w:tr>
-        <w:tc>
-          <w:tcPr>
-            <w:tcW w:w="3105" w:type="dxa"/>
-            <w:tcMar>
-              <w:top w:w="100" w:type="dxa"/>
-              <w:left w:w="100" w:type="dxa"/>
-              <w:bottom w:w="100" w:type="dxa"/>
-              <w:right w:w="100" w:type="dxa"/>
-            </w:tcMar>
-          </w:tcPr>
-          <w:p>
-            <w:pPr>
-              <w:pBdr>
-                <w:top w:val="nil"/>
-                <w:left w:val="nil"/>
-                <w:bottom w:val="nil"/>
-                <w:right w:val="nil"/>
-                <w:between w:val="nil"/>
-              </w:pBdr>
-              <w:rPr>
-                <w:sz w:val="20"/>
-                <w:szCs w:val="20"/>
-              </w:rPr>
-            </w:pPr>
-            <w:r>
-              <w:rPr>
-                <w:sz w:val="20"/>
-                <w:szCs w:val="20"/>
-              </w:rPr>
-              <w:t>Person2_full_name</w:t>
-            </w:r>
-          </w:p>
-        </w:tc>
-        <w:tc>
-          <w:tcPr>
-            <w:tcW w:w="1155" w:type="dxa"/>
-            <w:tcMar>
-              <w:top w:w="100" w:type="dxa"/>
-              <w:left w:w="100" w:type="dxa"/>
-              <w:bottom w:w="100" w:type="dxa"/>
-              <w:right w:w="100" w:type="dxa"/>
-            </w:tcMar>
-          </w:tcPr>
-          <w:p>
-            <w:pPr>
-              <w:pBdr>
-                <w:top w:val="nil"/>
-                <w:left w:val="nil"/>
-                <w:bottom w:val="nil"/>
-                <w:right w:val="nil"/>
-                <w:between w:val="nil"/>
-              </w:pBdr>
-              <w:rPr>
-                <w:sz w:val="20"/>
-                <w:szCs w:val="20"/>
-              </w:rPr>
-            </w:pPr>
-            <w:r>
-              <w:rPr>
-                <w:sz w:val="20"/>
-                <w:szCs w:val="20"/>
-              </w:rPr>
-              <w:t>n123456</w:t>
-            </w:r>
-          </w:p>
-        </w:tc>
-        <w:tc>
-          <w:tcPr>
-            <w:tcW w:w="3600" w:type="dxa"/>
-            <w:tcMar>
-              <w:top w:w="100" w:type="dxa"/>
-              <w:left w:w="100" w:type="dxa"/>
-              <w:bottom w:w="100" w:type="dxa"/>
-              <w:right w:w="100" w:type="dxa"/>
-            </w:tcMar>
-          </w:tcPr>
-          <w:p>
-            <w:pPr>
-              <w:pBdr>
-                <w:top w:val="nil"/>
-                <w:left w:val="nil"/>
-                <w:bottom w:val="nil"/>
-                <w:right w:val="nil"/>
-                <w:between w:val="nil"/>
-              </w:pBdr>
-              <w:rPr>
-                <w:sz w:val="20"/>
-                <w:szCs w:val="20"/>
-              </w:rPr>
-            </w:pPr>
-            <w:r>
-              <w:rPr>
-                <w:sz w:val="20"/>
-                <w:szCs w:val="20"/>
-              </w:rPr>
-              <w:t>Person_name@qut.edu.au</w:t>
-            </w:r>
-          </w:p>
-        </w:tc>
-        <w:tc>
-          <w:tcPr>
-            <w:tcW w:w="1140" w:type="dxa"/>
-            <w:tcMar>
-              <w:top w:w="100" w:type="dxa"/>
-              <w:left w:w="100" w:type="dxa"/>
-              <w:bottom w:w="100" w:type="dxa"/>
-              <w:right w:w="100" w:type="dxa"/>
-            </w:tcMar>
-          </w:tcPr>
-          <w:p>
-            <w:pPr>
-              <w:pBdr>
-                <w:top w:val="nil"/>
-                <w:left w:val="nil"/>
-                <w:bottom w:val="nil"/>
-                <w:right w:val="nil"/>
-                <w:between w:val="nil"/>
-              </w:pBdr>
-              <w:jc w:val="center"/>
-              <w:rPr>
-                <w:sz w:val="20"/>
-                <w:szCs w:val="20"/>
-              </w:rPr>
-            </w:pPr>
-            <w:r>
-              <w:rPr>
-                <w:sz w:val="20"/>
-                <w:szCs w:val="20"/>
-              </w:rPr>
-              <w:t>30</w:t>
-            </w:r>
-          </w:p>
-        </w:tc>
-      </w:tr>
-      <w:tr>
-        <w:tc>
-          <w:tcPr>
-            <w:tcW w:w="3105" w:type="dxa"/>
-            <w:tcMar>
-              <w:top w:w="100" w:type="dxa"/>
-              <w:left w:w="100" w:type="dxa"/>
-              <w:bottom w:w="100" w:type="dxa"/>
-              <w:right w:w="100" w:type="dxa"/>
-            </w:tcMar>
-          </w:tcPr>
-          <w:p>
-            <w:pPr>
-              <w:pBdr>
-                <w:top w:val="nil"/>
-                <w:left w:val="nil"/>
-                <w:bottom w:val="nil"/>
-                <w:right w:val="nil"/>
-                <w:between w:val="nil"/>
-              </w:pBdr>
-              <w:rPr>
-                <w:sz w:val="20"/>
-                <w:szCs w:val="20"/>
-              </w:rPr>
-            </w:pPr>
-            <w:r>
-              <w:rPr>
-                <w:sz w:val="20"/>
-                <w:szCs w:val="20"/>
-              </w:rPr>
-              <w:t>Person3_full_name</w:t>
-            </w:r>
-          </w:p>
-        </w:tc>
-        <w:tc>
-          <w:tcPr>
-            <w:tcW w:w="1155" w:type="dxa"/>
-            <w:tcMar>
-              <w:top w:w="100" w:type="dxa"/>
-              <w:left w:w="100" w:type="dxa"/>
-              <w:bottom w:w="100" w:type="dxa"/>
-              <w:right w:w="100" w:type="dxa"/>
-            </w:tcMar>
-          </w:tcPr>
-          <w:p>
-            <w:pPr>
-              <w:pBdr>
-                <w:top w:val="nil"/>
-                <w:left w:val="nil"/>
-                <w:bottom w:val="nil"/>
-                <w:right w:val="nil"/>
-                <w:between w:val="nil"/>
-              </w:pBdr>
-              <w:rPr>
-                <w:sz w:val="20"/>
-                <w:szCs w:val="20"/>
-              </w:rPr>
-            </w:pPr>
-            <w:r>
-              <w:rPr>
-                <w:sz w:val="20"/>
-                <w:szCs w:val="20"/>
-              </w:rPr>
-              <w:t>n123456</w:t>
-            </w:r>
-          </w:p>
-        </w:tc>
-        <w:tc>
-          <w:tcPr>
-            <w:tcW w:w="3600" w:type="dxa"/>
-            <w:tcMar>
-              <w:top w:w="100" w:type="dxa"/>
-              <w:left w:w="100" w:type="dxa"/>
-              <w:bottom w:w="100" w:type="dxa"/>
-              <w:right w:w="100" w:type="dxa"/>
-            </w:tcMar>
-          </w:tcPr>
-          <w:p>
-            <w:pPr>
-              <w:pBdr>
-                <w:top w:val="nil"/>
-                <w:left w:val="nil"/>
-                <w:bottom w:val="nil"/>
-                <w:right w:val="nil"/>
-                <w:between w:val="nil"/>
-              </w:pBdr>
-              <w:rPr>
-                <w:sz w:val="20"/>
-                <w:szCs w:val="20"/>
-              </w:rPr>
-            </w:pPr>
-            <w:r>
-              <w:rPr>
-                <w:sz w:val="20"/>
-                <w:szCs w:val="20"/>
-              </w:rPr>
-              <w:t>Person_name@qut.edu.au</w:t>
-            </w:r>
-          </w:p>
-        </w:tc>
-        <w:tc>
-          <w:tcPr>
-            <w:tcW w:w="1140" w:type="dxa"/>
-            <w:tcMar>
-              <w:top w:w="100" w:type="dxa"/>
-              <w:left w:w="100" w:type="dxa"/>
-              <w:bottom w:w="100" w:type="dxa"/>
-              <w:right w:w="100" w:type="dxa"/>
-            </w:tcMar>
-          </w:tcPr>
-          <w:p>
-            <w:pPr>
-              <w:pBdr>
-                <w:top w:val="nil"/>
-                <w:left w:val="nil"/>
-                <w:bottom w:val="nil"/>
-                <w:right w:val="nil"/>
-                <w:between w:val="nil"/>
-              </w:pBdr>
-              <w:jc w:val="center"/>
-              <w:rPr>
-                <w:sz w:val="20"/>
-                <w:szCs w:val="20"/>
-              </w:rPr>
-            </w:pPr>
-            <w:r>
-              <w:rPr>
-                <w:sz w:val="20"/>
-                <w:szCs w:val="20"/>
-              </w:rPr>
-              <w:t>10</w:t>
-            </w:r>
-          </w:p>
-        </w:tc>
-      </w:tr>
-      <w:tr>
-        <w:tc>
-          <w:tcPr>
-            <w:tcW w:w="3105" w:type="dxa"/>
-            <w:tcMar>
-              <w:top w:w="100" w:type="dxa"/>
-              <w:left w:w="100" w:type="dxa"/>
-              <w:bottom w:w="100" w:type="dxa"/>
-              <w:right w:w="100" w:type="dxa"/>
-            </w:tcMar>
-          </w:tcPr>
-          <w:p>
-            <w:pPr>
-              <w:pBdr>
-                <w:top w:val="nil"/>
-                <w:left w:val="nil"/>
-                <w:bottom w:val="nil"/>
-                <w:right w:val="nil"/>
-                <w:between w:val="nil"/>
-              </w:pBdr>
-              <w:rPr>
-                <w:sz w:val="20"/>
-                <w:szCs w:val="20"/>
-              </w:rPr>
-            </w:pPr>
-            <w:r>
-              <w:rPr>
-                <w:sz w:val="20"/>
-                <w:szCs w:val="20"/>
-              </w:rPr>
-              <w:t>Person4_full_name</w:t>
-            </w:r>
-          </w:p>
-        </w:tc>
-        <w:tc>
-          <w:tcPr>
-            <w:tcW w:w="1155" w:type="dxa"/>
-            <w:tcMar>
-              <w:top w:w="100" w:type="dxa"/>
-              <w:left w:w="100" w:type="dxa"/>
-              <w:bottom w:w="100" w:type="dxa"/>
-              <w:right w:w="100" w:type="dxa"/>
-            </w:tcMar>
-          </w:tcPr>
-          <w:p>
-            <w:pPr>
-              <w:pBdr>
-                <w:top w:val="nil"/>
-                <w:left w:val="nil"/>
-                <w:bottom w:val="nil"/>
-                <w:right w:val="nil"/>
-                <w:between w:val="nil"/>
-              </w:pBdr>
-              <w:rPr>
-                <w:sz w:val="20"/>
-                <w:szCs w:val="20"/>
-              </w:rPr>
-            </w:pPr>
-            <w:r>
-              <w:rPr>
-                <w:sz w:val="20"/>
-                <w:szCs w:val="20"/>
-              </w:rPr>
-              <w:t>n123456</w:t>
-            </w:r>
-          </w:p>
-        </w:tc>
-        <w:tc>
-          <w:tcPr>
-            <w:tcW w:w="3600" w:type="dxa"/>
-            <w:tcMar>
-              <w:top w:w="100" w:type="dxa"/>
-              <w:left w:w="100" w:type="dxa"/>
-              <w:bottom w:w="100" w:type="dxa"/>
-              <w:right w:w="100" w:type="dxa"/>
-            </w:tcMar>
-          </w:tcPr>
-          <w:p>
-            <w:pPr>
-              <w:pBdr>
-                <w:top w:val="nil"/>
-                <w:left w:val="nil"/>
-                <w:bottom w:val="nil"/>
-                <w:right w:val="nil"/>
-                <w:between w:val="nil"/>
-              </w:pBdr>
-              <w:rPr>
-                <w:sz w:val="20"/>
-                <w:szCs w:val="20"/>
-              </w:rPr>
-            </w:pPr>
-            <w:r>
-              <w:rPr>
-                <w:sz w:val="20"/>
-                <w:szCs w:val="20"/>
-              </w:rPr>
-              <w:t>Person_name@qut.edu.au</w:t>
-            </w:r>
-          </w:p>
-        </w:tc>
-        <w:tc>
-          <w:tcPr>
-            <w:tcW w:w="1140" w:type="dxa"/>
-            <w:tcMar>
-              <w:top w:w="100" w:type="dxa"/>
-              <w:left w:w="100" w:type="dxa"/>
-              <w:bottom w:w="100" w:type="dxa"/>
-              <w:right w:w="100" w:type="dxa"/>
-            </w:tcMar>
-          </w:tcPr>
-          <w:p>
-            <w:pPr>
-              <w:pBdr>
-                <w:top w:val="nil"/>
-                <w:left w:val="nil"/>
-                <w:bottom w:val="nil"/>
-                <w:right w:val="nil"/>
-                <w:between w:val="nil"/>
-              </w:pBdr>
-              <w:jc w:val="center"/>
-              <w:rPr>
-                <w:sz w:val="20"/>
-                <w:szCs w:val="20"/>
-              </w:rPr>
-            </w:pPr>
-            <w:r>
-              <w:rPr>
-                <w:sz w:val="20"/>
-                <w:szCs w:val="20"/>
-              </w:rPr>
-              <w:t>30</w:t>
-            </w:r>
-          </w:p>
-        </w:tc>
-      </w:tr>
-      <w:tr>
-        <w:tc>
-          <w:tcPr>
-            <w:tcW w:w="3105" w:type="dxa"/>
-            <w:tcMar>
-              <w:top w:w="100" w:type="dxa"/>
-              <w:left w:w="100" w:type="dxa"/>
-              <w:bottom w:w="100" w:type="dxa"/>
-              <w:right w:w="100" w:type="dxa"/>
-            </w:tcMar>
-          </w:tcPr>
-          <w:p>
-            <w:pPr>
-              <w:pBdr>
-                <w:top w:val="nil"/>
-                <w:left w:val="nil"/>
-                <w:bottom w:val="nil"/>
-                <w:right w:val="nil"/>
-                <w:between w:val="nil"/>
-              </w:pBdr>
-              <w:rPr>
-                <w:sz w:val="20"/>
-                <w:szCs w:val="20"/>
-              </w:rPr>
-            </w:pPr>
-          </w:p>
-        </w:tc>
-        <w:tc>
-          <w:tcPr>
-            <w:tcW w:w="1155" w:type="dxa"/>
-            <w:tcMar>
-              <w:top w:w="100" w:type="dxa"/>
-              <w:left w:w="100" w:type="dxa"/>
-              <w:bottom w:w="100" w:type="dxa"/>
-              <w:right w:w="100" w:type="dxa"/>
-            </w:tcMar>
-          </w:tcPr>
-          <w:p>
-            <w:pPr>
-              <w:pBdr>
-                <w:top w:val="nil"/>
-                <w:left w:val="nil"/>
-                <w:bottom w:val="nil"/>
-                <w:right w:val="nil"/>
-                <w:between w:val="nil"/>
-              </w:pBdr>
-              <w:rPr>
-                <w:sz w:val="20"/>
-                <w:szCs w:val="20"/>
-              </w:rPr>
-            </w:pPr>
-          </w:p>
-        </w:tc>
-        <w:tc>
-          <w:tcPr>
-            <w:tcW w:w="3600" w:type="dxa"/>
-            <w:tcMar>
-              <w:top w:w="100" w:type="dxa"/>
-              <w:left w:w="100" w:type="dxa"/>
-              <w:bottom w:w="100" w:type="dxa"/>
-              <w:right w:w="100" w:type="dxa"/>
-            </w:tcMar>
-          </w:tcPr>
-          <w:p>
-            <w:pPr>
-              <w:pBdr>
-                <w:top w:val="nil"/>
-                <w:left w:val="nil"/>
-                <w:bottom w:val="nil"/>
-                <w:right w:val="nil"/>
-                <w:between w:val="nil"/>
-              </w:pBdr>
-              <w:rPr>
-                <w:sz w:val="20"/>
-                <w:szCs w:val="20"/>
-              </w:rPr>
-            </w:pPr>
-          </w:p>
-        </w:tc>
-        <w:tc>
-          <w:tcPr>
-            <w:tcW w:w="1140" w:type="dxa"/>
-            <w:tcMar>
-              <w:top w:w="100" w:type="dxa"/>
-              <w:left w:w="100" w:type="dxa"/>
-              <w:bottom w:w="100" w:type="dxa"/>
-              <w:right w:w="100" w:type="dxa"/>
-            </w:tcMar>
-          </w:tcPr>
-          <w:p>
-            <w:pPr>
-              <w:pBdr>
-                <w:top w:val="nil"/>
-                <w:left w:val="nil"/>
-                <w:bottom w:val="nil"/>
-                <w:right w:val="nil"/>
-                <w:between w:val="nil"/>
-              </w:pBdr>
-              <w:jc w:val="center"/>
-              <w:rPr>
-                <w:sz w:val="20"/>
-                <w:szCs w:val="20"/>
-              </w:rPr>
-            </w:pPr>
-          </w:p>
-        </w:tc>
-      </w:tr>
-      <w:tr>
-        <w:trPr>
-          <w:trHeight w:val="400"/>
-        </w:trPr>
-        <w:tc>
-          <w:tcPr>
-            <w:tcW w:w="7860" w:type="dxa"/>
-            <w:gridSpan w:val="3"/>
-            <w:shd w:val="clear" w:color="auto" w:fill="660000"/>
-            <w:tcMar>
-              <w:top w:w="100" w:type="dxa"/>
-              <w:left w:w="100" w:type="dxa"/>
-              <w:bottom w:w="100" w:type="dxa"/>
-              <w:right w:w="100" w:type="dxa"/>
-            </w:tcMar>
-          </w:tcPr>
-          <w:p>
-            <w:pPr>
-              <w:pBdr>
-                <w:top w:val="nil"/>
-                <w:left w:val="nil"/>
-                <w:bottom w:val="nil"/>
-                <w:right w:val="nil"/>
-                <w:between w:val="nil"/>
-              </w:pBdr>
-              <w:jc w:val="right"/>
-              <w:rPr>
-                <w:color w:val="FFFFFF"/>
-              </w:rPr>
-            </w:pPr>
-            <w:r>
-              <w:rPr>
-                <w:color w:val="FFFFFF"/>
-              </w:rPr>
-              <w:t>Total must equal:</w:t>
-            </w:r>
-          </w:p>
-        </w:tc>
-        <w:tc>
-          <w:tcPr>
-            <w:tcW w:w="1140" w:type="dxa"/>
-            <w:shd w:val="clear" w:color="auto" w:fill="660000"/>
-            <w:tcMar>
-              <w:top w:w="100" w:type="dxa"/>
-              <w:left w:w="100" w:type="dxa"/>
-              <w:bottom w:w="100" w:type="dxa"/>
-              <w:right w:w="100" w:type="dxa"/>
-            </w:tcMar>
-          </w:tcPr>
-          <w:p>
-            <w:pPr>
-              <w:pBdr>
-                <w:top w:val="nil"/>
-                <w:left w:val="nil"/>
-                <w:bottom w:val="nil"/>
-                <w:right w:val="nil"/>
-                <w:between w:val="nil"/>
-              </w:pBdr>
-              <w:jc w:val="center"/>
-              <w:rPr>
-                <w:color w:val="FFFFFF"/>
-              </w:rPr>
-            </w:pPr>
-            <w:r>
-              <w:rPr>
-                <w:color w:val="FFFFFF"/>
-              </w:rPr>
-              <w:t>100</w:t>
-            </w:r>
-          </w:p>
-        </w:tc>
-      </w:tr>
-      <w:tr>
-        <w:trPr>
-          <w:trHeight w:val="400"/>
-        </w:trPr>
-        <w:tc>
-          <w:tcPr>
-            <w:tcW w:w="9000" w:type="dxa"/>
-            <w:gridSpan w:val="4"/>
-            <w:tcMar>
-              <w:top w:w="100" w:type="dxa"/>
-              <w:left w:w="100" w:type="dxa"/>
-              <w:bottom w:w="100" w:type="dxa"/>
-              <w:right w:w="100" w:type="dxa"/>
-            </w:tcMar>
-          </w:tcPr>
-          <w:p>
-            <w:pPr>
-              <w:pBdr>
-                <w:top w:val="nil"/>
-                <w:left w:val="nil"/>
-                <w:bottom w:val="nil"/>
-                <w:right w:val="nil"/>
-                <w:between w:val="nil"/>
-              </w:pBdr>
-              <w:rPr>
-                <w:sz w:val="20"/>
-                <w:szCs w:val="20"/>
-              </w:rPr>
-            </w:pPr>
-            <w:r>
-              <w:rPr>
-                <w:sz w:val="20"/>
-                <w:szCs w:val="20"/>
-              </w:rPr>
-              <w:t>As the submitter of this assignment, I confirm that the above percentage distribution was agreed by [</w:t>
-            </w:r>
-            <w:r>
-              <w:rPr>
-                <w:b/>
-                <w:sz w:val="20"/>
-                <w:szCs w:val="20"/>
-              </w:rPr>
-              <w:t>all</w:t>
-            </w:r>
-            <w:r>
-              <w:rPr>
-                <w:sz w:val="20"/>
-                <w:szCs w:val="20"/>
-              </w:rPr>
-              <w:t xml:space="preserve"> / </w:t>
-            </w:r>
-            <w:r>
-              <w:rPr>
-                <w:b/>
-                <w:sz w:val="20"/>
-                <w:szCs w:val="20"/>
-              </w:rPr>
-              <w:t>the majority</w:t>
-            </w:r>
-            <w:r>
-              <w:rPr>
-                <w:sz w:val="20"/>
-                <w:szCs w:val="20"/>
-              </w:rPr>
-              <w:t xml:space="preserve"> (correct as appropriate)] of the team members by way of collective negotiation.</w:t>
-            </w:r>
-          </w:p>
-        </w:tc>
-      </w:tr>
-      <w:tr>
-        <w:trPr>
-          <w:trHeight w:val="400"/>
-        </w:trPr>
-        <w:tc>
-          <w:tcPr>
-            <w:tcW w:w="9000" w:type="dxa"/>
-            <w:gridSpan w:val="4"/>
-            <w:tcMar>
-              <w:top w:w="100" w:type="dxa"/>
-              <w:left w:w="100" w:type="dxa"/>
-              <w:bottom w:w="100" w:type="dxa"/>
-              <w:right w:w="100" w:type="dxa"/>
-            </w:tcMar>
-          </w:tcPr>
-          <w:p>
-            <w:pPr>
-              <w:pBdr>
-                <w:top w:val="nil"/>
-                <w:left w:val="nil"/>
-                <w:bottom w:val="nil"/>
-                <w:right w:val="nil"/>
-                <w:between w:val="nil"/>
-              </w:pBdr>
-              <w:rPr>
-                <w:sz w:val="20"/>
-                <w:szCs w:val="20"/>
-              </w:rPr>
-            </w:pPr>
-            <w:r>
-              <w:rPr>
-                <w:sz w:val="20"/>
-                <w:szCs w:val="20"/>
-              </w:rPr>
-              <w:t>Additional comments from any team member (list as full name: comment):</w:t>
-            </w:r>
-          </w:p>
-        </w:tc>
-      </w:tr>
-    </w:tbl>
-    <w:p>
-      <w:pPr>
-        <w:pBdr>
-          <w:top w:val="nil"/>
-          <w:left w:val="nil"/>
-          <w:bottom w:val="nil"/>
-          <w:right w:val="nil"/>
-          <w:between w:val="nil"/>
-        </w:pBdr>
-        <w:rPr>
-          <w:i/>
-        </w:rPr>
-      </w:pPr>
-      <w:r>
-        <w:rPr>
-          <w:i/>
-        </w:rPr>
-        <w:t>In the example above: person 3 contributed less than the others in a 4 person team.</w:t>
-      </w:r>
-    </w:p>
-    <w:p>
-      <w:pPr>
         <w:rPr>
           <w:rStyle w:val="Strong"/>
           <w:rFonts w:ascii="Segoe UI" w:eastAsiaTheme="majorEastAsia" w:hAnsi="Segoe UI" w:cs="Segoe UI"/>
@@ -2621,15 +1284,6 @@
       </w:pPr>
       <w:r>
         <w:rPr>
-          <w:rFonts w:ascii="Segoe UI" w:hAnsi="Segoe UI" w:cs="Segoe UI"/>
-          <w:color w:val="404040"/>
-        </w:rPr>
-        <w:br/>
-      </w:r>
-    </w:p>
-    <w:p>
-      <w:pPr>
-        <w:rPr>
           <w:rStyle w:val="Strong"/>
           <w:rFonts w:ascii="Segoe UI" w:eastAsiaTheme="majorEastAsia" w:hAnsi="Segoe UI" w:cs="Segoe UI"/>
           <w:b w:val="0"/>
@@ -2638,51 +1292,6 @@
           <w:sz w:val="32"/>
           <w:szCs w:val="32"/>
         </w:rPr>
-      </w:pPr>
-    </w:p>
-    <w:p>
-      <w:pPr>
-        <w:rPr>
-          <w:rStyle w:val="Strong"/>
-          <w:rFonts w:ascii="Segoe UI" w:eastAsiaTheme="majorEastAsia" w:hAnsi="Segoe UI" w:cs="Segoe UI"/>
-          <w:b w:val="0"/>
-          <w:bCs w:val="0"/>
-          <w:color w:val="404040"/>
-          <w:sz w:val="32"/>
-          <w:szCs w:val="32"/>
-        </w:rPr>
-      </w:pPr>
-    </w:p>
-    <w:p>
-      <w:pPr>
-        <w:pBdr>
-          <w:top w:val="nil"/>
-          <w:left w:val="nil"/>
-          <w:bottom w:val="nil"/>
-          <w:right w:val="nil"/>
-          <w:between w:val="nil"/>
-        </w:pBdr>
-        <w:rPr>
-          <w:rStyle w:val="Strong"/>
-          <w:rFonts w:ascii="Segoe UI" w:eastAsiaTheme="majorEastAsia" w:hAnsi="Segoe UI" w:cs="Segoe UI"/>
-          <w:b w:val="0"/>
-          <w:bCs w:val="0"/>
-          <w:color w:val="404040"/>
-          <w:sz w:val="32"/>
-          <w:szCs w:val="32"/>
-        </w:rPr>
-      </w:pPr>
-      <w:r>
-        <w:rPr>
-          <w:rStyle w:val="Strong"/>
-          <w:rFonts w:ascii="Segoe UI" w:eastAsiaTheme="majorEastAsia" w:hAnsi="Segoe UI" w:cs="Segoe UI"/>
-          <w:b w:val="0"/>
-          <w:bCs w:val="0"/>
-          <w:color w:val="404040"/>
-          <w:sz w:val="32"/>
-          <w:szCs w:val="32"/>
-        </w:rPr>
-        <w:lastRenderedPageBreak/>
         <w:t xml:space="preserve">Section </w:t>
       </w:r>
       <w:r>
@@ -2836,7 +1445,51 @@
               <w:rPr>
                 <w:color w:val="0070C0"/>
               </w:rPr>
-              <w:t>Full name of team member 2</w:t>
+              <w:t>Ryan Morris</w:t>
+            </w:r>
+          </w:p>
+        </w:tc>
+        <w:tc>
+          <w:tcPr>
+            <w:tcW w:w="6894" w:type="dxa"/>
+          </w:tcPr>
+          <w:p>
+            <w:pPr>
+              <w:rPr>
+                <w:color w:val="0070C0"/>
+              </w:rPr>
+            </w:pPr>
+            <w:r>
+              <w:rPr>
+                <w:color w:val="0070C0"/>
+              </w:rPr>
+              <w:t>I contributed to the frontend design, user interface improvements, and event browsing functionality across the project. My role focused on improving the user experience and making the site easier to navigate. I styled the login and signup pages, added filter buttons, added the order-by dropdown, fixed the genre dropdown, and improved styling across all pages. I also worked on connecting the user events database to the history page, updated the frontend across the landing page, base layout, event pages, and booking history</w:t>
+            </w:r>
+            <w:r>
+              <w:rPr>
+                <w:color w:val="0070C0"/>
+              </w:rPr>
+              <w:t>.</w:t>
+            </w:r>
+          </w:p>
+        </w:tc>
+      </w:tr>
+      <w:tr>
+        <w:tc>
+          <w:tcPr>
+            <w:tcW w:w="2122" w:type="dxa"/>
+          </w:tcPr>
+          <w:p>
+            <w:pPr>
+              <w:rPr>
+                <w:color w:val="0070C0"/>
+              </w:rPr>
+            </w:pPr>
+            <w:r>
+              <w:rPr>
+                <w:color w:val="0070C0"/>
+              </w:rPr>
+              <w:t>Full name of team member 3</w:t>
             </w:r>
           </w:p>
         </w:tc>
@@ -2874,44 +1527,6 @@
               <w:rPr>
                 <w:color w:val="0070C0"/>
               </w:rPr>
-              <w:t>Full name of team member 3</w:t>
-            </w:r>
-          </w:p>
-        </w:tc>
-        <w:tc>
-          <w:tcPr>
-            <w:tcW w:w="6894" w:type="dxa"/>
-          </w:tcPr>
-          <w:p>
-            <w:pPr>
-              <w:rPr>
-                <w:color w:val="0070C0"/>
-              </w:rPr>
-            </w:pPr>
-            <w:r>
-              <w:rPr>
-                <w:color w:val="0070C0"/>
-              </w:rPr>
-              <w:t>(Contribution statement)</w:t>
-            </w:r>
-          </w:p>
-        </w:tc>
-      </w:tr>
-      <w:tr>
-        <w:tc>
-          <w:tcPr>
-            <w:tcW w:w="2122" w:type="dxa"/>
-          </w:tcPr>
-          <w:p>
-            <w:pPr>
-              <w:rPr>
-                <w:color w:val="0070C0"/>
-              </w:rPr>
-            </w:pPr>
-            <w:r>
-              <w:rPr>
-                <w:color w:val="0070C0"/>
-              </w:rPr>
               <w:t>Full name of team member 4</w:t>
             </w:r>
           </w:p>
@@ -3217,6 +1832,7 @@
           <w:color w:val="156082" w:themeColor="accent1"/>
           <w:lang w:val="en-US"/>
         </w:rPr>
+        <w:lastRenderedPageBreak/>
         <w:t>We</w:t>
       </w:r>
       <w:r>

</xml_diff>

<commit_message>
Added liam's declaration details
</commit_message>
<xml_diff>
--- a/Assignment declaration.docx
+++ b/Assignment declaration.docx
@@ -198,95 +198,6 @@
           <w:right w:val="nil"/>
           <w:between w:val="nil"/>
         </w:pBdr>
-        <w:rPr>
-          <w:color w:val="0070C0"/>
-        </w:rPr>
-      </w:pPr>
-      <w:r>
-        <w:rPr>
-          <w:color w:val="0070C0"/>
-        </w:rPr>
-        <w:t xml:space="preserve">Delete </w:t>
-      </w:r>
-      <w:r>
-        <w:rPr>
-          <w:color w:val="0070C0"/>
-        </w:rPr>
-        <w:t>the</w:t>
-      </w:r>
-      <w:r>
-        <w:rPr>
-          <w:color w:val="0070C0"/>
-        </w:rPr>
-        <w:t xml:space="preserve"> blue guide text</w:t>
-      </w:r>
-      <w:r>
-        <w:rPr>
-          <w:color w:val="0070C0"/>
-        </w:rPr>
-        <w:t xml:space="preserve"> through the document</w:t>
-      </w:r>
-      <w:r>
-        <w:rPr>
-          <w:color w:val="0070C0"/>
-        </w:rPr>
-        <w:t>.</w:t>
-      </w:r>
-    </w:p>
-    <w:p>
-      <w:pPr>
-        <w:pBdr>
-          <w:top w:val="nil"/>
-          <w:left w:val="nil"/>
-          <w:bottom w:val="nil"/>
-          <w:right w:val="nil"/>
-          <w:between w:val="nil"/>
-        </w:pBdr>
-        <w:rPr>
-          <w:color w:val="0070C0"/>
-        </w:rPr>
-      </w:pPr>
-    </w:p>
-    <w:p>
-      <w:pPr>
-        <w:pBdr>
-          <w:top w:val="nil"/>
-          <w:left w:val="nil"/>
-          <w:bottom w:val="nil"/>
-          <w:right w:val="nil"/>
-          <w:between w:val="nil"/>
-        </w:pBdr>
-        <w:rPr>
-          <w:color w:val="0070C0"/>
-        </w:rPr>
-      </w:pPr>
-      <w:r>
-        <w:rPr>
-          <w:color w:val="0070C0"/>
-        </w:rPr>
-        <w:t>Use either Option A or Option B and delete the one not used.</w:t>
-      </w:r>
-    </w:p>
-    <w:p>
-      <w:pPr>
-        <w:pBdr>
-          <w:top w:val="nil"/>
-          <w:left w:val="nil"/>
-          <w:bottom w:val="nil"/>
-          <w:right w:val="nil"/>
-          <w:between w:val="nil"/>
-        </w:pBdr>
-      </w:pPr>
-    </w:p>
-    <w:p>
-      <w:pPr>
-        <w:pBdr>
-          <w:top w:val="nil"/>
-          <w:left w:val="nil"/>
-          <w:bottom w:val="nil"/>
-          <w:right w:val="nil"/>
-          <w:between w:val="nil"/>
-        </w:pBdr>
       </w:pPr>
       <w:r>
         <w:rPr>
@@ -301,24 +212,6 @@
           <w:bCs/>
         </w:rPr>
         <w:t>:</w:t>
-      </w:r>
-      <w:r>
-        <w:rPr>
-          <w:color w:val="0070C0"/>
-        </w:rPr>
-        <w:t xml:space="preserve"> – </w:t>
-      </w:r>
-      <w:r>
-        <w:rPr>
-          <w:color w:val="0070C0"/>
-        </w:rPr>
-        <w:t>Most will use this option. D</w:t>
-      </w:r>
-      <w:r>
-        <w:rPr>
-          <w:color w:val="0070C0"/>
-        </w:rPr>
-        <w:t>elete if not used</w:t>
       </w:r>
     </w:p>
     <w:tbl>
@@ -891,6 +784,9 @@
                 <w:between w:val="nil"/>
               </w:pBdr>
             </w:pPr>
+            <w:r>
+              <w:t>Liam Johns</w:t>
+            </w:r>
           </w:p>
         </w:tc>
         <w:tc>
@@ -914,6 +810,9 @@
                 <w:between w:val="nil"/>
               </w:pBdr>
             </w:pPr>
+            <w:r>
+              <w:t>N11611332</w:t>
+            </w:r>
           </w:p>
         </w:tc>
         <w:tc>
@@ -937,6 +836,9 @@
                 <w:between w:val="nil"/>
               </w:pBdr>
             </w:pPr>
+            <w:r>
+              <w:t>n11611332@qut.edu.au</w:t>
+            </w:r>
           </w:p>
         </w:tc>
       </w:tr>
@@ -1210,1458 +1112,6 @@
           <w:right w:val="nil"/>
           <w:between w:val="nil"/>
         </w:pBdr>
-      </w:pPr>
-      <w:r>
-        <w:rPr>
-          <w:rFonts w:ascii="Segoe UI" w:hAnsi="Segoe UI" w:cs="Segoe UI"/>
-          <w:b/>
-          <w:bCs/>
-          <w:color w:val="404040"/>
-        </w:rPr>
-        <w:lastRenderedPageBreak/>
-        <w:t>Option B</w:t>
-      </w:r>
-      <w:r>
-        <w:rPr>
-          <w:rFonts w:ascii="Segoe UI" w:hAnsi="Segoe UI" w:cs="Segoe UI"/>
-          <w:b/>
-          <w:bCs/>
-          <w:color w:val="404040"/>
-        </w:rPr>
-        <w:t>:</w:t>
-      </w:r>
-      <w:r>
-        <w:rPr>
-          <w:rFonts w:ascii="Segoe UI" w:hAnsi="Segoe UI" w:cs="Segoe UI"/>
-          <w:color w:val="404040"/>
-        </w:rPr>
-        <w:t xml:space="preserve"> </w:t>
-      </w:r>
-      <w:r>
-        <w:rPr>
-          <w:rFonts w:ascii="Segoe UI" w:hAnsi="Segoe UI" w:cs="Segoe UI"/>
-          <w:color w:val="0070C0"/>
-        </w:rPr>
-        <w:t xml:space="preserve">– </w:t>
-      </w:r>
-      <w:r>
-        <w:rPr>
-          <w:rFonts w:ascii="Segoe UI" w:hAnsi="Segoe UI" w:cs="Segoe UI"/>
-          <w:color w:val="0070C0"/>
-        </w:rPr>
-        <w:t>Only use if necessary. D</w:t>
-      </w:r>
-      <w:r>
-        <w:rPr>
-          <w:rFonts w:ascii="Segoe UI" w:hAnsi="Segoe UI" w:cs="Segoe UI"/>
-          <w:color w:val="0070C0"/>
-        </w:rPr>
-        <w:t>elete if not used</w:t>
-      </w:r>
-      <w:r>
-        <w:rPr>
-          <w:rFonts w:ascii="Segoe UI" w:hAnsi="Segoe UI" w:cs="Segoe UI"/>
-          <w:color w:val="404040"/>
-        </w:rPr>
-        <w:t>:</w:t>
-      </w:r>
-      <w:r>
-        <w:rPr>
-          <w:rFonts w:ascii="Segoe UI" w:hAnsi="Segoe UI" w:cs="Segoe UI"/>
-          <w:color w:val="404040"/>
-        </w:rPr>
-        <w:br/>
-      </w:r>
-      <w:r>
-        <w:t>To be used when contribution to the assignment was significantly unequal between team members. Teams are required to collectively negotiate and agree to a representative % contribution. All team members must be invited to this collective discussion and where possible all should agree with the negotiated outcome (however a majority will be sufficient). This discussion does not have to be face to face, but this is encouraged. After unanimous (or majority) agreement has been reached, the team member (nominated by a majority) will enter the agreed (or majority agreed) percentages into the above table. The unit coordinator will consider if marks need to be adjusted to reflect individual contributions to malfunctioning teams. This process is in addition to the peer assessment process that you will use to rate your teammates.</w:t>
-      </w:r>
-    </w:p>
-    <w:p>
-      <w:pPr>
-        <w:pBdr>
-          <w:top w:val="nil"/>
-          <w:left w:val="nil"/>
-          <w:bottom w:val="nil"/>
-          <w:right w:val="nil"/>
-          <w:between w:val="nil"/>
-        </w:pBdr>
-      </w:pPr>
-    </w:p>
-    <w:p>
-      <w:pPr>
-        <w:pBdr>
-          <w:top w:val="nil"/>
-          <w:left w:val="nil"/>
-          <w:bottom w:val="nil"/>
-          <w:right w:val="nil"/>
-          <w:between w:val="nil"/>
-        </w:pBdr>
-      </w:pPr>
-    </w:p>
-    <w:tbl>
-      <w:tblPr>
-        <w:tblW w:w="9000" w:type="dxa"/>
-        <w:tblBorders>
-          <w:top w:val="single" w:sz="8" w:space="0" w:color="660000"/>
-          <w:left w:val="single" w:sz="8" w:space="0" w:color="660000"/>
-          <w:bottom w:val="single" w:sz="8" w:space="0" w:color="660000"/>
-          <w:right w:val="single" w:sz="8" w:space="0" w:color="660000"/>
-          <w:insideH w:val="single" w:sz="8" w:space="0" w:color="660000"/>
-          <w:insideV w:val="single" w:sz="8" w:space="0" w:color="660000"/>
-        </w:tblBorders>
-        <w:tblLayout w:type="fixed"/>
-        <w:tblLook w:val="0600" w:firstRow="0" w:lastRow="0" w:firstColumn="0" w:lastColumn="0" w:noHBand="1" w:noVBand="1"/>
-      </w:tblPr>
-      <w:tblGrid>
-        <w:gridCol w:w="3105"/>
-        <w:gridCol w:w="1155"/>
-        <w:gridCol w:w="3600"/>
-        <w:gridCol w:w="1140"/>
-      </w:tblGrid>
-      <w:tr>
-        <w:trPr>
-          <w:trHeight w:val="420"/>
-        </w:trPr>
-        <w:tc>
-          <w:tcPr>
-            <w:tcW w:w="9000" w:type="dxa"/>
-            <w:gridSpan w:val="4"/>
-            <w:shd w:val="clear" w:color="auto" w:fill="660000"/>
-            <w:tcMar>
-              <w:top w:w="100" w:type="dxa"/>
-              <w:left w:w="100" w:type="dxa"/>
-              <w:bottom w:w="100" w:type="dxa"/>
-              <w:right w:w="100" w:type="dxa"/>
-            </w:tcMar>
-          </w:tcPr>
-          <w:p>
-            <w:pPr>
-              <w:pBdr>
-                <w:top w:val="nil"/>
-                <w:left w:val="nil"/>
-                <w:bottom w:val="nil"/>
-                <w:right w:val="nil"/>
-                <w:between w:val="nil"/>
-              </w:pBdr>
-              <w:jc w:val="center"/>
-              <w:rPr>
-                <w:b/>
-                <w:color w:val="FFFFFF"/>
-              </w:rPr>
-            </w:pPr>
-            <w:r>
-              <w:rPr>
-                <w:b/>
-                <w:color w:val="FFFFFF"/>
-                <w:u w:val="single"/>
-              </w:rPr>
-              <w:t>Non-functional</w:t>
-            </w:r>
-            <w:r>
-              <w:rPr>
-                <w:b/>
-                <w:color w:val="FFFFFF"/>
-              </w:rPr>
-              <w:t xml:space="preserve"> team</w:t>
-            </w:r>
-          </w:p>
-        </w:tc>
-      </w:tr>
-      <w:tr>
-        <w:trPr>
-          <w:trHeight w:val="420"/>
-        </w:trPr>
-        <w:tc>
-          <w:tcPr>
-            <w:tcW w:w="3105" w:type="dxa"/>
-            <w:shd w:val="clear" w:color="auto" w:fill="660000"/>
-            <w:tcMar>
-              <w:top w:w="100" w:type="dxa"/>
-              <w:left w:w="100" w:type="dxa"/>
-              <w:bottom w:w="100" w:type="dxa"/>
-              <w:right w:w="100" w:type="dxa"/>
-            </w:tcMar>
-          </w:tcPr>
-          <w:p>
-            <w:pPr>
-              <w:widowControl w:val="0"/>
-              <w:pBdr>
-                <w:top w:val="nil"/>
-                <w:left w:val="nil"/>
-                <w:bottom w:val="nil"/>
-                <w:right w:val="nil"/>
-                <w:between w:val="nil"/>
-              </w:pBdr>
-              <w:jc w:val="center"/>
-              <w:rPr>
-                <w:color w:val="FFFFFF"/>
-              </w:rPr>
-            </w:pPr>
-            <w:r>
-              <w:rPr>
-                <w:color w:val="FFFFFF"/>
-              </w:rPr>
-              <w:t>Canvas team identifier:</w:t>
-            </w:r>
-          </w:p>
-        </w:tc>
-        <w:tc>
-          <w:tcPr>
-            <w:tcW w:w="5895" w:type="dxa"/>
-            <w:gridSpan w:val="3"/>
-            <w:tcMar>
-              <w:top w:w="100" w:type="dxa"/>
-              <w:left w:w="100" w:type="dxa"/>
-              <w:bottom w:w="100" w:type="dxa"/>
-              <w:right w:w="100" w:type="dxa"/>
-            </w:tcMar>
-          </w:tcPr>
-          <w:p>
-            <w:pPr>
-              <w:widowControl w:val="0"/>
-              <w:pBdr>
-                <w:top w:val="nil"/>
-                <w:left w:val="nil"/>
-                <w:bottom w:val="nil"/>
-                <w:right w:val="nil"/>
-                <w:between w:val="nil"/>
-              </w:pBdr>
-            </w:pPr>
-          </w:p>
-        </w:tc>
-      </w:tr>
-      <w:tr>
-        <w:trPr>
-          <w:trHeight w:val="420"/>
-        </w:trPr>
-        <w:tc>
-          <w:tcPr>
-            <w:tcW w:w="3105" w:type="dxa"/>
-            <w:shd w:val="clear" w:color="auto" w:fill="660000"/>
-            <w:tcMar>
-              <w:top w:w="100" w:type="dxa"/>
-              <w:left w:w="100" w:type="dxa"/>
-              <w:bottom w:w="100" w:type="dxa"/>
-              <w:right w:w="100" w:type="dxa"/>
-            </w:tcMar>
-          </w:tcPr>
-          <w:p>
-            <w:pPr>
-              <w:widowControl w:val="0"/>
-              <w:pBdr>
-                <w:top w:val="nil"/>
-                <w:left w:val="nil"/>
-                <w:bottom w:val="nil"/>
-                <w:right w:val="nil"/>
-                <w:between w:val="nil"/>
-              </w:pBdr>
-              <w:jc w:val="center"/>
-              <w:rPr>
-                <w:color w:val="FFFFFF"/>
-              </w:rPr>
-            </w:pPr>
-            <w:r>
-              <w:rPr>
-                <w:color w:val="FFFFFF"/>
-              </w:rPr>
-              <w:t>Tutor:</w:t>
-            </w:r>
-          </w:p>
-        </w:tc>
-        <w:tc>
-          <w:tcPr>
-            <w:tcW w:w="5895" w:type="dxa"/>
-            <w:gridSpan w:val="3"/>
-            <w:tcMar>
-              <w:top w:w="100" w:type="dxa"/>
-              <w:left w:w="100" w:type="dxa"/>
-              <w:bottom w:w="100" w:type="dxa"/>
-              <w:right w:w="100" w:type="dxa"/>
-            </w:tcMar>
-          </w:tcPr>
-          <w:p>
-            <w:pPr>
-              <w:widowControl w:val="0"/>
-              <w:pBdr>
-                <w:top w:val="nil"/>
-                <w:left w:val="nil"/>
-                <w:bottom w:val="nil"/>
-                <w:right w:val="nil"/>
-                <w:between w:val="nil"/>
-              </w:pBdr>
-            </w:pPr>
-          </w:p>
-        </w:tc>
-      </w:tr>
-      <w:tr>
-        <w:trPr>
-          <w:trHeight w:val="420"/>
-        </w:trPr>
-        <w:tc>
-          <w:tcPr>
-            <w:tcW w:w="3105" w:type="dxa"/>
-            <w:shd w:val="clear" w:color="auto" w:fill="660000"/>
-            <w:tcMar>
-              <w:top w:w="100" w:type="dxa"/>
-              <w:left w:w="100" w:type="dxa"/>
-              <w:bottom w:w="100" w:type="dxa"/>
-              <w:right w:w="100" w:type="dxa"/>
-            </w:tcMar>
-          </w:tcPr>
-          <w:p>
-            <w:pPr>
-              <w:widowControl w:val="0"/>
-              <w:pBdr>
-                <w:top w:val="nil"/>
-                <w:left w:val="nil"/>
-                <w:bottom w:val="nil"/>
-                <w:right w:val="nil"/>
-                <w:between w:val="nil"/>
-              </w:pBdr>
-              <w:jc w:val="center"/>
-              <w:rPr>
-                <w:color w:val="FFFFFF"/>
-              </w:rPr>
-            </w:pPr>
-            <w:r>
-              <w:rPr>
-                <w:color w:val="FFFFFF"/>
-              </w:rPr>
-              <w:t>Day and time of tutorial:</w:t>
-            </w:r>
-          </w:p>
-        </w:tc>
-        <w:tc>
-          <w:tcPr>
-            <w:tcW w:w="5895" w:type="dxa"/>
-            <w:gridSpan w:val="3"/>
-            <w:tcMar>
-              <w:top w:w="100" w:type="dxa"/>
-              <w:left w:w="100" w:type="dxa"/>
-              <w:bottom w:w="100" w:type="dxa"/>
-              <w:right w:w="100" w:type="dxa"/>
-            </w:tcMar>
-          </w:tcPr>
-          <w:p>
-            <w:pPr>
-              <w:widowControl w:val="0"/>
-              <w:pBdr>
-                <w:top w:val="nil"/>
-                <w:left w:val="nil"/>
-                <w:bottom w:val="nil"/>
-                <w:right w:val="nil"/>
-                <w:between w:val="nil"/>
-              </w:pBdr>
-            </w:pPr>
-          </w:p>
-        </w:tc>
-      </w:tr>
-      <w:tr>
-        <w:trPr>
-          <w:trHeight w:val="420"/>
-        </w:trPr>
-        <w:tc>
-          <w:tcPr>
-            <w:tcW w:w="3105" w:type="dxa"/>
-            <w:shd w:val="clear" w:color="auto" w:fill="660000"/>
-            <w:tcMar>
-              <w:top w:w="100" w:type="dxa"/>
-              <w:left w:w="100" w:type="dxa"/>
-              <w:bottom w:w="100" w:type="dxa"/>
-              <w:right w:w="100" w:type="dxa"/>
-            </w:tcMar>
-          </w:tcPr>
-          <w:p>
-            <w:pPr>
-              <w:widowControl w:val="0"/>
-              <w:pBdr>
-                <w:top w:val="nil"/>
-                <w:left w:val="nil"/>
-                <w:bottom w:val="nil"/>
-                <w:right w:val="nil"/>
-                <w:between w:val="nil"/>
-              </w:pBdr>
-              <w:jc w:val="center"/>
-              <w:rPr>
-                <w:color w:val="FFFFFF"/>
-              </w:rPr>
-            </w:pPr>
-            <w:r>
-              <w:rPr>
-                <w:color w:val="FFFFFF"/>
-              </w:rPr>
-              <w:t>GitHub</w:t>
-            </w:r>
-            <w:r>
-              <w:rPr>
-                <w:color w:val="FFFFFF"/>
-              </w:rPr>
-              <w:t xml:space="preserve"> name and link:</w:t>
-            </w:r>
-          </w:p>
-        </w:tc>
-        <w:tc>
-          <w:tcPr>
-            <w:tcW w:w="5895" w:type="dxa"/>
-            <w:gridSpan w:val="3"/>
-            <w:tcMar>
-              <w:top w:w="100" w:type="dxa"/>
-              <w:left w:w="100" w:type="dxa"/>
-              <w:bottom w:w="100" w:type="dxa"/>
-              <w:right w:w="100" w:type="dxa"/>
-            </w:tcMar>
-          </w:tcPr>
-          <w:p>
-            <w:pPr>
-              <w:widowControl w:val="0"/>
-              <w:pBdr>
-                <w:top w:val="nil"/>
-                <w:left w:val="nil"/>
-                <w:bottom w:val="nil"/>
-                <w:right w:val="nil"/>
-                <w:between w:val="nil"/>
-              </w:pBdr>
-            </w:pPr>
-          </w:p>
-        </w:tc>
-      </w:tr>
-      <w:tr>
-        <w:tc>
-          <w:tcPr>
-            <w:tcW w:w="3105" w:type="dxa"/>
-            <w:shd w:val="clear" w:color="auto" w:fill="660000"/>
-            <w:tcMar>
-              <w:top w:w="100" w:type="dxa"/>
-              <w:left w:w="100" w:type="dxa"/>
-              <w:bottom w:w="100" w:type="dxa"/>
-              <w:right w:w="100" w:type="dxa"/>
-            </w:tcMar>
-          </w:tcPr>
-          <w:p>
-            <w:pPr>
-              <w:pBdr>
-                <w:top w:val="nil"/>
-                <w:left w:val="nil"/>
-                <w:bottom w:val="nil"/>
-                <w:right w:val="nil"/>
-                <w:between w:val="nil"/>
-              </w:pBdr>
-              <w:jc w:val="center"/>
-              <w:rPr>
-                <w:color w:val="FFFFFF"/>
-              </w:rPr>
-            </w:pPr>
-            <w:r>
-              <w:rPr>
-                <w:color w:val="FFFFFF"/>
-              </w:rPr>
-              <w:t>Full name</w:t>
-            </w:r>
-          </w:p>
-        </w:tc>
-        <w:tc>
-          <w:tcPr>
-            <w:tcW w:w="1155" w:type="dxa"/>
-            <w:shd w:val="clear" w:color="auto" w:fill="660000"/>
-            <w:tcMar>
-              <w:top w:w="100" w:type="dxa"/>
-              <w:left w:w="100" w:type="dxa"/>
-              <w:bottom w:w="100" w:type="dxa"/>
-              <w:right w:w="100" w:type="dxa"/>
-            </w:tcMar>
-          </w:tcPr>
-          <w:p>
-            <w:pPr>
-              <w:pBdr>
-                <w:top w:val="nil"/>
-                <w:left w:val="nil"/>
-                <w:bottom w:val="nil"/>
-                <w:right w:val="nil"/>
-                <w:between w:val="nil"/>
-              </w:pBdr>
-              <w:jc w:val="center"/>
-              <w:rPr>
-                <w:color w:val="FFFFFF"/>
-              </w:rPr>
-            </w:pPr>
-            <w:r>
-              <w:rPr>
-                <w:color w:val="FFFFFF"/>
-              </w:rPr>
-              <w:t>Student#</w:t>
-            </w:r>
-          </w:p>
-        </w:tc>
-        <w:tc>
-          <w:tcPr>
-            <w:tcW w:w="3600" w:type="dxa"/>
-            <w:shd w:val="clear" w:color="auto" w:fill="660000"/>
-            <w:tcMar>
-              <w:top w:w="100" w:type="dxa"/>
-              <w:left w:w="100" w:type="dxa"/>
-              <w:bottom w:w="100" w:type="dxa"/>
-              <w:right w:w="100" w:type="dxa"/>
-            </w:tcMar>
-          </w:tcPr>
-          <w:p>
-            <w:pPr>
-              <w:pBdr>
-                <w:top w:val="nil"/>
-                <w:left w:val="nil"/>
-                <w:bottom w:val="nil"/>
-                <w:right w:val="nil"/>
-                <w:between w:val="nil"/>
-              </w:pBdr>
-              <w:jc w:val="center"/>
-              <w:rPr>
-                <w:color w:val="FFFFFF"/>
-              </w:rPr>
-            </w:pPr>
-            <w:r>
-              <w:rPr>
-                <w:color w:val="FFFFFF"/>
-              </w:rPr>
-              <w:t>QUT Email</w:t>
-            </w:r>
-          </w:p>
-        </w:tc>
-        <w:tc>
-          <w:tcPr>
-            <w:tcW w:w="1140" w:type="dxa"/>
-            <w:shd w:val="clear" w:color="auto" w:fill="660000"/>
-            <w:tcMar>
-              <w:top w:w="100" w:type="dxa"/>
-              <w:left w:w="100" w:type="dxa"/>
-              <w:bottom w:w="100" w:type="dxa"/>
-              <w:right w:w="100" w:type="dxa"/>
-            </w:tcMar>
-          </w:tcPr>
-          <w:p>
-            <w:pPr>
-              <w:pBdr>
-                <w:top w:val="nil"/>
-                <w:left w:val="nil"/>
-                <w:bottom w:val="nil"/>
-                <w:right w:val="nil"/>
-                <w:between w:val="nil"/>
-              </w:pBdr>
-              <w:jc w:val="center"/>
-              <w:rPr>
-                <w:color w:val="FFFFFF"/>
-              </w:rPr>
-            </w:pPr>
-            <w:r>
-              <w:rPr>
-                <w:color w:val="FFFFFF"/>
-              </w:rPr>
-              <w:t>%</w:t>
-            </w:r>
-          </w:p>
-        </w:tc>
-      </w:tr>
-      <w:tr>
-        <w:tc>
-          <w:tcPr>
-            <w:tcW w:w="3105" w:type="dxa"/>
-            <w:tcMar>
-              <w:top w:w="100" w:type="dxa"/>
-              <w:left w:w="100" w:type="dxa"/>
-              <w:bottom w:w="100" w:type="dxa"/>
-              <w:right w:w="100" w:type="dxa"/>
-            </w:tcMar>
-          </w:tcPr>
-          <w:p>
-            <w:pPr>
-              <w:pBdr>
-                <w:top w:val="nil"/>
-                <w:left w:val="nil"/>
-                <w:bottom w:val="nil"/>
-                <w:right w:val="nil"/>
-                <w:between w:val="nil"/>
-              </w:pBdr>
-              <w:rPr>
-                <w:sz w:val="20"/>
-                <w:szCs w:val="20"/>
-              </w:rPr>
-            </w:pPr>
-            <w:r>
-              <w:rPr>
-                <w:sz w:val="20"/>
-                <w:szCs w:val="20"/>
-              </w:rPr>
-              <w:t>Person1_full_name</w:t>
-            </w:r>
-          </w:p>
-        </w:tc>
-        <w:tc>
-          <w:tcPr>
-            <w:tcW w:w="1155" w:type="dxa"/>
-            <w:tcMar>
-              <w:top w:w="100" w:type="dxa"/>
-              <w:left w:w="100" w:type="dxa"/>
-              <w:bottom w:w="100" w:type="dxa"/>
-              <w:right w:w="100" w:type="dxa"/>
-            </w:tcMar>
-          </w:tcPr>
-          <w:p>
-            <w:pPr>
-              <w:pBdr>
-                <w:top w:val="nil"/>
-                <w:left w:val="nil"/>
-                <w:bottom w:val="nil"/>
-                <w:right w:val="nil"/>
-                <w:between w:val="nil"/>
-              </w:pBdr>
-              <w:rPr>
-                <w:sz w:val="20"/>
-                <w:szCs w:val="20"/>
-              </w:rPr>
-            </w:pPr>
-            <w:r>
-              <w:rPr>
-                <w:sz w:val="20"/>
-                <w:szCs w:val="20"/>
-              </w:rPr>
-              <w:t>n123456</w:t>
-            </w:r>
-          </w:p>
-        </w:tc>
-        <w:tc>
-          <w:tcPr>
-            <w:tcW w:w="3600" w:type="dxa"/>
-            <w:tcMar>
-              <w:top w:w="100" w:type="dxa"/>
-              <w:left w:w="100" w:type="dxa"/>
-              <w:bottom w:w="100" w:type="dxa"/>
-              <w:right w:w="100" w:type="dxa"/>
-            </w:tcMar>
-          </w:tcPr>
-          <w:p>
-            <w:pPr>
-              <w:pBdr>
-                <w:top w:val="nil"/>
-                <w:left w:val="nil"/>
-                <w:bottom w:val="nil"/>
-                <w:right w:val="nil"/>
-                <w:between w:val="nil"/>
-              </w:pBdr>
-              <w:rPr>
-                <w:sz w:val="20"/>
-                <w:szCs w:val="20"/>
-              </w:rPr>
-            </w:pPr>
-            <w:r>
-              <w:rPr>
-                <w:sz w:val="20"/>
-                <w:szCs w:val="20"/>
-              </w:rPr>
-              <w:t>Person_name@qut.edu.au</w:t>
-            </w:r>
-          </w:p>
-        </w:tc>
-        <w:tc>
-          <w:tcPr>
-            <w:tcW w:w="1140" w:type="dxa"/>
-            <w:tcMar>
-              <w:top w:w="100" w:type="dxa"/>
-              <w:left w:w="100" w:type="dxa"/>
-              <w:bottom w:w="100" w:type="dxa"/>
-              <w:right w:w="100" w:type="dxa"/>
-            </w:tcMar>
-          </w:tcPr>
-          <w:p>
-            <w:pPr>
-              <w:pBdr>
-                <w:top w:val="nil"/>
-                <w:left w:val="nil"/>
-                <w:bottom w:val="nil"/>
-                <w:right w:val="nil"/>
-                <w:between w:val="nil"/>
-              </w:pBdr>
-              <w:jc w:val="center"/>
-              <w:rPr>
-                <w:sz w:val="20"/>
-                <w:szCs w:val="20"/>
-              </w:rPr>
-            </w:pPr>
-            <w:r>
-              <w:rPr>
-                <w:sz w:val="20"/>
-                <w:szCs w:val="20"/>
-              </w:rPr>
-              <w:t>30</w:t>
-            </w:r>
-          </w:p>
-        </w:tc>
-      </w:tr>
-      <w:tr>
-        <w:tc>
-          <w:tcPr>
-            <w:tcW w:w="3105" w:type="dxa"/>
-            <w:tcMar>
-              <w:top w:w="100" w:type="dxa"/>
-              <w:left w:w="100" w:type="dxa"/>
-              <w:bottom w:w="100" w:type="dxa"/>
-              <w:right w:w="100" w:type="dxa"/>
-            </w:tcMar>
-          </w:tcPr>
-          <w:p>
-            <w:pPr>
-              <w:pBdr>
-                <w:top w:val="nil"/>
-                <w:left w:val="nil"/>
-                <w:bottom w:val="nil"/>
-                <w:right w:val="nil"/>
-                <w:between w:val="nil"/>
-              </w:pBdr>
-              <w:rPr>
-                <w:sz w:val="20"/>
-                <w:szCs w:val="20"/>
-              </w:rPr>
-            </w:pPr>
-            <w:r>
-              <w:rPr>
-                <w:sz w:val="20"/>
-                <w:szCs w:val="20"/>
-              </w:rPr>
-              <w:t>Person2_full_name</w:t>
-            </w:r>
-          </w:p>
-        </w:tc>
-        <w:tc>
-          <w:tcPr>
-            <w:tcW w:w="1155" w:type="dxa"/>
-            <w:tcMar>
-              <w:top w:w="100" w:type="dxa"/>
-              <w:left w:w="100" w:type="dxa"/>
-              <w:bottom w:w="100" w:type="dxa"/>
-              <w:right w:w="100" w:type="dxa"/>
-            </w:tcMar>
-          </w:tcPr>
-          <w:p>
-            <w:pPr>
-              <w:pBdr>
-                <w:top w:val="nil"/>
-                <w:left w:val="nil"/>
-                <w:bottom w:val="nil"/>
-                <w:right w:val="nil"/>
-                <w:between w:val="nil"/>
-              </w:pBdr>
-              <w:rPr>
-                <w:sz w:val="20"/>
-                <w:szCs w:val="20"/>
-              </w:rPr>
-            </w:pPr>
-            <w:r>
-              <w:rPr>
-                <w:sz w:val="20"/>
-                <w:szCs w:val="20"/>
-              </w:rPr>
-              <w:t>n123456</w:t>
-            </w:r>
-          </w:p>
-        </w:tc>
-        <w:tc>
-          <w:tcPr>
-            <w:tcW w:w="3600" w:type="dxa"/>
-            <w:tcMar>
-              <w:top w:w="100" w:type="dxa"/>
-              <w:left w:w="100" w:type="dxa"/>
-              <w:bottom w:w="100" w:type="dxa"/>
-              <w:right w:w="100" w:type="dxa"/>
-            </w:tcMar>
-          </w:tcPr>
-          <w:p>
-            <w:pPr>
-              <w:pBdr>
-                <w:top w:val="nil"/>
-                <w:left w:val="nil"/>
-                <w:bottom w:val="nil"/>
-                <w:right w:val="nil"/>
-                <w:between w:val="nil"/>
-              </w:pBdr>
-              <w:rPr>
-                <w:sz w:val="20"/>
-                <w:szCs w:val="20"/>
-              </w:rPr>
-            </w:pPr>
-            <w:r>
-              <w:rPr>
-                <w:sz w:val="20"/>
-                <w:szCs w:val="20"/>
-              </w:rPr>
-              <w:t>Person_name@qut.edu.au</w:t>
-            </w:r>
-          </w:p>
-        </w:tc>
-        <w:tc>
-          <w:tcPr>
-            <w:tcW w:w="1140" w:type="dxa"/>
-            <w:tcMar>
-              <w:top w:w="100" w:type="dxa"/>
-              <w:left w:w="100" w:type="dxa"/>
-              <w:bottom w:w="100" w:type="dxa"/>
-              <w:right w:w="100" w:type="dxa"/>
-            </w:tcMar>
-          </w:tcPr>
-          <w:p>
-            <w:pPr>
-              <w:pBdr>
-                <w:top w:val="nil"/>
-                <w:left w:val="nil"/>
-                <w:bottom w:val="nil"/>
-                <w:right w:val="nil"/>
-                <w:between w:val="nil"/>
-              </w:pBdr>
-              <w:jc w:val="center"/>
-              <w:rPr>
-                <w:sz w:val="20"/>
-                <w:szCs w:val="20"/>
-              </w:rPr>
-            </w:pPr>
-            <w:r>
-              <w:rPr>
-                <w:sz w:val="20"/>
-                <w:szCs w:val="20"/>
-              </w:rPr>
-              <w:t>30</w:t>
-            </w:r>
-          </w:p>
-        </w:tc>
-      </w:tr>
-      <w:tr>
-        <w:tc>
-          <w:tcPr>
-            <w:tcW w:w="3105" w:type="dxa"/>
-            <w:tcMar>
-              <w:top w:w="100" w:type="dxa"/>
-              <w:left w:w="100" w:type="dxa"/>
-              <w:bottom w:w="100" w:type="dxa"/>
-              <w:right w:w="100" w:type="dxa"/>
-            </w:tcMar>
-          </w:tcPr>
-          <w:p>
-            <w:pPr>
-              <w:pBdr>
-                <w:top w:val="nil"/>
-                <w:left w:val="nil"/>
-                <w:bottom w:val="nil"/>
-                <w:right w:val="nil"/>
-                <w:between w:val="nil"/>
-              </w:pBdr>
-              <w:rPr>
-                <w:sz w:val="20"/>
-                <w:szCs w:val="20"/>
-              </w:rPr>
-            </w:pPr>
-            <w:r>
-              <w:rPr>
-                <w:sz w:val="20"/>
-                <w:szCs w:val="20"/>
-              </w:rPr>
-              <w:t>Person3_full_name</w:t>
-            </w:r>
-          </w:p>
-        </w:tc>
-        <w:tc>
-          <w:tcPr>
-            <w:tcW w:w="1155" w:type="dxa"/>
-            <w:tcMar>
-              <w:top w:w="100" w:type="dxa"/>
-              <w:left w:w="100" w:type="dxa"/>
-              <w:bottom w:w="100" w:type="dxa"/>
-              <w:right w:w="100" w:type="dxa"/>
-            </w:tcMar>
-          </w:tcPr>
-          <w:p>
-            <w:pPr>
-              <w:pBdr>
-                <w:top w:val="nil"/>
-                <w:left w:val="nil"/>
-                <w:bottom w:val="nil"/>
-                <w:right w:val="nil"/>
-                <w:between w:val="nil"/>
-              </w:pBdr>
-              <w:rPr>
-                <w:sz w:val="20"/>
-                <w:szCs w:val="20"/>
-              </w:rPr>
-            </w:pPr>
-            <w:r>
-              <w:rPr>
-                <w:sz w:val="20"/>
-                <w:szCs w:val="20"/>
-              </w:rPr>
-              <w:t>n123456</w:t>
-            </w:r>
-          </w:p>
-        </w:tc>
-        <w:tc>
-          <w:tcPr>
-            <w:tcW w:w="3600" w:type="dxa"/>
-            <w:tcMar>
-              <w:top w:w="100" w:type="dxa"/>
-              <w:left w:w="100" w:type="dxa"/>
-              <w:bottom w:w="100" w:type="dxa"/>
-              <w:right w:w="100" w:type="dxa"/>
-            </w:tcMar>
-          </w:tcPr>
-          <w:p>
-            <w:pPr>
-              <w:pBdr>
-                <w:top w:val="nil"/>
-                <w:left w:val="nil"/>
-                <w:bottom w:val="nil"/>
-                <w:right w:val="nil"/>
-                <w:between w:val="nil"/>
-              </w:pBdr>
-              <w:rPr>
-                <w:sz w:val="20"/>
-                <w:szCs w:val="20"/>
-              </w:rPr>
-            </w:pPr>
-            <w:r>
-              <w:rPr>
-                <w:sz w:val="20"/>
-                <w:szCs w:val="20"/>
-              </w:rPr>
-              <w:t>Person_name@qut.edu.au</w:t>
-            </w:r>
-          </w:p>
-        </w:tc>
-        <w:tc>
-          <w:tcPr>
-            <w:tcW w:w="1140" w:type="dxa"/>
-            <w:tcMar>
-              <w:top w:w="100" w:type="dxa"/>
-              <w:left w:w="100" w:type="dxa"/>
-              <w:bottom w:w="100" w:type="dxa"/>
-              <w:right w:w="100" w:type="dxa"/>
-            </w:tcMar>
-          </w:tcPr>
-          <w:p>
-            <w:pPr>
-              <w:pBdr>
-                <w:top w:val="nil"/>
-                <w:left w:val="nil"/>
-                <w:bottom w:val="nil"/>
-                <w:right w:val="nil"/>
-                <w:between w:val="nil"/>
-              </w:pBdr>
-              <w:jc w:val="center"/>
-              <w:rPr>
-                <w:sz w:val="20"/>
-                <w:szCs w:val="20"/>
-              </w:rPr>
-            </w:pPr>
-            <w:r>
-              <w:rPr>
-                <w:sz w:val="20"/>
-                <w:szCs w:val="20"/>
-              </w:rPr>
-              <w:t>10</w:t>
-            </w:r>
-          </w:p>
-        </w:tc>
-      </w:tr>
-      <w:tr>
-        <w:tc>
-          <w:tcPr>
-            <w:tcW w:w="3105" w:type="dxa"/>
-            <w:tcMar>
-              <w:top w:w="100" w:type="dxa"/>
-              <w:left w:w="100" w:type="dxa"/>
-              <w:bottom w:w="100" w:type="dxa"/>
-              <w:right w:w="100" w:type="dxa"/>
-            </w:tcMar>
-          </w:tcPr>
-          <w:p>
-            <w:pPr>
-              <w:pBdr>
-                <w:top w:val="nil"/>
-                <w:left w:val="nil"/>
-                <w:bottom w:val="nil"/>
-                <w:right w:val="nil"/>
-                <w:between w:val="nil"/>
-              </w:pBdr>
-              <w:rPr>
-                <w:sz w:val="20"/>
-                <w:szCs w:val="20"/>
-              </w:rPr>
-            </w:pPr>
-            <w:r>
-              <w:rPr>
-                <w:sz w:val="20"/>
-                <w:szCs w:val="20"/>
-              </w:rPr>
-              <w:t>Person4_full_name</w:t>
-            </w:r>
-          </w:p>
-        </w:tc>
-        <w:tc>
-          <w:tcPr>
-            <w:tcW w:w="1155" w:type="dxa"/>
-            <w:tcMar>
-              <w:top w:w="100" w:type="dxa"/>
-              <w:left w:w="100" w:type="dxa"/>
-              <w:bottom w:w="100" w:type="dxa"/>
-              <w:right w:w="100" w:type="dxa"/>
-            </w:tcMar>
-          </w:tcPr>
-          <w:p>
-            <w:pPr>
-              <w:pBdr>
-                <w:top w:val="nil"/>
-                <w:left w:val="nil"/>
-                <w:bottom w:val="nil"/>
-                <w:right w:val="nil"/>
-                <w:between w:val="nil"/>
-              </w:pBdr>
-              <w:rPr>
-                <w:sz w:val="20"/>
-                <w:szCs w:val="20"/>
-              </w:rPr>
-            </w:pPr>
-            <w:r>
-              <w:rPr>
-                <w:sz w:val="20"/>
-                <w:szCs w:val="20"/>
-              </w:rPr>
-              <w:t>n123456</w:t>
-            </w:r>
-          </w:p>
-        </w:tc>
-        <w:tc>
-          <w:tcPr>
-            <w:tcW w:w="3600" w:type="dxa"/>
-            <w:tcMar>
-              <w:top w:w="100" w:type="dxa"/>
-              <w:left w:w="100" w:type="dxa"/>
-              <w:bottom w:w="100" w:type="dxa"/>
-              <w:right w:w="100" w:type="dxa"/>
-            </w:tcMar>
-          </w:tcPr>
-          <w:p>
-            <w:pPr>
-              <w:pBdr>
-                <w:top w:val="nil"/>
-                <w:left w:val="nil"/>
-                <w:bottom w:val="nil"/>
-                <w:right w:val="nil"/>
-                <w:between w:val="nil"/>
-              </w:pBdr>
-              <w:rPr>
-                <w:sz w:val="20"/>
-                <w:szCs w:val="20"/>
-              </w:rPr>
-            </w:pPr>
-            <w:r>
-              <w:rPr>
-                <w:sz w:val="20"/>
-                <w:szCs w:val="20"/>
-              </w:rPr>
-              <w:t>Person_name@qut.edu.au</w:t>
-            </w:r>
-          </w:p>
-        </w:tc>
-        <w:tc>
-          <w:tcPr>
-            <w:tcW w:w="1140" w:type="dxa"/>
-            <w:tcMar>
-              <w:top w:w="100" w:type="dxa"/>
-              <w:left w:w="100" w:type="dxa"/>
-              <w:bottom w:w="100" w:type="dxa"/>
-              <w:right w:w="100" w:type="dxa"/>
-            </w:tcMar>
-          </w:tcPr>
-          <w:p>
-            <w:pPr>
-              <w:pBdr>
-                <w:top w:val="nil"/>
-                <w:left w:val="nil"/>
-                <w:bottom w:val="nil"/>
-                <w:right w:val="nil"/>
-                <w:between w:val="nil"/>
-              </w:pBdr>
-              <w:jc w:val="center"/>
-              <w:rPr>
-                <w:sz w:val="20"/>
-                <w:szCs w:val="20"/>
-              </w:rPr>
-            </w:pPr>
-            <w:r>
-              <w:rPr>
-                <w:sz w:val="20"/>
-                <w:szCs w:val="20"/>
-              </w:rPr>
-              <w:t>30</w:t>
-            </w:r>
-          </w:p>
-        </w:tc>
-      </w:tr>
-      <w:tr>
-        <w:tc>
-          <w:tcPr>
-            <w:tcW w:w="3105" w:type="dxa"/>
-            <w:tcMar>
-              <w:top w:w="100" w:type="dxa"/>
-              <w:left w:w="100" w:type="dxa"/>
-              <w:bottom w:w="100" w:type="dxa"/>
-              <w:right w:w="100" w:type="dxa"/>
-            </w:tcMar>
-          </w:tcPr>
-          <w:p>
-            <w:pPr>
-              <w:pBdr>
-                <w:top w:val="nil"/>
-                <w:left w:val="nil"/>
-                <w:bottom w:val="nil"/>
-                <w:right w:val="nil"/>
-                <w:between w:val="nil"/>
-              </w:pBdr>
-              <w:rPr>
-                <w:sz w:val="20"/>
-                <w:szCs w:val="20"/>
-              </w:rPr>
-            </w:pPr>
-          </w:p>
-        </w:tc>
-        <w:tc>
-          <w:tcPr>
-            <w:tcW w:w="1155" w:type="dxa"/>
-            <w:tcMar>
-              <w:top w:w="100" w:type="dxa"/>
-              <w:left w:w="100" w:type="dxa"/>
-              <w:bottom w:w="100" w:type="dxa"/>
-              <w:right w:w="100" w:type="dxa"/>
-            </w:tcMar>
-          </w:tcPr>
-          <w:p>
-            <w:pPr>
-              <w:pBdr>
-                <w:top w:val="nil"/>
-                <w:left w:val="nil"/>
-                <w:bottom w:val="nil"/>
-                <w:right w:val="nil"/>
-                <w:between w:val="nil"/>
-              </w:pBdr>
-              <w:rPr>
-                <w:sz w:val="20"/>
-                <w:szCs w:val="20"/>
-              </w:rPr>
-            </w:pPr>
-          </w:p>
-        </w:tc>
-        <w:tc>
-          <w:tcPr>
-            <w:tcW w:w="3600" w:type="dxa"/>
-            <w:tcMar>
-              <w:top w:w="100" w:type="dxa"/>
-              <w:left w:w="100" w:type="dxa"/>
-              <w:bottom w:w="100" w:type="dxa"/>
-              <w:right w:w="100" w:type="dxa"/>
-            </w:tcMar>
-          </w:tcPr>
-          <w:p>
-            <w:pPr>
-              <w:pBdr>
-                <w:top w:val="nil"/>
-                <w:left w:val="nil"/>
-                <w:bottom w:val="nil"/>
-                <w:right w:val="nil"/>
-                <w:between w:val="nil"/>
-              </w:pBdr>
-              <w:rPr>
-                <w:sz w:val="20"/>
-                <w:szCs w:val="20"/>
-              </w:rPr>
-            </w:pPr>
-          </w:p>
-        </w:tc>
-        <w:tc>
-          <w:tcPr>
-            <w:tcW w:w="1140" w:type="dxa"/>
-            <w:tcMar>
-              <w:top w:w="100" w:type="dxa"/>
-              <w:left w:w="100" w:type="dxa"/>
-              <w:bottom w:w="100" w:type="dxa"/>
-              <w:right w:w="100" w:type="dxa"/>
-            </w:tcMar>
-          </w:tcPr>
-          <w:p>
-            <w:pPr>
-              <w:pBdr>
-                <w:top w:val="nil"/>
-                <w:left w:val="nil"/>
-                <w:bottom w:val="nil"/>
-                <w:right w:val="nil"/>
-                <w:between w:val="nil"/>
-              </w:pBdr>
-              <w:jc w:val="center"/>
-              <w:rPr>
-                <w:sz w:val="20"/>
-                <w:szCs w:val="20"/>
-              </w:rPr>
-            </w:pPr>
-          </w:p>
-        </w:tc>
-      </w:tr>
-      <w:tr>
-        <w:trPr>
-          <w:trHeight w:val="400"/>
-        </w:trPr>
-        <w:tc>
-          <w:tcPr>
-            <w:tcW w:w="7860" w:type="dxa"/>
-            <w:gridSpan w:val="3"/>
-            <w:shd w:val="clear" w:color="auto" w:fill="660000"/>
-            <w:tcMar>
-              <w:top w:w="100" w:type="dxa"/>
-              <w:left w:w="100" w:type="dxa"/>
-              <w:bottom w:w="100" w:type="dxa"/>
-              <w:right w:w="100" w:type="dxa"/>
-            </w:tcMar>
-          </w:tcPr>
-          <w:p>
-            <w:pPr>
-              <w:pBdr>
-                <w:top w:val="nil"/>
-                <w:left w:val="nil"/>
-                <w:bottom w:val="nil"/>
-                <w:right w:val="nil"/>
-                <w:between w:val="nil"/>
-              </w:pBdr>
-              <w:jc w:val="right"/>
-              <w:rPr>
-                <w:color w:val="FFFFFF"/>
-              </w:rPr>
-            </w:pPr>
-            <w:r>
-              <w:rPr>
-                <w:color w:val="FFFFFF"/>
-              </w:rPr>
-              <w:t>Total must equal:</w:t>
-            </w:r>
-          </w:p>
-        </w:tc>
-        <w:tc>
-          <w:tcPr>
-            <w:tcW w:w="1140" w:type="dxa"/>
-            <w:shd w:val="clear" w:color="auto" w:fill="660000"/>
-            <w:tcMar>
-              <w:top w:w="100" w:type="dxa"/>
-              <w:left w:w="100" w:type="dxa"/>
-              <w:bottom w:w="100" w:type="dxa"/>
-              <w:right w:w="100" w:type="dxa"/>
-            </w:tcMar>
-          </w:tcPr>
-          <w:p>
-            <w:pPr>
-              <w:pBdr>
-                <w:top w:val="nil"/>
-                <w:left w:val="nil"/>
-                <w:bottom w:val="nil"/>
-                <w:right w:val="nil"/>
-                <w:between w:val="nil"/>
-              </w:pBdr>
-              <w:jc w:val="center"/>
-              <w:rPr>
-                <w:color w:val="FFFFFF"/>
-              </w:rPr>
-            </w:pPr>
-            <w:r>
-              <w:rPr>
-                <w:color w:val="FFFFFF"/>
-              </w:rPr>
-              <w:t>100</w:t>
-            </w:r>
-          </w:p>
-        </w:tc>
-      </w:tr>
-      <w:tr>
-        <w:trPr>
-          <w:trHeight w:val="400"/>
-        </w:trPr>
-        <w:tc>
-          <w:tcPr>
-            <w:tcW w:w="9000" w:type="dxa"/>
-            <w:gridSpan w:val="4"/>
-            <w:tcMar>
-              <w:top w:w="100" w:type="dxa"/>
-              <w:left w:w="100" w:type="dxa"/>
-              <w:bottom w:w="100" w:type="dxa"/>
-              <w:right w:w="100" w:type="dxa"/>
-            </w:tcMar>
-          </w:tcPr>
-          <w:p>
-            <w:pPr>
-              <w:pBdr>
-                <w:top w:val="nil"/>
-                <w:left w:val="nil"/>
-                <w:bottom w:val="nil"/>
-                <w:right w:val="nil"/>
-                <w:between w:val="nil"/>
-              </w:pBdr>
-              <w:rPr>
-                <w:sz w:val="20"/>
-                <w:szCs w:val="20"/>
-              </w:rPr>
-            </w:pPr>
-            <w:r>
-              <w:rPr>
-                <w:sz w:val="20"/>
-                <w:szCs w:val="20"/>
-              </w:rPr>
-              <w:t>As the submitter of this assignment, I confirm that the above percentage distribution was agreed by [</w:t>
-            </w:r>
-            <w:r>
-              <w:rPr>
-                <w:b/>
-                <w:sz w:val="20"/>
-                <w:szCs w:val="20"/>
-              </w:rPr>
-              <w:t>all</w:t>
-            </w:r>
-            <w:r>
-              <w:rPr>
-                <w:sz w:val="20"/>
-                <w:szCs w:val="20"/>
-              </w:rPr>
-              <w:t xml:space="preserve"> / </w:t>
-            </w:r>
-            <w:r>
-              <w:rPr>
-                <w:b/>
-                <w:sz w:val="20"/>
-                <w:szCs w:val="20"/>
-              </w:rPr>
-              <w:t>the majority</w:t>
-            </w:r>
-            <w:r>
-              <w:rPr>
-                <w:sz w:val="20"/>
-                <w:szCs w:val="20"/>
-              </w:rPr>
-              <w:t xml:space="preserve"> (correct as appropriate)] of the team members by way of collective negotiation.</w:t>
-            </w:r>
-          </w:p>
-        </w:tc>
-      </w:tr>
-      <w:tr>
-        <w:trPr>
-          <w:trHeight w:val="400"/>
-        </w:trPr>
-        <w:tc>
-          <w:tcPr>
-            <w:tcW w:w="9000" w:type="dxa"/>
-            <w:gridSpan w:val="4"/>
-            <w:tcMar>
-              <w:top w:w="100" w:type="dxa"/>
-              <w:left w:w="100" w:type="dxa"/>
-              <w:bottom w:w="100" w:type="dxa"/>
-              <w:right w:w="100" w:type="dxa"/>
-            </w:tcMar>
-          </w:tcPr>
-          <w:p>
-            <w:pPr>
-              <w:pBdr>
-                <w:top w:val="nil"/>
-                <w:left w:val="nil"/>
-                <w:bottom w:val="nil"/>
-                <w:right w:val="nil"/>
-                <w:between w:val="nil"/>
-              </w:pBdr>
-              <w:rPr>
-                <w:sz w:val="20"/>
-                <w:szCs w:val="20"/>
-              </w:rPr>
-            </w:pPr>
-            <w:r>
-              <w:rPr>
-                <w:sz w:val="20"/>
-                <w:szCs w:val="20"/>
-              </w:rPr>
-              <w:t>Additional comments from any team member (list as full name: comment):</w:t>
-            </w:r>
-          </w:p>
-        </w:tc>
-      </w:tr>
-    </w:tbl>
-    <w:p>
-      <w:pPr>
-        <w:pBdr>
-          <w:top w:val="nil"/>
-          <w:left w:val="nil"/>
-          <w:bottom w:val="nil"/>
-          <w:right w:val="nil"/>
-          <w:between w:val="nil"/>
-        </w:pBdr>
-        <w:rPr>
-          <w:i/>
-        </w:rPr>
-      </w:pPr>
-      <w:r>
-        <w:rPr>
-          <w:i/>
-        </w:rPr>
-        <w:t>In the example above: person 3 contributed less than the others in a 4 person team.</w:t>
-      </w:r>
-    </w:p>
-    <w:p>
-      <w:pPr>
-        <w:rPr>
-          <w:rStyle w:val="Strong"/>
-          <w:rFonts w:ascii="Segoe UI" w:eastAsiaTheme="majorEastAsia" w:hAnsi="Segoe UI" w:cs="Segoe UI"/>
-          <w:b w:val="0"/>
-          <w:bCs w:val="0"/>
-          <w:color w:val="404040"/>
-          <w:sz w:val="32"/>
-          <w:szCs w:val="32"/>
-        </w:rPr>
-      </w:pPr>
-      <w:r>
-        <w:rPr>
-          <w:rFonts w:ascii="Segoe UI" w:hAnsi="Segoe UI" w:cs="Segoe UI"/>
-          <w:color w:val="404040"/>
-        </w:rPr>
-        <w:br/>
-      </w:r>
-    </w:p>
-    <w:p>
-      <w:pPr>
-        <w:rPr>
-          <w:rStyle w:val="Strong"/>
-          <w:rFonts w:ascii="Segoe UI" w:eastAsiaTheme="majorEastAsia" w:hAnsi="Segoe UI" w:cs="Segoe UI"/>
-          <w:b w:val="0"/>
-          <w:bCs w:val="0"/>
-          <w:color w:val="404040"/>
-          <w:sz w:val="32"/>
-          <w:szCs w:val="32"/>
-        </w:rPr>
-      </w:pPr>
-    </w:p>
-    <w:p>
-      <w:pPr>
-        <w:rPr>
-          <w:rStyle w:val="Strong"/>
-          <w:rFonts w:ascii="Segoe UI" w:eastAsiaTheme="majorEastAsia" w:hAnsi="Segoe UI" w:cs="Segoe UI"/>
-          <w:b w:val="0"/>
-          <w:bCs w:val="0"/>
-          <w:color w:val="404040"/>
-          <w:sz w:val="32"/>
-          <w:szCs w:val="32"/>
-        </w:rPr>
-      </w:pPr>
-    </w:p>
-    <w:p>
-      <w:pPr>
-        <w:pBdr>
-          <w:top w:val="nil"/>
-          <w:left w:val="nil"/>
-          <w:bottom w:val="nil"/>
-          <w:right w:val="nil"/>
-          <w:between w:val="nil"/>
-        </w:pBdr>
         <w:rPr>
           <w:rStyle w:val="Strong"/>
           <w:rFonts w:ascii="Segoe UI" w:eastAsiaTheme="majorEastAsia" w:hAnsi="Segoe UI" w:cs="Segoe UI"/>
@@ -2783,15 +1233,7 @@
             <w:tcW w:w="2122" w:type="dxa"/>
           </w:tcPr>
           <w:p>
-            <w:pPr>
-              <w:rPr>
-                <w:color w:val="0070C0"/>
-              </w:rPr>
-            </w:pPr>
             <w:r>
-              <w:rPr>
-                <w:color w:val="0070C0"/>
-              </w:rPr>
               <w:t>Magnus Jackson</w:t>
             </w:r>
           </w:p>
@@ -2801,21 +1243,18 @@
             <w:tcW w:w="6894" w:type="dxa"/>
           </w:tcPr>
           <w:p>
-            <w:pPr>
-              <w:rPr>
-                <w:color w:val="0070C0"/>
-              </w:rPr>
-            </w:pPr>
             <w:r>
-              <w:rPr>
-                <w:color w:val="0070C0"/>
-              </w:rPr>
-              <w:t xml:space="preserve">I managed the project. I handled creating and maintaining the Github, creating and managing the agile and scrum management. I created the initial project which included integrating sessions, login, hashing, and SQL setup. </w:t>
+              <w:t xml:space="preserve">I managed the project. I handled creating and maintaining the </w:t>
+            </w:r>
+            <w:proofErr w:type="spellStart"/>
+            <w:r>
+              <w:t>Github</w:t>
+            </w:r>
+            <w:proofErr w:type="spellEnd"/>
+            <w:r>
+              <w:t xml:space="preserve">, creating and managing the agile and scrum management. I created the initial project which included integrating sessions, login, hashing, and SQL setup. </w:t>
             </w:r>
             <w:r>
-              <w:rPr>
-                <w:color w:val="0070C0"/>
-              </w:rPr>
               <w:t>On top of this I developed the history page, landing page, comments functionality, and performed bug fixes. Additionally, I deployed and updated the python anywhere server.</w:t>
             </w:r>
           </w:p>
@@ -2827,16 +1266,8 @@
             <w:tcW w:w="2122" w:type="dxa"/>
           </w:tcPr>
           <w:p>
-            <w:pPr>
-              <w:rPr>
-                <w:color w:val="0070C0"/>
-              </w:rPr>
-            </w:pPr>
             <w:r>
-              <w:rPr>
-                <w:color w:val="0070C0"/>
-              </w:rPr>
-              <w:t>Full name of team member 2</w:t>
+              <w:t>Liam Johns</w:t>
             </w:r>
           </w:p>
         </w:tc>
@@ -2845,16 +1276,8 @@
             <w:tcW w:w="6894" w:type="dxa"/>
           </w:tcPr>
           <w:p>
-            <w:pPr>
-              <w:rPr>
-                <w:color w:val="0070C0"/>
-              </w:rPr>
-            </w:pPr>
             <w:r>
-              <w:rPr>
-                <w:color w:val="0070C0"/>
-              </w:rPr>
-              <w:t>(Contribution statement)</w:t>
+              <w:t>I worked primarily on the main concert database, getting that setup and wired through all the different pages after the front end had its prototype. I continued working on other back-end projects including the extended acknowledgement to country and some forms. The remain contributions were minor or bug fixes.</w:t>
             </w:r>
           </w:p>
         </w:tc>
@@ -2897,44 +1320,6 @@
           </w:p>
         </w:tc>
       </w:tr>
-      <w:tr>
-        <w:tc>
-          <w:tcPr>
-            <w:tcW w:w="2122" w:type="dxa"/>
-          </w:tcPr>
-          <w:p>
-            <w:pPr>
-              <w:rPr>
-                <w:color w:val="0070C0"/>
-              </w:rPr>
-            </w:pPr>
-            <w:r>
-              <w:rPr>
-                <w:color w:val="0070C0"/>
-              </w:rPr>
-              <w:t>Full name of team member 4</w:t>
-            </w:r>
-          </w:p>
-        </w:tc>
-        <w:tc>
-          <w:tcPr>
-            <w:tcW w:w="6894" w:type="dxa"/>
-          </w:tcPr>
-          <w:p>
-            <w:pPr>
-              <w:rPr>
-                <w:color w:val="0070C0"/>
-              </w:rPr>
-            </w:pPr>
-            <w:r>
-              <w:rPr>
-                <w:color w:val="0070C0"/>
-              </w:rPr>
-              <w:t>(Contribution statement)</w:t>
-            </w:r>
-          </w:p>
-        </w:tc>
-      </w:tr>
     </w:tbl>
     <w:p>
       <w:pPr>
@@ -3033,7 +1418,33 @@
           <w:sz w:val="32"/>
           <w:szCs w:val="32"/>
         </w:rPr>
-        <w:t>git shortlog &gt; output.txt</w:t>
+        <w:t xml:space="preserve">git </w:t>
+      </w:r>
+      <w:proofErr w:type="spellStart"/>
+      <w:r>
+        <w:rPr>
+          <w:rStyle w:val="Strong"/>
+          <w:rFonts w:ascii="Segoe UI" w:eastAsiaTheme="majorEastAsia" w:hAnsi="Segoe UI" w:cs="Segoe UI"/>
+          <w:b w:val="0"/>
+          <w:bCs w:val="0"/>
+          <w:color w:val="404040"/>
+          <w:sz w:val="32"/>
+          <w:szCs w:val="32"/>
+        </w:rPr>
+        <w:t>shortlog</w:t>
+      </w:r>
+      <w:proofErr w:type="spellEnd"/>
+      <w:r>
+        <w:rPr>
+          <w:rStyle w:val="Strong"/>
+          <w:rFonts w:ascii="Segoe UI" w:eastAsiaTheme="majorEastAsia" w:hAnsi="Segoe UI" w:cs="Segoe UI"/>
+          <w:b w:val="0"/>
+          <w:bCs w:val="0"/>
+          <w:color w:val="404040"/>
+          <w:sz w:val="32"/>
+          <w:szCs w:val="32"/>
+        </w:rPr>
+        <w:t xml:space="preserve"> &gt; output.txt</w:t>
       </w:r>
     </w:p>
     <w:p>
@@ -3066,13 +1477,41 @@
         <w:rPr>
           <w:color w:val="0070C0"/>
         </w:rPr>
-        <w:t xml:space="preserve">Paste git shortlog output here. </w:t>
-      </w:r>
+        <w:t xml:space="preserve">Paste git </w:t>
+      </w:r>
+      <w:proofErr w:type="spellStart"/>
       <w:r>
         <w:rPr>
           <w:color w:val="0070C0"/>
         </w:rPr>
-        <w:t>The git shortlog command provides a summarised view of the git log output, useful for release announcements and reporting. It groups commits by author and displays the first line of each commit message, offering a quick overview of contributors' work. This will help the marker confirm who has worked on what.</w:t>
+        <w:t>shortlog</w:t>
+      </w:r>
+      <w:proofErr w:type="spellEnd"/>
+      <w:r>
+        <w:rPr>
+          <w:color w:val="0070C0"/>
+        </w:rPr>
+        <w:t xml:space="preserve"> output here. </w:t>
+      </w:r>
+      <w:r>
+        <w:rPr>
+          <w:color w:val="0070C0"/>
+        </w:rPr>
+        <w:t xml:space="preserve">The git </w:t>
+      </w:r>
+      <w:proofErr w:type="spellStart"/>
+      <w:r>
+        <w:rPr>
+          <w:color w:val="0070C0"/>
+        </w:rPr>
+        <w:t>shortlog</w:t>
+      </w:r>
+      <w:proofErr w:type="spellEnd"/>
+      <w:r>
+        <w:rPr>
+          <w:color w:val="0070C0"/>
+        </w:rPr>
+        <w:t xml:space="preserve"> command provides a summarised view of the git log output, useful for release announcements and reporting. It groups commits by author and displays the first line of each commit message, offering a quick overview of contributors' work. This will help the marker confirm who has worked on what.</w:t>
       </w:r>
     </w:p>
     <w:p>
@@ -3766,7 +2205,21 @@
         <w:rPr>
           <w:lang w:val="en-US"/>
         </w:rPr>
-        <w:t xml:space="preserve"> you gave to the AI (e.g. "Improve the grammar and spelling in the attached document without changing any of the meaning").</w:t>
+        <w:t xml:space="preserve"> you gave to the AI (e.g. "Improve the grammar and spelling in the attached document without changing any of the </w:t>
+      </w:r>
+      <w:proofErr w:type="gramStart"/>
+      <w:r>
+        <w:rPr>
+          <w:lang w:val="en-US"/>
+        </w:rPr>
+        <w:t>meaning</w:t>
+      </w:r>
+      <w:proofErr w:type="gramEnd"/>
+      <w:r>
+        <w:rPr>
+          <w:lang w:val="en-US"/>
+        </w:rPr>
+        <w:t>").</w:t>
       </w:r>
     </w:p>
     <w:p>
@@ -3983,7 +2436,7 @@
         </w:tc>
         <w:tc>
           <w:tcPr>
-            <w:tcW w:w="973" w:type="dxa"/>
+            <w:tcW w:w="1051" w:type="dxa"/>
           </w:tcPr>
           <w:p>
             <w:pPr>
@@ -4005,7 +2458,7 @@
         </w:tc>
         <w:tc>
           <w:tcPr>
-            <w:tcW w:w="6894" w:type="dxa"/>
+            <w:tcW w:w="6816" w:type="dxa"/>
           </w:tcPr>
           <w:p>
             <w:pPr>
@@ -4047,7 +2500,7 @@
         </w:tc>
         <w:tc>
           <w:tcPr>
-            <w:tcW w:w="973" w:type="dxa"/>
+            <w:tcW w:w="1051" w:type="dxa"/>
           </w:tcPr>
           <w:p>
             <w:pPr>
@@ -4065,7 +2518,7 @@
         </w:tc>
         <w:tc>
           <w:tcPr>
-            <w:tcW w:w="6894" w:type="dxa"/>
+            <w:tcW w:w="6816" w:type="dxa"/>
           </w:tcPr>
           <w:p>
             <w:pPr>
@@ -4088,14 +2541,63 @@
           </w:p>
         </w:tc>
       </w:tr>
+      <w:tr>
+        <w:tc>
+          <w:tcPr>
+            <w:tcW w:w="1149" w:type="dxa"/>
+          </w:tcPr>
+          <w:p>
+            <w:pPr>
+              <w:rPr>
+                <w:color w:val="0070C0"/>
+              </w:rPr>
+            </w:pPr>
+            <w:r>
+              <w:rPr>
+                <w:color w:val="0070C0"/>
+              </w:rPr>
+              <w:t>4/06/26</w:t>
+            </w:r>
+          </w:p>
+        </w:tc>
+        <w:tc>
+          <w:tcPr>
+            <w:tcW w:w="1051" w:type="dxa"/>
+          </w:tcPr>
+          <w:p>
+            <w:pPr>
+              <w:rPr>
+                <w:color w:val="0070C0"/>
+              </w:rPr>
+            </w:pPr>
+            <w:r>
+              <w:rPr>
+                <w:color w:val="0070C0"/>
+              </w:rPr>
+              <w:t>V2</w:t>
+            </w:r>
+          </w:p>
+        </w:tc>
+        <w:tc>
+          <w:tcPr>
+            <w:tcW w:w="6816" w:type="dxa"/>
+          </w:tcPr>
+          <w:p>
+            <w:pPr>
+              <w:rPr>
+                <w:color w:val="0070C0"/>
+              </w:rPr>
+            </w:pPr>
+            <w:r>
+              <w:rPr>
+                <w:color w:val="0070C0"/>
+              </w:rPr>
+              <w:t>Second version – Added Liam’s details</w:t>
+            </w:r>
+          </w:p>
+        </w:tc>
+      </w:tr>
     </w:tbl>
-    <w:p>
-      <w:pPr>
-        <w:rPr>
-          <w:color w:val="0070C0"/>
-        </w:rPr>
-      </w:pPr>
-    </w:p>
     <w:p>
       <w:pPr>
         <w:rPr>
@@ -5446,6 +3948,7 @@
   <w:style w:type="character" w:default="1" w:styleId="DefaultParagraphFont">
     <w:name w:val="Default Paragraph Font"/>
     <w:uiPriority w:val="1"/>
+    <w:semiHidden/>
     <w:unhideWhenUsed/>
   </w:style>
   <w:style w:type="table" w:default="1" w:styleId="TableNormal">

</xml_diff>

<commit_message>
Added liams assignment dec to doc. Added alerts to login and create event. Fixed issue with price not allowing 0 dollars, fixed issue with date not throwing the correct error when missing
</commit_message>
<xml_diff>
--- a/Assignment declaration.docx
+++ b/Assignment declaration.docx
@@ -835,7 +835,10 @@
               </w:pBdr>
             </w:pPr>
             <w:r>
-              <w:t>N11583487</w:t>
+              <w:t>n</w:t>
+            </w:r>
+            <w:r>
+              <w:t>11583487</w:t>
             </w:r>
           </w:p>
         </w:tc>
@@ -977,6 +980,9 @@
                 <w:between w:val="nil"/>
               </w:pBdr>
             </w:pPr>
+            <w:r>
+              <w:t>Liam Johns</w:t>
+            </w:r>
           </w:p>
         </w:tc>
         <w:tc>
@@ -1000,6 +1006,12 @@
                 <w:between w:val="nil"/>
               </w:pBdr>
             </w:pPr>
+            <w:r>
+              <w:t>n</w:t>
+            </w:r>
+            <w:r>
+              <w:t>11611332</w:t>
+            </w:r>
           </w:p>
         </w:tc>
         <w:tc>
@@ -1023,148 +1035,9 @@
                 <w:between w:val="nil"/>
               </w:pBdr>
             </w:pPr>
-          </w:p>
-        </w:tc>
-      </w:tr>
-      <w:tr>
-        <w:tc>
-          <w:tcPr>
-            <w:tcW w:w="2825" w:type="dxa"/>
-            <w:tcMar>
-              <w:top w:w="100" w:type="dxa"/>
-              <w:left w:w="100" w:type="dxa"/>
-              <w:bottom w:w="100" w:type="dxa"/>
-              <w:right w:w="100" w:type="dxa"/>
-            </w:tcMar>
-          </w:tcPr>
-          <w:p>
-            <w:pPr>
-              <w:widowControl w:val="0"/>
-              <w:pBdr>
-                <w:top w:val="nil"/>
-                <w:left w:val="nil"/>
-                <w:bottom w:val="nil"/>
-                <w:right w:val="nil"/>
-                <w:between w:val="nil"/>
-              </w:pBdr>
-            </w:pPr>
-          </w:p>
-        </w:tc>
-        <w:tc>
-          <w:tcPr>
-            <w:tcW w:w="1615" w:type="dxa"/>
-            <w:tcMar>
-              <w:top w:w="100" w:type="dxa"/>
-              <w:left w:w="100" w:type="dxa"/>
-              <w:bottom w:w="100" w:type="dxa"/>
-              <w:right w:w="100" w:type="dxa"/>
-            </w:tcMar>
-          </w:tcPr>
-          <w:p>
-            <w:pPr>
-              <w:widowControl w:val="0"/>
-              <w:pBdr>
-                <w:top w:val="nil"/>
-                <w:left w:val="nil"/>
-                <w:bottom w:val="nil"/>
-                <w:right w:val="nil"/>
-                <w:between w:val="nil"/>
-              </w:pBdr>
-            </w:pPr>
-          </w:p>
-        </w:tc>
-        <w:tc>
-          <w:tcPr>
-            <w:tcW w:w="4575" w:type="dxa"/>
-            <w:tcMar>
-              <w:top w:w="100" w:type="dxa"/>
-              <w:left w:w="100" w:type="dxa"/>
-              <w:bottom w:w="100" w:type="dxa"/>
-              <w:right w:w="100" w:type="dxa"/>
-            </w:tcMar>
-          </w:tcPr>
-          <w:p>
-            <w:pPr>
-              <w:widowControl w:val="0"/>
-              <w:pBdr>
-                <w:top w:val="nil"/>
-                <w:left w:val="nil"/>
-                <w:bottom w:val="nil"/>
-                <w:right w:val="nil"/>
-                <w:between w:val="nil"/>
-              </w:pBdr>
-            </w:pPr>
-          </w:p>
-        </w:tc>
-      </w:tr>
-      <w:tr>
-        <w:tc>
-          <w:tcPr>
-            <w:tcW w:w="2825" w:type="dxa"/>
-            <w:tcMar>
-              <w:top w:w="100" w:type="dxa"/>
-              <w:left w:w="100" w:type="dxa"/>
-              <w:bottom w:w="100" w:type="dxa"/>
-              <w:right w:w="100" w:type="dxa"/>
-            </w:tcMar>
-          </w:tcPr>
-          <w:p>
-            <w:pPr>
-              <w:widowControl w:val="0"/>
-              <w:pBdr>
-                <w:top w:val="nil"/>
-                <w:left w:val="nil"/>
-                <w:bottom w:val="nil"/>
-                <w:right w:val="nil"/>
-                <w:between w:val="nil"/>
-              </w:pBdr>
-            </w:pPr>
-          </w:p>
-        </w:tc>
-        <w:tc>
-          <w:tcPr>
-            <w:tcW w:w="1615" w:type="dxa"/>
-            <w:tcMar>
-              <w:top w:w="100" w:type="dxa"/>
-              <w:left w:w="100" w:type="dxa"/>
-              <w:bottom w:w="100" w:type="dxa"/>
-              <w:right w:w="100" w:type="dxa"/>
-            </w:tcMar>
-          </w:tcPr>
-          <w:p>
-            <w:pPr>
-              <w:widowControl w:val="0"/>
-              <w:pBdr>
-                <w:top w:val="nil"/>
-                <w:left w:val="nil"/>
-                <w:bottom w:val="nil"/>
-                <w:right w:val="nil"/>
-                <w:between w:val="nil"/>
-              </w:pBdr>
-            </w:pPr>
-          </w:p>
-        </w:tc>
-        <w:tc>
-          <w:tcPr>
-            <w:tcW w:w="4575" w:type="dxa"/>
-            <w:tcMar>
-              <w:top w:w="100" w:type="dxa"/>
-              <w:left w:w="100" w:type="dxa"/>
-              <w:bottom w:w="100" w:type="dxa"/>
-              <w:right w:w="100" w:type="dxa"/>
-            </w:tcMar>
-          </w:tcPr>
-          <w:p>
-            <w:pPr>
-              <w:widowControl w:val="0"/>
-              <w:pBdr>
-                <w:top w:val="nil"/>
-                <w:left w:val="nil"/>
-                <w:bottom w:val="nil"/>
-                <w:right w:val="nil"/>
-                <w:between w:val="nil"/>
-              </w:pBdr>
-            </w:pPr>
+            <w:r>
+              <w:t>n11611332@qut.edu.au</w:t>
+            </w:r>
           </w:p>
         </w:tc>
       </w:tr>
@@ -1392,15 +1265,7 @@
             <w:tcW w:w="2122" w:type="dxa"/>
           </w:tcPr>
           <w:p>
-            <w:pPr>
-              <w:rPr>
-                <w:color w:val="0070C0"/>
-              </w:rPr>
-            </w:pPr>
-            <w:r>
-              <w:rPr>
-                <w:color w:val="0070C0"/>
-              </w:rPr>
+            <w:r>
               <w:t>Magnus Jackson</w:t>
             </w:r>
           </w:p>
@@ -1410,21 +1275,16 @@
             <w:tcW w:w="6894" w:type="dxa"/>
           </w:tcPr>
           <w:p>
-            <w:pPr>
-              <w:rPr>
-                <w:color w:val="0070C0"/>
-              </w:rPr>
-            </w:pPr>
-            <w:r>
-              <w:rPr>
-                <w:color w:val="0070C0"/>
-              </w:rPr>
-              <w:t xml:space="preserve">I managed the project. I handled creating and maintaining the Github, creating and managing the agile and scrum management. I created the initial project which included integrating sessions, login, hashing, and SQL setup. </w:t>
-            </w:r>
-            <w:r>
-              <w:rPr>
-                <w:color w:val="0070C0"/>
-              </w:rPr>
+            <w:r>
+              <w:t xml:space="preserve">I managed the project. I handled creating and maintaining the </w:t>
+            </w:r>
+            <w:r>
+              <w:t>GitHub</w:t>
+            </w:r>
+            <w:r>
+              <w:t xml:space="preserve">, creating and managing the agile and scrum management. I created the initial project which included integrating sessions, login, hashing, and SQL setup. </w:t>
+            </w:r>
+            <w:r>
               <w:t>On top of this I developed the history page, landing page, comments functionality, and performed bug fixes. Additionally, I deployed and updated the python anywhere server.</w:t>
             </w:r>
           </w:p>
@@ -1436,15 +1296,7 @@
             <w:tcW w:w="2122" w:type="dxa"/>
           </w:tcPr>
           <w:p>
-            <w:pPr>
-              <w:rPr>
-                <w:color w:val="0070C0"/>
-              </w:rPr>
-            </w:pPr>
-            <w:r>
-              <w:rPr>
-                <w:color w:val="0070C0"/>
-              </w:rPr>
+            <w:r>
               <w:t>Ryan Morris</w:t>
             </w:r>
           </w:p>
@@ -1454,22 +1306,8 @@
             <w:tcW w:w="6894" w:type="dxa"/>
           </w:tcPr>
           <w:p>
-            <w:pPr>
-              <w:rPr>
-                <w:color w:val="0070C0"/>
-              </w:rPr>
-            </w:pPr>
-            <w:r>
-              <w:rPr>
-                <w:color w:val="0070C0"/>
-              </w:rPr>
-              <w:t>I contributed to the frontend design, user interface improvements, and event browsing functionality across the project. My role focused on improving the user experience and making the site easier to navigate. I styled the login and signup pages, added filter buttons, added the order-by dropdown, fixed the genre dropdown, and improved styling across all pages. I also worked on connecting the user events database to the history page, updated the frontend across the landing page, base layout, event pages, and booking history</w:t>
-            </w:r>
-            <w:r>
-              <w:rPr>
-                <w:color w:val="0070C0"/>
-              </w:rPr>
-              <w:t>.</w:t>
+            <w:r>
+              <w:t>I contributed to the frontend design, user interface improvements, and event browsing functionality across the project. My role focused on improving the user experience and making the site easier to navigate. I styled the login and signup pages, added filter buttons, added the order-by dropdown, fixed the genre dropdown, and improved styling across all pages. I also worked on connecting the user events database to the history page, updated the frontend across the landing page, base layout, event pages, and booking history.</w:t>
             </w:r>
           </w:p>
         </w:tc>
@@ -1480,16 +1318,8 @@
             <w:tcW w:w="2122" w:type="dxa"/>
           </w:tcPr>
           <w:p>
-            <w:pPr>
-              <w:rPr>
-                <w:color w:val="0070C0"/>
-              </w:rPr>
-            </w:pPr>
-            <w:r>
-              <w:rPr>
-                <w:color w:val="0070C0"/>
-              </w:rPr>
-              <w:t>Full name of team member 3</w:t>
+            <w:r>
+              <w:t>Liam Johns</w:t>
             </w:r>
           </w:p>
         </w:tc>
@@ -1498,54 +1328,8 @@
             <w:tcW w:w="6894" w:type="dxa"/>
           </w:tcPr>
           <w:p>
-            <w:pPr>
-              <w:rPr>
-                <w:color w:val="0070C0"/>
-              </w:rPr>
-            </w:pPr>
-            <w:r>
-              <w:rPr>
-                <w:color w:val="0070C0"/>
-              </w:rPr>
-              <w:t>(Contribution statement)</w:t>
-            </w:r>
-          </w:p>
-        </w:tc>
-      </w:tr>
-      <w:tr>
-        <w:tc>
-          <w:tcPr>
-            <w:tcW w:w="2122" w:type="dxa"/>
-          </w:tcPr>
-          <w:p>
-            <w:pPr>
-              <w:rPr>
-                <w:color w:val="0070C0"/>
-              </w:rPr>
-            </w:pPr>
-            <w:r>
-              <w:rPr>
-                <w:color w:val="0070C0"/>
-              </w:rPr>
-              <w:t>Full name of team member 4</w:t>
-            </w:r>
-          </w:p>
-        </w:tc>
-        <w:tc>
-          <w:tcPr>
-            <w:tcW w:w="6894" w:type="dxa"/>
-          </w:tcPr>
-          <w:p>
-            <w:pPr>
-              <w:rPr>
-                <w:color w:val="0070C0"/>
-              </w:rPr>
-            </w:pPr>
-            <w:r>
-              <w:rPr>
-                <w:color w:val="0070C0"/>
-              </w:rPr>
-              <w:t>(Contribution statement)</w:t>
+            <w:r>
+              <w:t>I worked primarily on the main concert database, getting that setup and wired through all the different pages after the front end had its prototype. I continued working on other back-end projects including the extended acknowledgement to country and some forms. The remain contributions were minor or bug fixes.</w:t>
             </w:r>
           </w:p>
         </w:tc>
@@ -1648,7 +1432,33 @@
           <w:sz w:val="32"/>
           <w:szCs w:val="32"/>
         </w:rPr>
-        <w:t>git shortlog &gt; output.txt</w:t>
+        <w:t xml:space="preserve">git </w:t>
+      </w:r>
+      <w:proofErr w:type="spellStart"/>
+      <w:r>
+        <w:rPr>
+          <w:rStyle w:val="Strong"/>
+          <w:rFonts w:ascii="Segoe UI" w:eastAsiaTheme="majorEastAsia" w:hAnsi="Segoe UI" w:cs="Segoe UI"/>
+          <w:b w:val="0"/>
+          <w:bCs w:val="0"/>
+          <w:color w:val="404040"/>
+          <w:sz w:val="32"/>
+          <w:szCs w:val="32"/>
+        </w:rPr>
+        <w:t>shortlog</w:t>
+      </w:r>
+      <w:proofErr w:type="spellEnd"/>
+      <w:r>
+        <w:rPr>
+          <w:rStyle w:val="Strong"/>
+          <w:rFonts w:ascii="Segoe UI" w:eastAsiaTheme="majorEastAsia" w:hAnsi="Segoe UI" w:cs="Segoe UI"/>
+          <w:b w:val="0"/>
+          <w:bCs w:val="0"/>
+          <w:color w:val="404040"/>
+          <w:sz w:val="32"/>
+          <w:szCs w:val="32"/>
+        </w:rPr>
+        <w:t xml:space="preserve"> &gt; output.txt</w:t>
       </w:r>
     </w:p>
     <w:p>
@@ -1681,13 +1491,41 @@
         <w:rPr>
           <w:color w:val="0070C0"/>
         </w:rPr>
-        <w:t xml:space="preserve">Paste git shortlog output here. </w:t>
-      </w:r>
+        <w:t xml:space="preserve">Paste git </w:t>
+      </w:r>
+      <w:proofErr w:type="spellStart"/>
       <w:r>
         <w:rPr>
           <w:color w:val="0070C0"/>
         </w:rPr>
-        <w:t>The git shortlog command provides a summarised view of the git log output, useful for release announcements and reporting. It groups commits by author and displays the first line of each commit message, offering a quick overview of contributors' work. This will help the marker confirm who has worked on what.</w:t>
+        <w:t>shortlog</w:t>
+      </w:r>
+      <w:proofErr w:type="spellEnd"/>
+      <w:r>
+        <w:rPr>
+          <w:color w:val="0070C0"/>
+        </w:rPr>
+        <w:t xml:space="preserve"> output here. </w:t>
+      </w:r>
+      <w:r>
+        <w:rPr>
+          <w:color w:val="0070C0"/>
+        </w:rPr>
+        <w:t xml:space="preserve">The git </w:t>
+      </w:r>
+      <w:proofErr w:type="spellStart"/>
+      <w:r>
+        <w:rPr>
+          <w:color w:val="0070C0"/>
+        </w:rPr>
+        <w:t>shortlog</w:t>
+      </w:r>
+      <w:proofErr w:type="spellEnd"/>
+      <w:r>
+        <w:rPr>
+          <w:color w:val="0070C0"/>
+        </w:rPr>
+        <w:t xml:space="preserve"> command provides a summarised view of the git log output, useful for release announcements and reporting. It groups commits by author and displays the first line of each commit message, offering a quick overview of contributors' work. This will help the marker confirm who has worked on what.</w:t>
       </w:r>
     </w:p>
     <w:p>
@@ -1832,7 +1670,6 @@
           <w:color w:val="156082" w:themeColor="accent1"/>
           <w:lang w:val="en-US"/>
         </w:rPr>
-        <w:lastRenderedPageBreak/>
         <w:t>We</w:t>
       </w:r>
       <w:r>
@@ -2599,7 +2436,7 @@
         </w:tc>
         <w:tc>
           <w:tcPr>
-            <w:tcW w:w="973" w:type="dxa"/>
+            <w:tcW w:w="1051" w:type="dxa"/>
           </w:tcPr>
           <w:p>
             <w:pPr>
@@ -2621,7 +2458,7 @@
         </w:tc>
         <w:tc>
           <w:tcPr>
-            <w:tcW w:w="6894" w:type="dxa"/>
+            <w:tcW w:w="6816" w:type="dxa"/>
           </w:tcPr>
           <w:p>
             <w:pPr>
@@ -2663,7 +2500,7 @@
         </w:tc>
         <w:tc>
           <w:tcPr>
-            <w:tcW w:w="973" w:type="dxa"/>
+            <w:tcW w:w="1051" w:type="dxa"/>
           </w:tcPr>
           <w:p>
             <w:pPr>
@@ -2681,7 +2518,7 @@
         </w:tc>
         <w:tc>
           <w:tcPr>
-            <w:tcW w:w="6894" w:type="dxa"/>
+            <w:tcW w:w="6816" w:type="dxa"/>
           </w:tcPr>
           <w:p>
             <w:pPr>
@@ -2700,6 +2537,130 @@
                 <w:color w:val="0070C0"/>
               </w:rPr>
               <w:t xml:space="preserve"> – Added Magnus’ details</w:t>
+            </w:r>
+          </w:p>
+        </w:tc>
+      </w:tr>
+      <w:tr>
+        <w:tc>
+          <w:tcPr>
+            <w:tcW w:w="1149" w:type="dxa"/>
+          </w:tcPr>
+          <w:p>
+            <w:pPr>
+              <w:rPr>
+                <w:color w:val="0070C0"/>
+              </w:rPr>
+            </w:pPr>
+            <w:r>
+              <w:rPr>
+                <w:color w:val="0070C0"/>
+              </w:rPr>
+              <w:t>03/06/26</w:t>
+            </w:r>
+          </w:p>
+        </w:tc>
+        <w:tc>
+          <w:tcPr>
+            <w:tcW w:w="1051" w:type="dxa"/>
+          </w:tcPr>
+          <w:p>
+            <w:pPr>
+              <w:rPr>
+                <w:color w:val="0070C0"/>
+              </w:rPr>
+            </w:pPr>
+            <w:r>
+              <w:rPr>
+                <w:color w:val="0070C0"/>
+              </w:rPr>
+              <w:t>V2</w:t>
+            </w:r>
+          </w:p>
+        </w:tc>
+        <w:tc>
+          <w:tcPr>
+            <w:tcW w:w="6816" w:type="dxa"/>
+          </w:tcPr>
+          <w:p>
+            <w:pPr>
+              <w:rPr>
+                <w:color w:val="0070C0"/>
+              </w:rPr>
+            </w:pPr>
+            <w:r>
+              <w:rPr>
+                <w:color w:val="0070C0"/>
+              </w:rPr>
+              <w:t>Added Ryan’s details</w:t>
+            </w:r>
+          </w:p>
+        </w:tc>
+      </w:tr>
+      <w:tr>
+        <w:tc>
+          <w:tcPr>
+            <w:tcW w:w="1149" w:type="dxa"/>
+          </w:tcPr>
+          <w:p>
+            <w:pPr>
+              <w:rPr>
+                <w:color w:val="0070C0"/>
+              </w:rPr>
+            </w:pPr>
+            <w:r>
+              <w:rPr>
+                <w:color w:val="0070C0"/>
+              </w:rPr>
+              <w:t>04/06/26</w:t>
+            </w:r>
+          </w:p>
+        </w:tc>
+        <w:tc>
+          <w:tcPr>
+            <w:tcW w:w="1051" w:type="dxa"/>
+          </w:tcPr>
+          <w:p>
+            <w:pPr>
+              <w:rPr>
+                <w:color w:val="0070C0"/>
+              </w:rPr>
+            </w:pPr>
+            <w:r>
+              <w:rPr>
+                <w:color w:val="0070C0"/>
+              </w:rPr>
+              <w:t>V3</w:t>
+            </w:r>
+          </w:p>
+        </w:tc>
+        <w:tc>
+          <w:tcPr>
+            <w:tcW w:w="6816" w:type="dxa"/>
+          </w:tcPr>
+          <w:p>
+            <w:pPr>
+              <w:rPr>
+                <w:color w:val="0070C0"/>
+              </w:rPr>
+            </w:pPr>
+            <w:r>
+              <w:rPr>
+                <w:color w:val="0070C0"/>
+              </w:rPr>
+              <w:t>Added Liam</w:t>
+            </w:r>
+            <w:r>
+              <w:rPr>
+                <w:color w:val="0070C0"/>
+              </w:rPr>
+              <w:t>’</w:t>
+            </w:r>
+            <w:r>
+              <w:rPr>
+                <w:color w:val="0070C0"/>
+              </w:rPr>
+              <w:t>s Details</w:t>
             </w:r>
           </w:p>
         </w:tc>

</xml_diff>

<commit_message>
Updated to final assignment Dec
</commit_message>
<xml_diff>
--- a/Assignment declaration.docx
+++ b/Assignment declaration.docx
@@ -188,137 +188,12 @@
           <w:between w:val="nil"/>
         </w:pBdr>
       </w:pPr>
-    </w:p>
-    <w:p>
-      <w:pPr>
-        <w:pBdr>
-          <w:top w:val="nil"/>
-          <w:left w:val="nil"/>
-          <w:bottom w:val="nil"/>
-          <w:right w:val="nil"/>
-          <w:between w:val="nil"/>
-        </w:pBdr>
-        <w:rPr>
-          <w:color w:val="0070C0"/>
-        </w:rPr>
-      </w:pPr>
-      <w:r>
-        <w:rPr>
-          <w:color w:val="0070C0"/>
-        </w:rPr>
-        <w:t xml:space="preserve">Delete </w:t>
-      </w:r>
-      <w:r>
-        <w:rPr>
-          <w:color w:val="0070C0"/>
-        </w:rPr>
-        <w:t>the</w:t>
-      </w:r>
-      <w:r>
-        <w:rPr>
-          <w:color w:val="0070C0"/>
-        </w:rPr>
-        <w:t xml:space="preserve"> blue guide text</w:t>
-      </w:r>
-      <w:r>
-        <w:rPr>
-          <w:color w:val="0070C0"/>
-        </w:rPr>
-        <w:t xml:space="preserve"> through the document</w:t>
-      </w:r>
-      <w:r>
-        <w:rPr>
-          <w:color w:val="0070C0"/>
-        </w:rPr>
-        <w:t>.</w:t>
-      </w:r>
-    </w:p>
-    <w:p>
-      <w:pPr>
-        <w:pBdr>
-          <w:top w:val="nil"/>
-          <w:left w:val="nil"/>
-          <w:bottom w:val="nil"/>
-          <w:right w:val="nil"/>
-          <w:between w:val="nil"/>
-        </w:pBdr>
-        <w:rPr>
-          <w:color w:val="0070C0"/>
-        </w:rPr>
-      </w:pPr>
-    </w:p>
-    <w:p>
-      <w:pPr>
-        <w:pBdr>
-          <w:top w:val="nil"/>
-          <w:left w:val="nil"/>
-          <w:bottom w:val="nil"/>
-          <w:right w:val="nil"/>
-          <w:between w:val="nil"/>
-        </w:pBdr>
-        <w:rPr>
-          <w:color w:val="0070C0"/>
-        </w:rPr>
-      </w:pPr>
-      <w:r>
-        <w:rPr>
-          <w:color w:val="0070C0"/>
-        </w:rPr>
-        <w:t>Use either Option A or Option B and delete the one not used.</w:t>
-      </w:r>
-    </w:p>
-    <w:p>
-      <w:pPr>
-        <w:pBdr>
-          <w:top w:val="nil"/>
-          <w:left w:val="nil"/>
-          <w:bottom w:val="nil"/>
-          <w:right w:val="nil"/>
-          <w:between w:val="nil"/>
-        </w:pBdr>
-      </w:pPr>
-    </w:p>
-    <w:p>
-      <w:pPr>
-        <w:pBdr>
-          <w:top w:val="nil"/>
-          <w:left w:val="nil"/>
-          <w:bottom w:val="nil"/>
-          <w:right w:val="nil"/>
-          <w:between w:val="nil"/>
-        </w:pBdr>
-      </w:pPr>
       <w:r>
         <w:rPr>
           <w:b/>
           <w:bCs/>
         </w:rPr>
         <w:t>Option A</w:t>
-      </w:r>
-      <w:r>
-        <w:rPr>
-          <w:b/>
-          <w:bCs/>
-        </w:rPr>
-        <w:t>:</w:t>
-      </w:r>
-      <w:r>
-        <w:rPr>
-          <w:color w:val="0070C0"/>
-        </w:rPr>
-        <w:t xml:space="preserve"> – </w:t>
-      </w:r>
-      <w:r>
-        <w:rPr>
-          <w:color w:val="0070C0"/>
-        </w:rPr>
-        <w:t>Most will use this option. D</w:t>
-      </w:r>
-      <w:r>
-        <w:rPr>
-          <w:color w:val="0070C0"/>
-        </w:rPr>
-        <w:t>elete if not used</w:t>
       </w:r>
     </w:p>
     <w:tbl>
@@ -655,6 +530,20 @@
                 <w:between w:val="nil"/>
               </w:pBdr>
             </w:pPr>
+            <w:r>
+              <w:t xml:space="preserve">IAB207 </w:t>
+            </w:r>
+            <w:hyperlink r:id="rId7" w:history="1">
+              <w:r>
+                <w:rPr>
+                  <w:rStyle w:val="Hyperlink"/>
+                </w:rPr>
+                <w:t>https://github.com/MagnusWOAH77/IAB207</w:t>
+              </w:r>
+            </w:hyperlink>
+            <w:r>
+              <w:t xml:space="preserve"> </w:t>
+            </w:r>
           </w:p>
         </w:tc>
       </w:tr>
@@ -1199,56 +1088,6 @@
         </w:rPr>
       </w:pPr>
     </w:p>
-    <w:p>
-      <w:pPr>
-        <w:rPr>
-          <w:color w:val="0070C0"/>
-        </w:rPr>
-      </w:pPr>
-      <w:r>
-        <w:rPr>
-          <w:b/>
-          <w:bCs/>
-          <w:color w:val="0070C0"/>
-        </w:rPr>
-        <w:t xml:space="preserve">Brief </w:t>
-      </w:r>
-      <w:r>
-        <w:rPr>
-          <w:b/>
-          <w:bCs/>
-          <w:color w:val="0070C0"/>
-        </w:rPr>
-        <w:t>overview</w:t>
-      </w:r>
-      <w:r>
-        <w:rPr>
-          <w:color w:val="0070C0"/>
-        </w:rPr>
-        <w:t xml:space="preserve"> from each team member explaining how they contributed: </w:t>
-      </w:r>
-      <w:r>
-        <w:rPr>
-          <w:b/>
-          <w:bCs/>
-          <w:color w:val="0070C0"/>
-        </w:rPr>
-        <w:t>State your role within the team and the tasks that you completed</w:t>
-      </w:r>
-      <w:r>
-        <w:rPr>
-          <w:color w:val="0070C0"/>
-        </w:rPr>
-        <w:t>. There is no word limit, however, 60-100 words should be sufficient.</w:t>
-      </w:r>
-    </w:p>
-    <w:p>
-      <w:pPr>
-        <w:rPr>
-          <w:color w:val="0070C0"/>
-        </w:rPr>
-      </w:pPr>
-    </w:p>
     <w:tbl>
       <w:tblPr>
         <w:tblStyle w:val="TableGrid"/>
@@ -1463,6 +1302,363 @@
     </w:p>
     <w:p>
       <w:pPr>
+        <w:rPr>
+          <w:color w:val="0070C0"/>
+        </w:rPr>
+      </w:pPr>
+    </w:p>
+    <w:p>
+      <w:r>
+        <w:t>Liam J (2):</w:t>
+      </w:r>
+    </w:p>
+    <w:p>
+      <w:r>
+        <w:t xml:space="preserve">      Merge pull request #21 from MagnusWOAH77/add-search-functionality</w:t>
+      </w:r>
+    </w:p>
+    <w:p>
+      <w:r>
+        <w:t xml:space="preserve">      Merge pull request #26 from MagnusWOAH77/bug-fixes</w:t>
+      </w:r>
+    </w:p>
+    <w:p/>
+    <w:p>
+      <w:r>
+        <w:t>Liam Johns (7):</w:t>
+      </w:r>
+    </w:p>
+    <w:p>
+      <w:r>
+        <w:t xml:space="preserve">      Updated to flask-bootstrap</w:t>
+      </w:r>
+    </w:p>
+    <w:p>
+      <w:r>
+        <w:t xml:space="preserve">      Fixed Navbar</w:t>
+      </w:r>
+    </w:p>
+    <w:p>
+      <w:r>
+        <w:t xml:space="preserve">      Merge branch 'main' of https://github.com/MagnusWOAH77/IAB207 into Create-concert-database</w:t>
+      </w:r>
+    </w:p>
+    <w:p>
+      <w:r>
+        <w:t xml:space="preserve">      added event DB and functional pages for </w:t>
+      </w:r>
+      <w:proofErr w:type="gramStart"/>
+      <w:r>
+        <w:t>create,</w:t>
+      </w:r>
+      <w:proofErr w:type="gramEnd"/>
+      <w:r>
+        <w:t xml:space="preserve"> details and index.</w:t>
+      </w:r>
+    </w:p>
+    <w:p>
+      <w:r>
+        <w:t xml:space="preserve">      Update main.py for events</w:t>
+      </w:r>
+    </w:p>
+    <w:p>
+      <w:r>
+        <w:t xml:space="preserve">      Updated index and base for merge.</w:t>
+      </w:r>
+    </w:p>
+    <w:p>
+      <w:r>
+        <w:t xml:space="preserve">      Updated the acknowledgement to country to </w:t>
+      </w:r>
+      <w:proofErr w:type="spellStart"/>
+      <w:proofErr w:type="gramStart"/>
+      <w:r>
+        <w:t>a</w:t>
+      </w:r>
+      <w:proofErr w:type="spellEnd"/>
+      <w:proofErr w:type="gramEnd"/>
+      <w:r>
+        <w:t xml:space="preserve"> expanded version</w:t>
+      </w:r>
+    </w:p>
+    <w:p/>
+    <w:p>
+      <w:r>
+        <w:t>Magnus Jackson (9):</w:t>
+      </w:r>
+    </w:p>
+    <w:p>
+      <w:r>
+        <w:t xml:space="preserve">      Merge pull request #2 from MagnusWOAH77/create-login-system</w:t>
+      </w:r>
+    </w:p>
+    <w:p>
+      <w:r>
+        <w:t xml:space="preserve">      Merge pull request #13 from MagnusWOAH77/</w:t>
+      </w:r>
+      <w:proofErr w:type="spellStart"/>
+      <w:r>
+        <w:t>ryan</w:t>
+      </w:r>
+      <w:proofErr w:type="spellEnd"/>
+      <w:r>
+        <w:t>/auth-page-design</w:t>
+      </w:r>
+    </w:p>
+    <w:p>
+      <w:r>
+        <w:t xml:space="preserve">      Merge branch 'main' into Create-concert-database</w:t>
+      </w:r>
+    </w:p>
+    <w:p>
+      <w:r>
+        <w:t xml:space="preserve">      Merge pull request #14 from MagnusWOAH77/Create-concert-database</w:t>
+      </w:r>
+    </w:p>
+    <w:p>
+      <w:r>
+        <w:t xml:space="preserve">      Merge pull request #15 from MagnusWOAH77/</w:t>
+      </w:r>
+      <w:proofErr w:type="spellStart"/>
+      <w:r>
+        <w:t>ryan</w:t>
+      </w:r>
+      <w:proofErr w:type="spellEnd"/>
+      <w:r>
+        <w:t>/filter-order-error-fix</w:t>
+      </w:r>
+    </w:p>
+    <w:p>
+      <w:r>
+        <w:t xml:space="preserve">      Merge pull request #16 from MagnusWOAH77/Create-concert-database</w:t>
+      </w:r>
+    </w:p>
+    <w:p>
+      <w:r>
+        <w:t xml:space="preserve">      Merge pull request #24 from MagnusWOAH77/</w:t>
+      </w:r>
+      <w:proofErr w:type="spellStart"/>
+      <w:r>
+        <w:t>ryan</w:t>
+      </w:r>
+      <w:proofErr w:type="spellEnd"/>
+      <w:r>
+        <w:t>/user-events-</w:t>
+      </w:r>
+      <w:proofErr w:type="spellStart"/>
+      <w:r>
+        <w:t>db</w:t>
+      </w:r>
+      <w:proofErr w:type="spellEnd"/>
+    </w:p>
+    <w:p>
+      <w:r>
+        <w:t xml:space="preserve">      Merge pull request #30 from MagnusWOAH77/</w:t>
+      </w:r>
+      <w:proofErr w:type="spellStart"/>
+      <w:r>
+        <w:t>ryan</w:t>
+      </w:r>
+      <w:proofErr w:type="spellEnd"/>
+      <w:r>
+        <w:t>/footer-signup-fix</w:t>
+      </w:r>
+    </w:p>
+    <w:p>
+      <w:r>
+        <w:t xml:space="preserve">      Merge pull request #31 from MagnusWOAH77/Update-country-</w:t>
+      </w:r>
+      <w:proofErr w:type="spellStart"/>
+      <w:r>
+        <w:t>acknowlegement</w:t>
+      </w:r>
+      <w:proofErr w:type="spellEnd"/>
+    </w:p>
+    <w:p/>
+    <w:p>
+      <w:r>
+        <w:t>MagnusWOAH77 (8):</w:t>
+      </w:r>
+    </w:p>
+    <w:p>
+      <w:r>
+        <w:t xml:space="preserve">      </w:t>
+      </w:r>
+      <w:proofErr w:type="spellStart"/>
+      <w:r>
+        <w:t>Inital</w:t>
+      </w:r>
+      <w:proofErr w:type="spellEnd"/>
+      <w:r>
+        <w:t xml:space="preserve"> Commit</w:t>
+      </w:r>
+    </w:p>
+    <w:p>
+      <w:r>
+        <w:t xml:space="preserve">      Added basic Flask Functionality</w:t>
+      </w:r>
+    </w:p>
+    <w:p>
+      <w:r>
+        <w:t xml:space="preserve">      Created User login system with basic login and signup pages. Uses </w:t>
+      </w:r>
+      <w:proofErr w:type="spellStart"/>
+      <w:r>
+        <w:t>bcrypt</w:t>
+      </w:r>
+      <w:proofErr w:type="spellEnd"/>
+      <w:r>
+        <w:t xml:space="preserve"> for password hashing and Flask-Login for session management</w:t>
+      </w:r>
+    </w:p>
+    <w:p>
+      <w:r>
+        <w:t xml:space="preserve">      Connected the search function to the UI. Added thumbnail images to the create event form as well as modified the code to load thumbnails.</w:t>
+      </w:r>
+    </w:p>
+    <w:p>
+      <w:r>
+        <w:t xml:space="preserve">      Added comments table to database. Added comments form along with handling in </w:t>
+      </w:r>
+      <w:proofErr w:type="spellStart"/>
+      <w:r>
+        <w:t>create_event_</w:t>
+      </w:r>
+      <w:proofErr w:type="gramStart"/>
+      <w:r>
+        <w:t>page</w:t>
+      </w:r>
+      <w:proofErr w:type="spellEnd"/>
+      <w:r>
+        <w:t>(</w:t>
+      </w:r>
+      <w:proofErr w:type="gramEnd"/>
+      <w:r>
+        <w:t>). Created new route to delete the comment if the user decides to</w:t>
+      </w:r>
+    </w:p>
+    <w:p>
+      <w:r>
+        <w:t xml:space="preserve">      Added new fields to signup due to task requirements, changed the username display on comments to show first and last name</w:t>
+      </w:r>
+    </w:p>
+    <w:p>
+      <w:r>
+        <w:t xml:space="preserve">      Added new fields to signup page as it </w:t>
+      </w:r>
+      <w:proofErr w:type="gramStart"/>
+      <w:r>
+        <w:t>tutor</w:t>
+      </w:r>
+      <w:proofErr w:type="gramEnd"/>
+      <w:r>
+        <w:t xml:space="preserve"> said, removed @login_required from index and added auth checks. Added Assignment </w:t>
+      </w:r>
+      <w:proofErr w:type="spellStart"/>
+      <w:r>
+        <w:t>declearation</w:t>
+      </w:r>
+      <w:proofErr w:type="spellEnd"/>
+      <w:r>
+        <w:t xml:space="preserve"> form to git</w:t>
+      </w:r>
+    </w:p>
+    <w:p>
+      <w:r>
+        <w:t xml:space="preserve">      Added </w:t>
+      </w:r>
+      <w:proofErr w:type="spellStart"/>
+      <w:r>
+        <w:t>liams</w:t>
+      </w:r>
+      <w:proofErr w:type="spellEnd"/>
+      <w:r>
+        <w:t xml:space="preserve"> assignment dec to doc. Added alerts to login and create event. Fixed issue with price not allowing 0 dollars, fixed issue with date not throwing the correct error when missing</w:t>
+      </w:r>
+    </w:p>
+    <w:p/>
+    <w:p>
+      <w:r>
+        <w:t>Ryan (4):</w:t>
+      </w:r>
+    </w:p>
+    <w:p>
+      <w:r>
+        <w:t xml:space="preserve">      Fully updated login and signup page design, also made the 'Sign Out' button from the dropdown functional</w:t>
+      </w:r>
+    </w:p>
+    <w:p>
+      <w:r>
+        <w:t xml:space="preserve">      Added Genre and Subgenre dropdowns, added order dropdown, also fixed bootstrap error.</w:t>
+      </w:r>
+    </w:p>
+    <w:p>
+      <w:r>
+        <w:t xml:space="preserve">      Update frontend across all pages and booking history</w:t>
+      </w:r>
+    </w:p>
+    <w:p>
+      <w:r>
+        <w:t xml:space="preserve">      Add footer and update signup form</w:t>
+      </w:r>
+    </w:p>
+    <w:p/>
+    <w:p>
+      <w:r>
+        <w:t>Rynoo451 (2):</w:t>
+      </w:r>
+    </w:p>
+    <w:p>
+      <w:r>
+        <w:t xml:space="preserve">      Merge pull request #22 from MagnusWOAH77/create-comments-table</w:t>
+      </w:r>
+    </w:p>
+    <w:p>
+      <w:r>
+        <w:t xml:space="preserve">      Merge pull request #29 from MagnusWOAH77/add-login-fields</w:t>
+      </w:r>
+    </w:p>
+    <w:p>
+      <w:pPr>
+        <w:rPr>
+          <w:color w:val="0070C0"/>
+        </w:rPr>
+      </w:pPr>
+    </w:p>
+    <w:p>
+      <w:pPr>
+        <w:rPr>
+          <w:color w:val="0070C0"/>
+        </w:rPr>
+      </w:pPr>
+    </w:p>
+    <w:p>
+      <w:pPr>
+        <w:rPr>
+          <w:rStyle w:val="Strong"/>
+          <w:rFonts w:ascii="Segoe UI" w:eastAsiaTheme="majorEastAsia" w:hAnsi="Segoe UI" w:cs="Segoe UI"/>
+          <w:b w:val="0"/>
+          <w:bCs w:val="0"/>
+          <w:color w:val="404040"/>
+          <w:sz w:val="32"/>
+          <w:szCs w:val="32"/>
+        </w:rPr>
+      </w:pPr>
+      <w:r>
+        <w:rPr>
+          <w:rStyle w:val="Strong"/>
+          <w:rFonts w:ascii="Segoe UI" w:eastAsiaTheme="majorEastAsia" w:hAnsi="Segoe UI" w:cs="Segoe UI"/>
+          <w:b w:val="0"/>
+          <w:bCs w:val="0"/>
+          <w:color w:val="404040"/>
+          <w:sz w:val="32"/>
+          <w:szCs w:val="32"/>
+        </w:rPr>
+        <w:br w:type="page"/>
+      </w:r>
+    </w:p>
+    <w:p>
+      <w:pPr>
         <w:pBdr>
           <w:top w:val="nil"/>
           <w:left w:val="nil"/>
@@ -1480,77 +1676,7 @@
           <w:szCs w:val="32"/>
         </w:rPr>
       </w:pPr>
-    </w:p>
-    <w:p>
-      <w:pPr>
-        <w:rPr>
-          <w:color w:val="0070C0"/>
-        </w:rPr>
-      </w:pPr>
-      <w:r>
-        <w:rPr>
-          <w:color w:val="0070C0"/>
-        </w:rPr>
-        <w:t xml:space="preserve">Paste git </w:t>
-      </w:r>
-      <w:proofErr w:type="spellStart"/>
-      <w:r>
-        <w:rPr>
-          <w:color w:val="0070C0"/>
-        </w:rPr>
-        <w:t>shortlog</w:t>
-      </w:r>
-      <w:proofErr w:type="spellEnd"/>
-      <w:r>
-        <w:rPr>
-          <w:color w:val="0070C0"/>
-        </w:rPr>
-        <w:t xml:space="preserve"> output here. </w:t>
-      </w:r>
-      <w:r>
-        <w:rPr>
-          <w:color w:val="0070C0"/>
-        </w:rPr>
-        <w:t xml:space="preserve">The git </w:t>
-      </w:r>
-      <w:proofErr w:type="spellStart"/>
-      <w:r>
-        <w:rPr>
-          <w:color w:val="0070C0"/>
-        </w:rPr>
-        <w:t>shortlog</w:t>
-      </w:r>
-      <w:proofErr w:type="spellEnd"/>
-      <w:r>
-        <w:rPr>
-          <w:color w:val="0070C0"/>
-        </w:rPr>
-        <w:t xml:space="preserve"> command provides a summarised view of the git log output, useful for release announcements and reporting. It groups commits by author and displays the first line of each commit message, offering a quick overview of contributors' work. This will help the marker confirm who has worked on what.</w:t>
-      </w:r>
-    </w:p>
-    <w:p>
-      <w:pPr>
-        <w:rPr>
-          <w:color w:val="0070C0"/>
-        </w:rPr>
-      </w:pPr>
-    </w:p>
-    <w:p>
-      <w:pPr>
-        <w:rPr>
-          <w:color w:val="0070C0"/>
-        </w:rPr>
-      </w:pPr>
-    </w:p>
-    <w:p>
-      <w:pPr>
-        <w:pBdr>
-          <w:top w:val="nil"/>
-          <w:left w:val="nil"/>
-          <w:bottom w:val="nil"/>
-          <w:right w:val="nil"/>
-          <w:between w:val="nil"/>
-        </w:pBdr>
+      <w:r>
         <w:rPr>
           <w:rStyle w:val="Strong"/>
           <w:rFonts w:ascii="Segoe UI" w:eastAsiaTheme="majorEastAsia" w:hAnsi="Segoe UI" w:cs="Segoe UI"/>
@@ -1560,7 +1686,9 @@
           <w:sz w:val="32"/>
           <w:szCs w:val="32"/>
         </w:rPr>
-      </w:pPr>
+        <w:lastRenderedPageBreak/>
+        <w:t xml:space="preserve">Section </w:t>
+      </w:r>
       <w:r>
         <w:rPr>
           <w:rStyle w:val="Strong"/>
@@ -1571,7 +1699,7 @@
           <w:sz w:val="32"/>
           <w:szCs w:val="32"/>
         </w:rPr>
-        <w:t xml:space="preserve">Section </w:t>
+        <w:t>4</w:t>
       </w:r>
       <w:r>
         <w:rPr>
@@ -1583,7 +1711,7 @@
           <w:sz w:val="32"/>
           <w:szCs w:val="32"/>
         </w:rPr>
-        <w:t>4</w:t>
+        <w:t xml:space="preserve">: </w:t>
       </w:r>
       <w:r>
         <w:rPr>
@@ -1595,7 +1723,7 @@
           <w:sz w:val="32"/>
           <w:szCs w:val="32"/>
         </w:rPr>
-        <w:t xml:space="preserve">: </w:t>
+        <w:t>Team u</w:t>
       </w:r>
       <w:r>
         <w:rPr>
@@ -1607,9 +1735,18 @@
           <w:sz w:val="32"/>
           <w:szCs w:val="32"/>
         </w:rPr>
-        <w:t>Team u</w:t>
-      </w:r>
-      <w:r>
+        <w:t>se of AI statement</w:t>
+      </w:r>
+    </w:p>
+    <w:p>
+      <w:pPr>
+        <w:rPr>
+          <w:lang w:val="en-US"/>
+        </w:rPr>
+      </w:pPr>
+    </w:p>
+    <w:p>
+      <w:pPr>
         <w:rPr>
           <w:rStyle w:val="Strong"/>
           <w:rFonts w:ascii="Segoe UI" w:eastAsiaTheme="majorEastAsia" w:hAnsi="Segoe UI" w:cs="Segoe UI"/>
@@ -1619,701 +1756,14 @@
           <w:sz w:val="32"/>
           <w:szCs w:val="32"/>
         </w:rPr>
-        <w:t>se of AI statement</w:t>
-      </w:r>
-    </w:p>
-    <w:p>
-      <w:pPr>
-        <w:rPr>
-          <w:rStyle w:val="Strong"/>
-          <w:rFonts w:ascii="Segoe UI" w:eastAsiaTheme="majorEastAsia" w:hAnsi="Segoe UI" w:cs="Segoe UI"/>
-          <w:b w:val="0"/>
-          <w:bCs w:val="0"/>
-          <w:color w:val="404040"/>
-          <w:sz w:val="32"/>
-          <w:szCs w:val="32"/>
-        </w:rPr>
-      </w:pPr>
-    </w:p>
-    <w:p>
-      <w:pPr>
-        <w:rPr>
-          <w:color w:val="156082" w:themeColor="accent1"/>
+      </w:pPr>
+      <w:r>
+        <w:rPr>
           <w:lang w:val="en-US"/>
         </w:rPr>
-      </w:pPr>
-      <w:r>
-        <w:rPr>
-          <w:color w:val="156082" w:themeColor="accent1"/>
-          <w:lang w:val="en-US"/>
-        </w:rPr>
-        <w:t xml:space="preserve">Instructions: </w:t>
-      </w:r>
-    </w:p>
-    <w:p>
-      <w:pPr>
-        <w:pStyle w:val="ListParagraph"/>
-        <w:numPr>
-          <w:ilvl w:val="0"/>
-          <w:numId w:val="5"/>
-        </w:numPr>
-        <w:spacing w:after="160" w:line="278" w:lineRule="auto"/>
-        <w:rPr>
-          <w:color w:val="156082" w:themeColor="accent1"/>
-          <w:lang w:val="en-US"/>
-        </w:rPr>
-      </w:pPr>
-      <w:r>
-        <w:rPr>
-          <w:b/>
-          <w:bCs/>
-          <w:color w:val="156082" w:themeColor="accent1"/>
-          <w:lang w:val="en-US"/>
-        </w:rPr>
-        <w:t>We</w:t>
-      </w:r>
-      <w:r>
-        <w:rPr>
-          <w:b/>
-          <w:bCs/>
-          <w:color w:val="156082" w:themeColor="accent1"/>
-          <w:lang w:val="en-US"/>
-        </w:rPr>
-        <w:t xml:space="preserve"> did not use AI</w:t>
-      </w:r>
-      <w:r>
-        <w:rPr>
-          <w:color w:val="156082" w:themeColor="accent1"/>
-          <w:lang w:val="en-US"/>
-        </w:rPr>
-        <w:t>. Include part A</w:t>
-      </w:r>
-      <w:r>
-        <w:rPr>
-          <w:color w:val="156082" w:themeColor="accent1"/>
-          <w:lang w:val="en-US"/>
-        </w:rPr>
-        <w:t>.</w:t>
-      </w:r>
-      <w:r>
-        <w:rPr>
-          <w:color w:val="156082" w:themeColor="accent1"/>
-          <w:lang w:val="en-US"/>
-        </w:rPr>
-        <w:t xml:space="preserve"> Delete part B.</w:t>
-      </w:r>
-    </w:p>
-    <w:p>
-      <w:pPr>
-        <w:pStyle w:val="ListParagraph"/>
-        <w:numPr>
-          <w:ilvl w:val="0"/>
-          <w:numId w:val="5"/>
-        </w:numPr>
-        <w:spacing w:after="160" w:line="278" w:lineRule="auto"/>
-        <w:rPr>
-          <w:color w:val="156082" w:themeColor="accent1"/>
-          <w:lang w:val="en-US"/>
-        </w:rPr>
-      </w:pPr>
-      <w:r>
-        <w:rPr>
-          <w:b/>
-          <w:bCs/>
-          <w:color w:val="156082" w:themeColor="accent1"/>
-          <w:lang w:val="en-US"/>
-        </w:rPr>
-        <w:t>We (one or more team members)</w:t>
-      </w:r>
-      <w:r>
-        <w:rPr>
-          <w:b/>
-          <w:bCs/>
-          <w:color w:val="156082" w:themeColor="accent1"/>
-          <w:lang w:val="en-US"/>
-        </w:rPr>
-        <w:t xml:space="preserve"> used AI in an authorized way</w:t>
-      </w:r>
-      <w:r>
-        <w:rPr>
-          <w:color w:val="156082" w:themeColor="accent1"/>
-          <w:lang w:val="en-US"/>
-        </w:rPr>
-        <w:t xml:space="preserve"> (as described in the assignment brief)</w:t>
-      </w:r>
-      <w:r>
-        <w:rPr>
-          <w:color w:val="156082" w:themeColor="accent1"/>
-          <w:lang w:val="en-US"/>
-        </w:rPr>
-        <w:t>. Complete part B</w:t>
-      </w:r>
-      <w:r>
-        <w:rPr>
-          <w:color w:val="156082" w:themeColor="accent1"/>
-          <w:lang w:val="en-US"/>
-        </w:rPr>
-        <w:t>.</w:t>
-      </w:r>
-      <w:r>
-        <w:rPr>
-          <w:color w:val="156082" w:themeColor="accent1"/>
-          <w:lang w:val="en-US"/>
-        </w:rPr>
-        <w:t xml:space="preserve"> Delete part A.</w:t>
-      </w:r>
-    </w:p>
-    <w:p>
-      <w:pPr>
-        <w:pStyle w:val="ListParagraph"/>
-        <w:numPr>
-          <w:ilvl w:val="0"/>
-          <w:numId w:val="5"/>
-        </w:numPr>
-        <w:spacing w:after="160" w:line="278" w:lineRule="auto"/>
-        <w:rPr>
-          <w:color w:val="156082" w:themeColor="accent1"/>
-          <w:lang w:val="en-US"/>
-        </w:rPr>
-      </w:pPr>
-      <w:r>
-        <w:rPr>
-          <w:b/>
-          <w:bCs/>
-          <w:color w:val="156082" w:themeColor="accent1"/>
-          <w:lang w:val="en-US"/>
-        </w:rPr>
-        <w:t>We are not sure</w:t>
-      </w:r>
-      <w:r>
-        <w:rPr>
-          <w:color w:val="156082" w:themeColor="accent1"/>
-          <w:lang w:val="en-US"/>
-        </w:rPr>
-        <w:t xml:space="preserve">… please </w:t>
-      </w:r>
-      <w:r>
-        <w:rPr>
-          <w:color w:val="156082" w:themeColor="accent1"/>
-          <w:lang w:val="en-US"/>
-        </w:rPr>
-        <w:t>speak to your tutor before submitting the assignment</w:t>
-      </w:r>
-      <w:r>
-        <w:rPr>
-          <w:color w:val="156082" w:themeColor="accent1"/>
-          <w:lang w:val="en-US"/>
-        </w:rPr>
-        <w:t>.</w:t>
-      </w:r>
-    </w:p>
-    <w:p>
-      <w:pPr>
-        <w:rPr>
-          <w:b/>
-          <w:bCs/>
-          <w:lang w:val="en-US"/>
-        </w:rPr>
-      </w:pPr>
-    </w:p>
-    <w:p>
-      <w:pPr>
-        <w:rPr>
-          <w:color w:val="156082" w:themeColor="accent1"/>
-          <w:lang w:val="en-US"/>
-        </w:rPr>
-      </w:pPr>
-      <w:r>
-        <w:rPr>
-          <w:b/>
-          <w:bCs/>
-          <w:lang w:val="en-US"/>
-        </w:rPr>
-        <w:t>Part</w:t>
-      </w:r>
-      <w:r>
-        <w:rPr>
-          <w:b/>
-          <w:bCs/>
-          <w:lang w:val="en-US"/>
-        </w:rPr>
-        <w:t xml:space="preserve"> A</w:t>
-      </w:r>
-      <w:r>
-        <w:rPr>
-          <w:lang w:val="en-US"/>
-        </w:rPr>
-        <w:t xml:space="preserve">: </w:t>
-      </w:r>
-      <w:r>
-        <w:rPr>
-          <w:color w:val="156082" w:themeColor="accent1"/>
-          <w:lang w:val="en-US"/>
-        </w:rPr>
-        <w:t xml:space="preserve">(delete </w:t>
-      </w:r>
-      <w:r>
-        <w:rPr>
-          <w:color w:val="156082" w:themeColor="accent1"/>
-          <w:lang w:val="en-US"/>
-        </w:rPr>
-        <w:t>part</w:t>
-      </w:r>
-      <w:r>
-        <w:rPr>
-          <w:color w:val="156082" w:themeColor="accent1"/>
-          <w:lang w:val="en-US"/>
-        </w:rPr>
-        <w:t xml:space="preserve"> if not used)</w:t>
-      </w:r>
-    </w:p>
-    <w:p>
-      <w:pPr>
-        <w:rPr>
-          <w:lang w:val="en-US"/>
-        </w:rPr>
-      </w:pPr>
-    </w:p>
-    <w:p>
-      <w:pPr>
-        <w:rPr>
-          <w:rStyle w:val="Strong"/>
-          <w:rFonts w:ascii="Segoe UI" w:eastAsiaTheme="majorEastAsia" w:hAnsi="Segoe UI" w:cs="Segoe UI"/>
-          <w:b w:val="0"/>
-          <w:bCs w:val="0"/>
-          <w:color w:val="404040"/>
-          <w:sz w:val="32"/>
-          <w:szCs w:val="32"/>
-        </w:rPr>
-      </w:pPr>
-      <w:r>
-        <w:rPr>
-          <w:lang w:val="en-US"/>
-        </w:rPr>
         <w:t>As a team, we report that all members have stated they did not use AI in completing the assignment.</w:t>
       </w:r>
     </w:p>
-    <w:p/>
-    <w:p/>
-    <w:p/>
-    <w:p>
-      <w:pPr>
-        <w:rPr>
-          <w:lang w:val="en-US"/>
-        </w:rPr>
-      </w:pPr>
-      <w:r>
-        <w:rPr>
-          <w:b/>
-          <w:bCs/>
-          <w:lang w:val="en-US"/>
-        </w:rPr>
-        <w:t>Part</w:t>
-      </w:r>
-      <w:r>
-        <w:rPr>
-          <w:b/>
-          <w:bCs/>
-          <w:lang w:val="en-US"/>
-        </w:rPr>
-        <w:t xml:space="preserve"> B</w:t>
-      </w:r>
-      <w:r>
-        <w:rPr>
-          <w:lang w:val="en-US"/>
-        </w:rPr>
-        <w:t xml:space="preserve">: </w:t>
-      </w:r>
-      <w:r>
-        <w:rPr>
-          <w:color w:val="156082" w:themeColor="accent1"/>
-          <w:lang w:val="en-US"/>
-        </w:rPr>
-        <w:t xml:space="preserve">(delete </w:t>
-      </w:r>
-      <w:r>
-        <w:rPr>
-          <w:color w:val="156082" w:themeColor="accent1"/>
-          <w:lang w:val="en-US"/>
-        </w:rPr>
-        <w:t>part</w:t>
-      </w:r>
-      <w:r>
-        <w:rPr>
-          <w:color w:val="156082" w:themeColor="accent1"/>
-          <w:lang w:val="en-US"/>
-        </w:rPr>
-        <w:t xml:space="preserve"> if not used)</w:t>
-      </w:r>
-    </w:p>
-    <w:p>
-      <w:pPr>
-        <w:rPr>
-          <w:lang w:val="en-US"/>
-        </w:rPr>
-      </w:pPr>
-    </w:p>
-    <w:p>
-      <w:pPr>
-        <w:rPr>
-          <w:lang w:val="en-US"/>
-        </w:rPr>
-      </w:pPr>
-      <w:r>
-        <w:rPr>
-          <w:lang w:val="en-US"/>
-        </w:rPr>
-        <w:t>As a team, we report that some members have stated they AI in the following authorized way.</w:t>
-      </w:r>
-    </w:p>
-    <w:p>
-      <w:pPr>
-        <w:rPr>
-          <w:lang w:val="en-US"/>
-        </w:rPr>
-      </w:pPr>
-    </w:p>
-    <w:p>
-      <w:pPr>
-        <w:rPr>
-          <w:lang w:val="en-US"/>
-        </w:rPr>
-      </w:pPr>
-      <w:r>
-        <w:rPr>
-          <w:u w:val="single"/>
-          <w:lang w:val="en-US"/>
-        </w:rPr>
-        <w:t>Summary of AI use</w:t>
-      </w:r>
-      <w:r>
-        <w:rPr>
-          <w:lang w:val="en-US"/>
-        </w:rPr>
-        <w:t xml:space="preserve"> </w:t>
-      </w:r>
-    </w:p>
-    <w:p>
-      <w:pPr>
-        <w:rPr>
-          <w:lang w:val="en-US"/>
-        </w:rPr>
-      </w:pPr>
-      <w:r>
-        <w:rPr>
-          <w:lang w:val="en-US"/>
-        </w:rPr>
-        <w:t xml:space="preserve">(no word limit but </w:t>
-      </w:r>
-      <w:r>
-        <w:rPr>
-          <w:lang w:val="en-US"/>
-        </w:rPr>
-        <w:t xml:space="preserve">we </w:t>
-      </w:r>
-      <w:r>
-        <w:rPr>
-          <w:lang w:val="en-US"/>
-        </w:rPr>
-        <w:t xml:space="preserve">suggest 50-100 words describing </w:t>
-      </w:r>
-      <w:r>
-        <w:rPr>
-          <w:lang w:val="en-US"/>
-        </w:rPr>
-        <w:t xml:space="preserve">how </w:t>
-      </w:r>
-      <w:r>
-        <w:rPr>
-          <w:lang w:val="en-US"/>
-        </w:rPr>
-        <w:t>your team</w:t>
-      </w:r>
-      <w:r>
-        <w:rPr>
-          <w:lang w:val="en-US"/>
-        </w:rPr>
-        <w:t xml:space="preserve"> used AI</w:t>
-      </w:r>
-      <w:r>
-        <w:rPr>
-          <w:lang w:val="en-US"/>
-        </w:rPr>
-        <w:t>)</w:t>
-      </w:r>
-    </w:p>
-    <w:tbl>
-      <w:tblPr>
-        <w:tblStyle w:val="TableGrid"/>
-        <w:tblW w:w="0" w:type="auto"/>
-        <w:tblLook w:val="04A0" w:firstRow="1" w:lastRow="0" w:firstColumn="1" w:lastColumn="0" w:noHBand="0" w:noVBand="1"/>
-      </w:tblPr>
-      <w:tblGrid>
-        <w:gridCol w:w="9016"/>
-      </w:tblGrid>
-      <w:tr>
-        <w:tc>
-          <w:tcPr>
-            <w:tcW w:w="9016" w:type="dxa"/>
-          </w:tcPr>
-          <w:p>
-            <w:pPr>
-              <w:rPr>
-                <w:lang w:val="en-US"/>
-              </w:rPr>
-            </w:pPr>
-          </w:p>
-          <w:p>
-            <w:pPr>
-              <w:rPr>
-                <w:lang w:val="en-US"/>
-              </w:rPr>
-            </w:pPr>
-          </w:p>
-          <w:p>
-            <w:pPr>
-              <w:rPr>
-                <w:lang w:val="en-US"/>
-              </w:rPr>
-            </w:pPr>
-          </w:p>
-        </w:tc>
-      </w:tr>
-    </w:tbl>
-    <w:p>
-      <w:pPr>
-        <w:rPr>
-          <w:lang w:val="en-US"/>
-        </w:rPr>
-      </w:pPr>
-    </w:p>
-    <w:p>
-      <w:pPr>
-        <w:rPr>
-          <w:u w:val="single"/>
-          <w:lang w:val="en-US"/>
-        </w:rPr>
-      </w:pPr>
-      <w:r>
-        <w:rPr>
-          <w:u w:val="single"/>
-          <w:lang w:val="en-US"/>
-        </w:rPr>
-        <w:t>Key examples of AI use</w:t>
-      </w:r>
-    </w:p>
-    <w:p>
-      <w:pPr>
-        <w:rPr>
-          <w:lang w:val="en-US"/>
-        </w:rPr>
-      </w:pPr>
-      <w:r>
-        <w:rPr>
-          <w:lang w:val="en-US"/>
-        </w:rPr>
-        <w:t xml:space="preserve">Your marker needs to clearly understand how </w:t>
-      </w:r>
-      <w:r>
-        <w:rPr>
-          <w:lang w:val="en-US"/>
-        </w:rPr>
-        <w:t>your team</w:t>
-      </w:r>
-      <w:r>
-        <w:rPr>
-          <w:lang w:val="en-US"/>
-        </w:rPr>
-        <w:t xml:space="preserve"> used AI to improve your work. P</w:t>
-      </w:r>
-      <w:r>
-        <w:rPr>
-          <w:lang w:val="en-US"/>
-        </w:rPr>
-        <w:t xml:space="preserve">rovide representative </w:t>
-      </w:r>
-      <w:r>
-        <w:rPr>
-          <w:lang w:val="en-US"/>
-        </w:rPr>
-        <w:t>samples</w:t>
-      </w:r>
-      <w:r>
-        <w:rPr>
-          <w:lang w:val="en-US"/>
-        </w:rPr>
-        <w:t xml:space="preserve"> of how you used AI using the </w:t>
-      </w:r>
-      <w:r>
-        <w:rPr>
-          <w:lang w:val="en-US"/>
-        </w:rPr>
-        <w:t>requested format.</w:t>
-      </w:r>
-    </w:p>
-    <w:p>
-      <w:pPr>
-        <w:rPr>
-          <w:color w:val="156082" w:themeColor="accent1"/>
-          <w:lang w:val="en-US"/>
-        </w:rPr>
-      </w:pPr>
-      <w:r>
-        <w:rPr>
-          <w:color w:val="156082" w:themeColor="accent1"/>
-          <w:lang w:val="en-US"/>
-        </w:rPr>
-        <w:t>(Repeat for each example. There is no word limit for this declaration.</w:t>
-      </w:r>
-      <w:r>
-        <w:rPr>
-          <w:color w:val="156082" w:themeColor="accent1"/>
-          <w:lang w:val="en-US"/>
-        </w:rPr>
-        <w:t xml:space="preserve"> Please also include the separator line</w:t>
-      </w:r>
-      <w:r>
-        <w:rPr>
-          <w:color w:val="156082" w:themeColor="accent1"/>
-          <w:lang w:val="en-US"/>
-        </w:rPr>
-        <w:t>)</w:t>
-      </w:r>
-    </w:p>
-    <w:p>
-      <w:pPr>
-        <w:rPr>
-          <w:color w:val="156082" w:themeColor="accent1"/>
-          <w:lang w:val="en-US"/>
-        </w:rPr>
-      </w:pPr>
-      <w:r>
-        <w:rPr>
-          <w:color w:val="156082" w:themeColor="accent1"/>
-          <w:lang w:val="en-US"/>
-        </w:rPr>
-        <w:t>{</w:t>
-      </w:r>
-    </w:p>
-    <w:p>
-      <w:pPr>
-        <w:pStyle w:val="ListParagraph"/>
-        <w:numPr>
-          <w:ilvl w:val="0"/>
-          <w:numId w:val="6"/>
-        </w:numPr>
-        <w:spacing w:after="160" w:line="278" w:lineRule="auto"/>
-        <w:rPr>
-          <w:lang w:val="en-US"/>
-        </w:rPr>
-      </w:pPr>
-      <w:r>
-        <w:rPr>
-          <w:b/>
-          <w:bCs/>
-          <w:lang w:val="en-US"/>
-        </w:rPr>
-        <w:t>Paste the prompt</w:t>
-      </w:r>
-      <w:r>
-        <w:rPr>
-          <w:lang w:val="en-US"/>
-        </w:rPr>
-        <w:t xml:space="preserve"> you gave to the AI (e.g. "Improve the grammar and spelling in the attached document without changing any of the meaning").</w:t>
-      </w:r>
-    </w:p>
-    <w:p>
-      <w:pPr>
-        <w:pStyle w:val="ListParagraph"/>
-        <w:numPr>
-          <w:ilvl w:val="0"/>
-          <w:numId w:val="6"/>
-        </w:numPr>
-        <w:spacing w:after="160" w:line="278" w:lineRule="auto"/>
-        <w:rPr>
-          <w:lang w:val="en-US"/>
-        </w:rPr>
-      </w:pPr>
-      <w:r>
-        <w:rPr>
-          <w:b/>
-          <w:bCs/>
-          <w:lang w:val="en-US"/>
-        </w:rPr>
-        <w:t xml:space="preserve">Paste any input </w:t>
-      </w:r>
-      <w:r>
-        <w:rPr>
-          <w:lang w:val="en-US"/>
-        </w:rPr>
-        <w:t>or upload that accompanied the prompt (e.g. the document, text, or context you provided).</w:t>
-      </w:r>
-    </w:p>
-    <w:p>
-      <w:pPr>
-        <w:pStyle w:val="ListParagraph"/>
-        <w:numPr>
-          <w:ilvl w:val="0"/>
-          <w:numId w:val="6"/>
-        </w:numPr>
-        <w:spacing w:after="160" w:line="278" w:lineRule="auto"/>
-        <w:rPr>
-          <w:lang w:val="en-US"/>
-        </w:rPr>
-      </w:pPr>
-      <w:r>
-        <w:rPr>
-          <w:b/>
-          <w:bCs/>
-          <w:lang w:val="en-US"/>
-        </w:rPr>
-        <w:t>Paste the output</w:t>
-      </w:r>
-      <w:r>
-        <w:rPr>
-          <w:lang w:val="en-US"/>
-        </w:rPr>
-        <w:t xml:space="preserve"> generated by the AI.</w:t>
-      </w:r>
-    </w:p>
-    <w:p>
-      <w:pPr>
-        <w:rPr>
-          <w:b/>
-          <w:bCs/>
-          <w:lang w:val="en-US"/>
-        </w:rPr>
-      </w:pPr>
-    </w:p>
-    <w:p>
-      <w:pPr>
-        <w:rPr>
-          <w:lang w:val="en-US"/>
-        </w:rPr>
-      </w:pPr>
-      <w:r>
-        <w:rPr>
-          <w:lang w:val="en-US"/>
-        </w:rPr>
-        <w:t>========================= NEXT SAMPLE OF AI USE ====================</w:t>
-      </w:r>
-    </w:p>
-    <w:p>
-      <w:pPr>
-        <w:rPr>
-          <w:lang w:val="en-US"/>
-        </w:rPr>
-      </w:pPr>
-      <w:r>
-        <w:rPr>
-          <w:color w:val="156082" w:themeColor="accent1"/>
-          <w:lang w:val="en-US"/>
-        </w:rPr>
-        <w:t>}</w:t>
-      </w:r>
-    </w:p>
-    <w:p/>
-    <w:p/>
     <w:p>
       <w:pPr>
         <w:pBdr>
@@ -2321,82 +1771,17 @@
         </w:pBdr>
       </w:pPr>
     </w:p>
-    <w:p>
-      <w:pPr>
-        <w:pBdr>
-          <w:bottom w:val="single" w:sz="6" w:space="1" w:color="auto"/>
-        </w:pBdr>
-      </w:pPr>
-    </w:p>
-    <w:p>
-      <w:pPr>
-        <w:pBdr>
-          <w:bottom w:val="single" w:sz="6" w:space="1" w:color="auto"/>
-        </w:pBdr>
-      </w:pPr>
-    </w:p>
-    <w:p>
-      <w:pPr>
-        <w:pBdr>
-          <w:bottom w:val="single" w:sz="6" w:space="1" w:color="auto"/>
-        </w:pBdr>
-      </w:pPr>
-    </w:p>
-    <w:p>
-      <w:pPr>
-        <w:pBdr>
-          <w:bottom w:val="single" w:sz="6" w:space="1" w:color="auto"/>
-        </w:pBdr>
-      </w:pPr>
-    </w:p>
-    <w:p>
-      <w:pPr>
-        <w:pBdr>
-          <w:bottom w:val="single" w:sz="6" w:space="1" w:color="auto"/>
-        </w:pBdr>
-      </w:pPr>
-    </w:p>
-    <w:p>
-      <w:pPr>
-        <w:pBdr>
-          <w:bottom w:val="single" w:sz="6" w:space="1" w:color="auto"/>
-        </w:pBdr>
-      </w:pPr>
-    </w:p>
-    <w:p>
-      <w:pPr>
-        <w:pBdr>
-          <w:bottom w:val="single" w:sz="6" w:space="1" w:color="auto"/>
-        </w:pBdr>
-      </w:pPr>
-    </w:p>
-    <w:p>
-      <w:pPr>
-        <w:pBdr>
-          <w:bottom w:val="single" w:sz="6" w:space="1" w:color="auto"/>
-        </w:pBdr>
-      </w:pPr>
-    </w:p>
     <w:p/>
     <w:p>
-      <w:pPr>
-        <w:rPr>
-          <w:color w:val="0070C0"/>
-        </w:rPr>
-      </w:pPr>
       <w:r>
         <w:rPr>
           <w:b/>
           <w:bCs/>
-          <w:color w:val="0070C0"/>
           <w:u w:val="single"/>
         </w:rPr>
         <w:t>Document version history</w:t>
       </w:r>
       <w:r>
-        <w:rPr>
-          <w:color w:val="0070C0"/>
-        </w:rPr>
         <w:t>:</w:t>
       </w:r>
     </w:p>
@@ -2421,14 +1806,12 @@
               <w:rPr>
                 <w:b/>
                 <w:bCs/>
-                <w:color w:val="0070C0"/>
               </w:rPr>
             </w:pPr>
             <w:r>
               <w:rPr>
                 <w:b/>
                 <w:bCs/>
-                <w:color w:val="0070C0"/>
               </w:rPr>
               <w:t>Date</w:t>
             </w:r>
@@ -2443,14 +1826,12 @@
               <w:rPr>
                 <w:b/>
                 <w:bCs/>
-                <w:color w:val="0070C0"/>
               </w:rPr>
             </w:pPr>
             <w:r>
               <w:rPr>
                 <w:b/>
                 <w:bCs/>
-                <w:color w:val="0070C0"/>
               </w:rPr>
               <w:t>Version</w:t>
             </w:r>
@@ -2465,14 +1846,12 @@
               <w:rPr>
                 <w:b/>
                 <w:bCs/>
-                <w:color w:val="0070C0"/>
               </w:rPr>
             </w:pPr>
             <w:r>
               <w:rPr>
                 <w:b/>
                 <w:bCs/>
-                <w:color w:val="0070C0"/>
               </w:rPr>
               <w:t>Changes made</w:t>
             </w:r>
@@ -2485,15 +1864,7 @@
             <w:tcW w:w="1149" w:type="dxa"/>
           </w:tcPr>
           <w:p>
-            <w:pPr>
-              <w:rPr>
-                <w:color w:val="0070C0"/>
-              </w:rPr>
-            </w:pPr>
-            <w:r>
-              <w:rPr>
-                <w:color w:val="0070C0"/>
-              </w:rPr>
+            <w:r>
               <w:t>31/05/26</w:t>
             </w:r>
           </w:p>
@@ -2503,15 +1874,7 @@
             <w:tcW w:w="1051" w:type="dxa"/>
           </w:tcPr>
           <w:p>
-            <w:pPr>
-              <w:rPr>
-                <w:color w:val="0070C0"/>
-              </w:rPr>
-            </w:pPr>
-            <w:r>
-              <w:rPr>
-                <w:color w:val="0070C0"/>
-              </w:rPr>
+            <w:r>
               <w:t>V1</w:t>
             </w:r>
           </w:p>
@@ -2521,21 +1884,10 @@
             <w:tcW w:w="6816" w:type="dxa"/>
           </w:tcPr>
           <w:p>
-            <w:pPr>
-              <w:rPr>
-                <w:color w:val="0070C0"/>
-              </w:rPr>
-            </w:pPr>
-            <w:r>
-              <w:rPr>
-                <w:color w:val="0070C0"/>
-              </w:rPr>
+            <w:r>
               <w:t>First version</w:t>
             </w:r>
             <w:r>
-              <w:rPr>
-                <w:color w:val="0070C0"/>
-              </w:rPr>
               <w:t xml:space="preserve"> – Added Magnus’ details</w:t>
             </w:r>
           </w:p>
@@ -2547,15 +1899,7 @@
             <w:tcW w:w="1149" w:type="dxa"/>
           </w:tcPr>
           <w:p>
-            <w:pPr>
-              <w:rPr>
-                <w:color w:val="0070C0"/>
-              </w:rPr>
-            </w:pPr>
-            <w:r>
-              <w:rPr>
-                <w:color w:val="0070C0"/>
-              </w:rPr>
+            <w:r>
               <w:t>03/06/26</w:t>
             </w:r>
           </w:p>
@@ -2565,15 +1909,7 @@
             <w:tcW w:w="1051" w:type="dxa"/>
           </w:tcPr>
           <w:p>
-            <w:pPr>
-              <w:rPr>
-                <w:color w:val="0070C0"/>
-              </w:rPr>
-            </w:pPr>
-            <w:r>
-              <w:rPr>
-                <w:color w:val="0070C0"/>
-              </w:rPr>
+            <w:r>
               <w:t>V2</w:t>
             </w:r>
           </w:p>
@@ -2583,15 +1919,7 @@
             <w:tcW w:w="6816" w:type="dxa"/>
           </w:tcPr>
           <w:p>
-            <w:pPr>
-              <w:rPr>
-                <w:color w:val="0070C0"/>
-              </w:rPr>
-            </w:pPr>
-            <w:r>
-              <w:rPr>
-                <w:color w:val="0070C0"/>
-              </w:rPr>
+            <w:r>
               <w:t>Added Ryan’s details</w:t>
             </w:r>
           </w:p>
@@ -2603,15 +1931,7 @@
             <w:tcW w:w="1149" w:type="dxa"/>
           </w:tcPr>
           <w:p>
-            <w:pPr>
-              <w:rPr>
-                <w:color w:val="0070C0"/>
-              </w:rPr>
-            </w:pPr>
-            <w:r>
-              <w:rPr>
-                <w:color w:val="0070C0"/>
-              </w:rPr>
+            <w:r>
               <w:t>04/06/26</w:t>
             </w:r>
           </w:p>
@@ -2621,15 +1941,7 @@
             <w:tcW w:w="1051" w:type="dxa"/>
           </w:tcPr>
           <w:p>
-            <w:pPr>
-              <w:rPr>
-                <w:color w:val="0070C0"/>
-              </w:rPr>
-            </w:pPr>
-            <w:r>
-              <w:rPr>
-                <w:color w:val="0070C0"/>
-              </w:rPr>
+            <w:r>
               <w:t>V3</w:t>
             </w:r>
           </w:p>
@@ -2639,27 +1951,13 @@
             <w:tcW w:w="6816" w:type="dxa"/>
           </w:tcPr>
           <w:p>
-            <w:pPr>
-              <w:rPr>
-                <w:color w:val="0070C0"/>
-              </w:rPr>
-            </w:pPr>
-            <w:r>
-              <w:rPr>
-                <w:color w:val="0070C0"/>
-              </w:rPr>
+            <w:r>
               <w:t>Added Liam</w:t>
             </w:r>
             <w:r>
-              <w:rPr>
-                <w:color w:val="0070C0"/>
-              </w:rPr>
               <w:t>’</w:t>
             </w:r>
             <w:r>
-              <w:rPr>
-                <w:color w:val="0070C0"/>
-              </w:rPr>
               <w:t>s Details</w:t>
             </w:r>
           </w:p>
@@ -4023,6 +3321,7 @@
   <w:style w:type="character" w:default="1" w:styleId="DefaultParagraphFont">
     <w:name w:val="Default Paragraph Font"/>
     <w:uiPriority w:val="1"/>
+    <w:semiHidden/>
     <w:unhideWhenUsed/>
   </w:style>
   <w:style w:type="table" w:default="1" w:styleId="TableNormal">

</xml_diff>